<commit_message>
docs: amélioration de la documentation (FAQ RGPD, accessibilité, clarification des tests)
</commit_message>
<xml_diff>
--- a/docs/Template+–+Justification+des+choix+technique.docx
+++ b/docs/Template+–+Justification+des+choix+technique.docx
@@ -142,7 +142,7 @@
                     <pic:cNvPicPr preferRelativeResize="0"/>
                   </pic:nvPicPr>
                   <pic:blipFill>
-                    <a:blip r:embed="rId5"/>
+                    <a:blip r:embed="rId6"/>
                     <a:srcRect/>
                     <a:stretch>
                       <a:fillRect/>
@@ -1014,37 +1014,6 @@
           <w:szCs w:val="26"/>
         </w:rPr>
         <w:t>Périmètre fonctionnel</w:t>
-      </w:r>
-    </w:p>
-    <w:p>
-      <w:pPr>
-        <w:spacing w:before="240" w:after="240"/>
-      </w:pPr>
-      <w:r>
-        <w:rPr>
-          <w:i/>
-          <w:iCs/>
-          <w:color w:val="666666"/>
-        </w:rPr>
-        <w:t xml:space="preserve">Présentez les </w:t>
-      </w:r>
-      <w:r>
-        <w:rPr>
-          <w:b/>
-          <w:bCs/>
-          <w:i/>
-          <w:iCs/>
-          <w:color w:val="666666"/>
-        </w:rPr>
-        <w:t>fonctionnalités livrées</w:t>
-      </w:r>
-      <w:r>
-        <w:rPr>
-          <w:i/>
-          <w:iCs/>
-          <w:color w:val="666666"/>
-        </w:rPr>
-        <w:t xml:space="preserve"> (liste synthétique), en précisant leur état (terminée / en cours / à venir).</w:t>
       </w:r>
     </w:p>
     <w:tbl>
@@ -1412,25 +1381,7 @@
                 <w:iCs/>
                 <w:color w:val="666666"/>
               </w:rPr>
-              <w:t xml:space="preserve">Consultation et modification </w:t>
-            </w:r>
-            <w:proofErr w:type="gramStart"/>
-            <w:r>
-              <w:rPr>
-                <w:i/>
-                <w:iCs/>
-                <w:color w:val="666666"/>
-              </w:rPr>
-              <w:t>email</w:t>
-            </w:r>
-            <w:proofErr w:type="gramEnd"/>
-            <w:r>
-              <w:rPr>
-                <w:i/>
-                <w:iCs/>
-                <w:color w:val="666666"/>
-              </w:rPr>
-              <w:t xml:space="preserve"> / </w:t>
+              <w:t xml:space="preserve">Consultation et modification email / </w:t>
             </w:r>
             <w:proofErr w:type="spellStart"/>
             <w:r>
@@ -1699,7 +1650,6 @@
                 <w:iCs/>
                 <w:color w:val="666666"/>
               </w:rPr>
-              <w:lastRenderedPageBreak/>
               <w:t>Publication d’article</w:t>
             </w:r>
           </w:p>
@@ -1795,6 +1745,7 @@
                 <w:iCs/>
                 <w:color w:val="666666"/>
               </w:rPr>
+              <w:lastRenderedPageBreak/>
               <w:t>Commentaires</w:t>
             </w:r>
           </w:p>
@@ -2135,7 +2086,7 @@
                     <pic:cNvPicPr/>
                   </pic:nvPicPr>
                   <pic:blipFill>
-                    <a:blip r:embed="rId6"/>
+                    <a:blip r:embed="rId7"/>
                     <a:stretch>
                       <a:fillRect/>
                     </a:stretch>
@@ -2499,17 +2450,15 @@
           <w:lang w:val="fr-FR"/>
         </w:rPr>
       </w:pPr>
-      <w:proofErr w:type="gramStart"/>
-      <w:r>
-        <w:rPr>
-          <w:i/>
-          <w:iCs/>
-          <w:color w:val="666666"/>
-          <w:lang w:val="fr-FR"/>
-        </w:rPr>
-        <w:t>module</w:t>
-      </w:r>
-      <w:proofErr w:type="gramEnd"/>
+      <w:r>
+        <w:rPr>
+          <w:i/>
+          <w:iCs/>
+          <w:color w:val="666666"/>
+          <w:lang w:val="fr-FR"/>
+        </w:rPr>
+        <w:t>Module</w:t>
+      </w:r>
       <w:r>
         <w:rPr>
           <w:i/>
@@ -2533,17 +2482,15 @@
           <w:lang w:val="fr-FR"/>
         </w:rPr>
       </w:pPr>
-      <w:proofErr w:type="gramStart"/>
-      <w:r>
-        <w:rPr>
-          <w:i/>
-          <w:iCs/>
-          <w:color w:val="666666"/>
-          <w:lang w:val="fr-FR"/>
-        </w:rPr>
-        <w:t>module</w:t>
-      </w:r>
-      <w:proofErr w:type="gramEnd"/>
+      <w:r>
+        <w:rPr>
+          <w:i/>
+          <w:iCs/>
+          <w:color w:val="666666"/>
+          <w:lang w:val="fr-FR"/>
+        </w:rPr>
+        <w:t>Module</w:t>
+      </w:r>
       <w:r>
         <w:rPr>
           <w:i/>
@@ -2567,17 +2514,15 @@
           <w:lang w:val="fr-FR"/>
         </w:rPr>
       </w:pPr>
-      <w:proofErr w:type="gramStart"/>
-      <w:r>
-        <w:rPr>
-          <w:i/>
-          <w:iCs/>
-          <w:color w:val="666666"/>
-          <w:lang w:val="fr-FR"/>
-        </w:rPr>
-        <w:t>module</w:t>
-      </w:r>
-      <w:proofErr w:type="gramEnd"/>
+      <w:r>
+        <w:rPr>
+          <w:i/>
+          <w:iCs/>
+          <w:color w:val="666666"/>
+          <w:lang w:val="fr-FR"/>
+        </w:rPr>
+        <w:t>Module</w:t>
+      </w:r>
       <w:r>
         <w:rPr>
           <w:i/>
@@ -2601,17 +2546,15 @@
           <w:lang w:val="fr-FR"/>
         </w:rPr>
       </w:pPr>
-      <w:proofErr w:type="gramStart"/>
-      <w:r>
-        <w:rPr>
-          <w:i/>
-          <w:iCs/>
-          <w:color w:val="666666"/>
-          <w:lang w:val="fr-FR"/>
-        </w:rPr>
-        <w:t>module</w:t>
-      </w:r>
-      <w:proofErr w:type="gramEnd"/>
+      <w:r>
+        <w:rPr>
+          <w:i/>
+          <w:iCs/>
+          <w:color w:val="666666"/>
+          <w:lang w:val="fr-FR"/>
+        </w:rPr>
+        <w:t>Module</w:t>
+      </w:r>
       <w:r>
         <w:rPr>
           <w:i/>
@@ -2784,18 +2727,15 @@
           <w:lang w:val="fr-FR"/>
         </w:rPr>
       </w:pPr>
-      <w:proofErr w:type="gramStart"/>
-      <w:r>
-        <w:rPr>
-          <w:i/>
-          <w:iCs/>
-          <w:color w:val="666666"/>
-          <w:lang w:val="fr-FR"/>
-        </w:rPr>
-        <w:lastRenderedPageBreak/>
-        <w:t>composants</w:t>
-      </w:r>
-      <w:proofErr w:type="gramEnd"/>
+      <w:r>
+        <w:rPr>
+          <w:i/>
+          <w:iCs/>
+          <w:color w:val="666666"/>
+          <w:lang w:val="fr-FR"/>
+        </w:rPr>
+        <w:t>Composants</w:t>
+      </w:r>
       <w:r>
         <w:rPr>
           <w:i/>
@@ -2819,17 +2759,15 @@
           <w:lang w:val="fr-FR"/>
         </w:rPr>
       </w:pPr>
-      <w:proofErr w:type="gramStart"/>
-      <w:r>
-        <w:rPr>
-          <w:i/>
-          <w:iCs/>
-          <w:color w:val="666666"/>
-          <w:lang w:val="fr-FR"/>
-        </w:rPr>
-        <w:t>logique</w:t>
-      </w:r>
-      <w:proofErr w:type="gramEnd"/>
+      <w:r>
+        <w:rPr>
+          <w:i/>
+          <w:iCs/>
+          <w:color w:val="666666"/>
+          <w:lang w:val="fr-FR"/>
+        </w:rPr>
+        <w:t>Logique</w:t>
+      </w:r>
       <w:r>
         <w:rPr>
           <w:i/>
@@ -2853,17 +2791,15 @@
           <w:lang w:val="fr-FR"/>
         </w:rPr>
       </w:pPr>
-      <w:proofErr w:type="gramStart"/>
-      <w:r>
-        <w:rPr>
-          <w:i/>
-          <w:iCs/>
-          <w:color w:val="666666"/>
-          <w:lang w:val="fr-FR"/>
-        </w:rPr>
-        <w:t>nommage</w:t>
-      </w:r>
-      <w:proofErr w:type="gramEnd"/>
+      <w:r>
+        <w:rPr>
+          <w:i/>
+          <w:iCs/>
+          <w:color w:val="666666"/>
+          <w:lang w:val="fr-FR"/>
+        </w:rPr>
+        <w:t>Nommage</w:t>
+      </w:r>
       <w:r>
         <w:rPr>
           <w:i/>
@@ -2890,6 +2826,7 @@
           <w:color w:val="666666"/>
           <w:lang w:val="fr-FR"/>
         </w:rPr>
+        <w:lastRenderedPageBreak/>
         <w:t xml:space="preserve">Organisation du </w:t>
       </w:r>
       <w:proofErr w:type="spellStart"/>
@@ -3134,7 +3071,6 @@
         <w:t xml:space="preserve"> ou </w:t>
       </w:r>
       <w:proofErr w:type="spellStart"/>
-      <w:proofErr w:type="gramStart"/>
       <w:r>
         <w:rPr>
           <w:i/>
@@ -3145,7 +3081,6 @@
         <w:t>application.properties</w:t>
       </w:r>
       <w:proofErr w:type="spellEnd"/>
-      <w:proofErr w:type="gramEnd"/>
       <w:r>
         <w:rPr>
           <w:i/>
@@ -3662,28 +3597,6 @@
           <w:szCs w:val="26"/>
         </w:rPr>
         <w:t>2.2 Choix techniques</w:t>
-      </w:r>
-    </w:p>
-    <w:p>
-      <w:pPr>
-        <w:spacing w:before="240" w:after="240"/>
-      </w:pPr>
-      <w:r>
-        <w:t xml:space="preserve">Présentez ici </w:t>
-      </w:r>
-      <w:r>
-        <w:rPr>
-          <w:b/>
-          <w:bCs/>
-        </w:rPr>
-        <w:t>chaque choix structurant</w:t>
-      </w:r>
-      <w:r>
-        <w:t xml:space="preserve"> du projet.</w:t>
-      </w:r>
-      <w:r>
-        <w:br/>
-        <w:t xml:space="preserve"> Pour chaque élément, complétez le tableau suivant :</w:t>
       </w:r>
     </w:p>
     <w:tbl>
@@ -4045,16 +3958,7 @@
                 <w:iCs/>
                 <w:color w:val="666666"/>
               </w:rPr>
-              <w:t xml:space="preserve">Framework recommandé par ORION, adapté aux applications métiers, respect des bonnes pratiques et </w:t>
-            </w:r>
-            <w:r>
-              <w:rPr>
-                <w:i/>
-                <w:iCs/>
-                <w:color w:val="666666"/>
-              </w:rPr>
-              <w:lastRenderedPageBreak/>
-              <w:t>cohérence avec les maquettes UX</w:t>
+              <w:t>Framework recommandé par ORION, adapté aux applications métiers, respect des bonnes pratiques et cohérence avec les maquettes UX</w:t>
             </w:r>
           </w:p>
           <w:p>
@@ -4068,7 +3972,6 @@
           </w:p>
           <w:p>
             <w:pPr>
-              <w:jc w:val="center"/>
               <w:rPr>
                 <w:b/>
                 <w:bCs/>
@@ -4112,7 +4015,6 @@
                 <w:iCs/>
                 <w:color w:val="666666"/>
               </w:rPr>
-              <w:lastRenderedPageBreak/>
               <w:t>TypeScript</w:t>
             </w:r>
             <w:proofErr w:type="spellEnd"/>
@@ -4188,7 +4090,7 @@
                 <w:color w:val="666666"/>
               </w:rPr>
             </w:pPr>
-            <w:hyperlink r:id="rId7" w:history="1">
+            <w:hyperlink r:id="rId8" w:history="1">
               <w:r>
                 <w:rPr>
                   <w:i/>
@@ -4230,7 +4132,16 @@
                 <w:iCs/>
                 <w:color w:val="666666"/>
               </w:rPr>
-              <w:t>Apporter du typage et réduire les erreurs côté front</w:t>
+              <w:t xml:space="preserve">Apporter du typage et réduire </w:t>
+            </w:r>
+            <w:r>
+              <w:rPr>
+                <w:i/>
+                <w:iCs/>
+                <w:color w:val="666666"/>
+              </w:rPr>
+              <w:lastRenderedPageBreak/>
+              <w:t>les erreurs côté front</w:t>
             </w:r>
           </w:p>
         </w:tc>
@@ -4264,144 +4175,18 @@
                 <w:iCs/>
                 <w:color w:val="666666"/>
               </w:rPr>
-              <w:t>Améliore la robustesse du code et la lisibilité, particulièrement sur un projet structuré</w:t>
-            </w:r>
-          </w:p>
-        </w:tc>
-      </w:tr>
-      <w:tr>
-        <w:trPr>
-          <w:trHeight w:val="659"/>
-        </w:trPr>
-        <w:tc>
-          <w:tcPr>
-            <w:tcW w:w="1517" w:type="dxa"/>
-            <w:tcBorders>
-              <w:top w:val="nil"/>
-              <w:left w:val="nil"/>
-              <w:bottom w:val="nil"/>
-              <w:right w:val="nil"/>
-            </w:tcBorders>
-            <w:tcMar>
-              <w:top w:w="100" w:type="dxa"/>
-              <w:left w:w="100" w:type="dxa"/>
-              <w:bottom w:w="100" w:type="dxa"/>
-              <w:right w:w="100" w:type="dxa"/>
-            </w:tcMar>
-          </w:tcPr>
-          <w:p>
-            <w:pPr>
-              <w:rPr>
-                <w:b/>
-                <w:bCs/>
-              </w:rPr>
-            </w:pPr>
-          </w:p>
-        </w:tc>
-        <w:tc>
-          <w:tcPr>
-            <w:tcW w:w="1338" w:type="dxa"/>
-            <w:tcBorders>
-              <w:top w:val="nil"/>
-              <w:left w:val="nil"/>
-              <w:bottom w:val="nil"/>
-              <w:right w:val="nil"/>
-            </w:tcBorders>
-            <w:tcMar>
-              <w:top w:w="100" w:type="dxa"/>
-              <w:left w:w="100" w:type="dxa"/>
-              <w:bottom w:w="100" w:type="dxa"/>
-              <w:right w:w="100" w:type="dxa"/>
-            </w:tcMar>
-          </w:tcPr>
-          <w:p>
-            <w:pPr>
-              <w:jc w:val="center"/>
-              <w:rPr>
-                <w:b/>
-                <w:bCs/>
-              </w:rPr>
-            </w:pPr>
-          </w:p>
-        </w:tc>
-        <w:tc>
-          <w:tcPr>
-            <w:tcW w:w="2107" w:type="dxa"/>
-            <w:tcBorders>
-              <w:top w:val="nil"/>
-              <w:left w:val="nil"/>
-              <w:bottom w:val="nil"/>
-              <w:right w:val="nil"/>
-            </w:tcBorders>
-            <w:tcMar>
-              <w:top w:w="100" w:type="dxa"/>
-              <w:left w:w="100" w:type="dxa"/>
-              <w:bottom w:w="100" w:type="dxa"/>
-              <w:right w:w="100" w:type="dxa"/>
-            </w:tcMar>
-          </w:tcPr>
-          <w:p>
-            <w:pPr>
-              <w:jc w:val="center"/>
-              <w:rPr>
-                <w:b/>
-                <w:bCs/>
-                <w:sz w:val="20"/>
-                <w:szCs w:val="20"/>
-              </w:rPr>
-            </w:pPr>
-          </w:p>
-        </w:tc>
-        <w:tc>
-          <w:tcPr>
-            <w:tcW w:w="2042" w:type="dxa"/>
-            <w:tcBorders>
-              <w:top w:val="nil"/>
-              <w:left w:val="nil"/>
-              <w:bottom w:val="nil"/>
-              <w:right w:val="nil"/>
-            </w:tcBorders>
-            <w:tcMar>
-              <w:top w:w="100" w:type="dxa"/>
-              <w:left w:w="100" w:type="dxa"/>
-              <w:bottom w:w="100" w:type="dxa"/>
-              <w:right w:w="100" w:type="dxa"/>
-            </w:tcMar>
-          </w:tcPr>
-          <w:p>
-            <w:pPr>
-              <w:jc w:val="center"/>
-              <w:rPr>
-                <w:b/>
-                <w:bCs/>
-              </w:rPr>
-            </w:pPr>
-          </w:p>
-        </w:tc>
-        <w:tc>
-          <w:tcPr>
-            <w:tcW w:w="1948" w:type="dxa"/>
-            <w:tcBorders>
-              <w:top w:val="nil"/>
-              <w:left w:val="nil"/>
-              <w:bottom w:val="nil"/>
-              <w:right w:val="nil"/>
-            </w:tcBorders>
-            <w:tcMar>
-              <w:top w:w="100" w:type="dxa"/>
-              <w:left w:w="100" w:type="dxa"/>
-              <w:bottom w:w="100" w:type="dxa"/>
-              <w:right w:w="100" w:type="dxa"/>
-            </w:tcMar>
-          </w:tcPr>
-          <w:p>
-            <w:pPr>
-              <w:jc w:val="center"/>
-              <w:rPr>
-                <w:b/>
-                <w:bCs/>
-              </w:rPr>
-            </w:pPr>
+              <w:lastRenderedPageBreak/>
+              <w:t xml:space="preserve">Améliore la robustesse du code et la </w:t>
+            </w:r>
+            <w:r>
+              <w:rPr>
+                <w:i/>
+                <w:iCs/>
+                <w:color w:val="666666"/>
+              </w:rPr>
+              <w:lastRenderedPageBreak/>
+              <w:t>lisibilité, particulièrement sur un projet structuré</w:t>
+            </w:r>
           </w:p>
         </w:tc>
       </w:tr>
@@ -4433,141 +4218,6 @@
                 <w:color w:val="666666"/>
               </w:rPr>
             </w:pPr>
-          </w:p>
-        </w:tc>
-        <w:tc>
-          <w:tcPr>
-            <w:tcW w:w="1338" w:type="dxa"/>
-            <w:tcBorders>
-              <w:top w:val="nil"/>
-              <w:left w:val="nil"/>
-              <w:bottom w:val="nil"/>
-              <w:right w:val="nil"/>
-            </w:tcBorders>
-            <w:tcMar>
-              <w:top w:w="100" w:type="dxa"/>
-              <w:left w:w="100" w:type="dxa"/>
-              <w:bottom w:w="100" w:type="dxa"/>
-              <w:right w:w="100" w:type="dxa"/>
-            </w:tcMar>
-          </w:tcPr>
-          <w:p>
-            <w:pPr>
-              <w:rPr>
-                <w:i/>
-                <w:iCs/>
-                <w:color w:val="666666"/>
-              </w:rPr>
-            </w:pPr>
-          </w:p>
-        </w:tc>
-        <w:tc>
-          <w:tcPr>
-            <w:tcW w:w="2107" w:type="dxa"/>
-            <w:tcBorders>
-              <w:top w:val="nil"/>
-              <w:left w:val="nil"/>
-              <w:bottom w:val="nil"/>
-              <w:right w:val="nil"/>
-            </w:tcBorders>
-            <w:tcMar>
-              <w:top w:w="100" w:type="dxa"/>
-              <w:left w:w="100" w:type="dxa"/>
-              <w:bottom w:w="100" w:type="dxa"/>
-              <w:right w:w="100" w:type="dxa"/>
-            </w:tcMar>
-          </w:tcPr>
-          <w:p>
-            <w:pPr>
-              <w:rPr>
-                <w:i/>
-                <w:iCs/>
-                <w:color w:val="666666"/>
-              </w:rPr>
-            </w:pPr>
-          </w:p>
-        </w:tc>
-        <w:tc>
-          <w:tcPr>
-            <w:tcW w:w="2042" w:type="dxa"/>
-            <w:tcBorders>
-              <w:top w:val="nil"/>
-              <w:left w:val="nil"/>
-              <w:bottom w:val="nil"/>
-              <w:right w:val="nil"/>
-            </w:tcBorders>
-            <w:tcMar>
-              <w:top w:w="100" w:type="dxa"/>
-              <w:left w:w="100" w:type="dxa"/>
-              <w:bottom w:w="100" w:type="dxa"/>
-              <w:right w:w="100" w:type="dxa"/>
-            </w:tcMar>
-          </w:tcPr>
-          <w:p>
-            <w:pPr>
-              <w:rPr>
-                <w:i/>
-                <w:iCs/>
-                <w:color w:val="666666"/>
-              </w:rPr>
-            </w:pPr>
-          </w:p>
-        </w:tc>
-        <w:tc>
-          <w:tcPr>
-            <w:tcW w:w="1948" w:type="dxa"/>
-            <w:tcBorders>
-              <w:top w:val="nil"/>
-              <w:left w:val="nil"/>
-              <w:bottom w:val="nil"/>
-              <w:right w:val="nil"/>
-            </w:tcBorders>
-            <w:tcMar>
-              <w:top w:w="100" w:type="dxa"/>
-              <w:left w:w="100" w:type="dxa"/>
-              <w:bottom w:w="100" w:type="dxa"/>
-              <w:right w:w="100" w:type="dxa"/>
-            </w:tcMar>
-          </w:tcPr>
-          <w:p>
-            <w:pPr>
-              <w:rPr>
-                <w:i/>
-                <w:iCs/>
-                <w:color w:val="666666"/>
-              </w:rPr>
-            </w:pPr>
-          </w:p>
-        </w:tc>
-      </w:tr>
-      <w:tr>
-        <w:trPr>
-          <w:trHeight w:val="825"/>
-        </w:trPr>
-        <w:tc>
-          <w:tcPr>
-            <w:tcW w:w="1517" w:type="dxa"/>
-            <w:tcBorders>
-              <w:top w:val="nil"/>
-              <w:left w:val="nil"/>
-              <w:bottom w:val="nil"/>
-              <w:right w:val="nil"/>
-            </w:tcBorders>
-            <w:tcMar>
-              <w:top w:w="100" w:type="dxa"/>
-              <w:left w:w="100" w:type="dxa"/>
-              <w:bottom w:w="100" w:type="dxa"/>
-              <w:right w:w="100" w:type="dxa"/>
-            </w:tcMar>
-          </w:tcPr>
-          <w:p>
-            <w:pPr>
-              <w:rPr>
-                <w:i/>
-                <w:iCs/>
-                <w:color w:val="666666"/>
-              </w:rPr>
-            </w:pPr>
             <w:proofErr w:type="spellStart"/>
             <w:r>
               <w:rPr>
@@ -4575,6 +4225,7 @@
                 <w:iCs/>
                 <w:color w:val="666666"/>
               </w:rPr>
+              <w:lastRenderedPageBreak/>
               <w:t>Angular</w:t>
             </w:r>
             <w:proofErr w:type="spellEnd"/>
@@ -4721,7 +4372,7 @@
                       <w:lang w:val="fr-FR"/>
                     </w:rPr>
                   </w:pPr>
-                  <w:hyperlink r:id="rId8" w:tgtFrame="_new" w:history="1">
+                  <w:hyperlink r:id="rId9" w:tgtFrame="_new" w:history="1">
                     <w:r>
                       <w:rPr>
                         <w:rStyle w:val="Lienhypertexte"/>
@@ -4967,7 +4618,7 @@
                 <w:lang w:val="fr-FR"/>
               </w:rPr>
             </w:pPr>
-            <w:hyperlink r:id="rId9" w:history="1">
+            <w:hyperlink r:id="rId10" w:history="1">
               <w:r>
                 <w:rPr>
                   <w:rStyle w:val="Lienhypertexte"/>
@@ -5164,7 +4815,7 @@
                 <w:color w:val="666666"/>
               </w:rPr>
             </w:pPr>
-            <w:hyperlink r:id="rId10" w:history="1">
+            <w:hyperlink r:id="rId11" w:history="1">
               <w:r>
                 <w:rPr>
                   <w:i/>
@@ -5341,7 +4992,7 @@
                 <w:color w:val="666666"/>
               </w:rPr>
             </w:pPr>
-            <w:hyperlink r:id="rId11" w:history="1">
+            <w:hyperlink r:id="rId12" w:history="1">
               <w:r>
                 <w:rPr>
                   <w:i/>
@@ -5563,7 +5214,7 @@
                 <w:color w:val="666666"/>
               </w:rPr>
             </w:pPr>
-            <w:hyperlink r:id="rId12" w:history="1">
+            <w:hyperlink r:id="rId13" w:history="1">
               <w:r>
                 <w:rPr>
                   <w:i/>
@@ -5605,16 +5256,7 @@
                 <w:iCs/>
                 <w:color w:val="666666"/>
               </w:rPr>
-              <w:t xml:space="preserve">Simplifier les interactions avec </w:t>
-            </w:r>
-            <w:r>
-              <w:rPr>
-                <w:i/>
-                <w:iCs/>
-                <w:color w:val="666666"/>
-              </w:rPr>
-              <w:lastRenderedPageBreak/>
-              <w:t>la base de données</w:t>
+              <w:t>Simplifier les interactions avec la base de données</w:t>
             </w:r>
           </w:p>
         </w:tc>
@@ -5648,7 +5290,6 @@
                 <w:iCs/>
                 <w:color w:val="666666"/>
               </w:rPr>
-              <w:lastRenderedPageBreak/>
               <w:t xml:space="preserve">Réduction du code </w:t>
             </w:r>
             <w:proofErr w:type="spellStart"/>
@@ -5667,16 +5308,7 @@
                 <w:iCs/>
                 <w:color w:val="666666"/>
               </w:rPr>
-              <w:t xml:space="preserve"> et intégration </w:t>
-            </w:r>
-            <w:r>
-              <w:rPr>
-                <w:i/>
-                <w:iCs/>
-                <w:color w:val="666666"/>
-              </w:rPr>
-              <w:lastRenderedPageBreak/>
-              <w:t>native avec Spring Boot</w:t>
+              <w:t xml:space="preserve"> et intégration native avec Spring Boot</w:t>
             </w:r>
           </w:p>
         </w:tc>
@@ -5715,7 +5347,6 @@
                 <w:iCs/>
                 <w:color w:val="666666"/>
               </w:rPr>
-              <w:lastRenderedPageBreak/>
               <w:t>MySQL</w:t>
             </w:r>
           </w:p>
@@ -5867,7 +5498,7 @@
                       <w:color w:val="666666"/>
                     </w:rPr>
                   </w:pPr>
-                  <w:hyperlink r:id="rId13" w:tgtFrame="_new" w:history="1">
+                  <w:hyperlink r:id="rId14" w:tgtFrame="_new" w:history="1">
                     <w:r>
                       <w:rPr>
                         <w:i/>
@@ -6056,7 +5687,7 @@
                 <w:color w:val="666666"/>
               </w:rPr>
             </w:pPr>
-            <w:hyperlink r:id="rId14" w:history="1">
+            <w:hyperlink r:id="rId15" w:history="1">
               <w:r>
                 <w:rPr>
                   <w:i/>
@@ -6137,104 +5768,7 @@
           </w:p>
         </w:tc>
       </w:tr>
-      <w:tr>
-        <w:trPr>
-          <w:trHeight w:val="825"/>
-        </w:trPr>
-        <w:tc>
-          <w:tcPr>
-            <w:tcW w:w="1517" w:type="dxa"/>
-            <w:tcBorders>
-              <w:top w:val="nil"/>
-              <w:left w:val="nil"/>
-              <w:bottom w:val="nil"/>
-              <w:right w:val="nil"/>
-            </w:tcBorders>
-            <w:tcMar>
-              <w:top w:w="100" w:type="dxa"/>
-              <w:left w:w="100" w:type="dxa"/>
-              <w:bottom w:w="100" w:type="dxa"/>
-              <w:right w:w="100" w:type="dxa"/>
-            </w:tcMar>
-          </w:tcPr>
-          <w:p/>
-        </w:tc>
-        <w:tc>
-          <w:tcPr>
-            <w:tcW w:w="1338" w:type="dxa"/>
-            <w:tcBorders>
-              <w:top w:val="nil"/>
-              <w:left w:val="nil"/>
-              <w:bottom w:val="nil"/>
-              <w:right w:val="nil"/>
-            </w:tcBorders>
-            <w:tcMar>
-              <w:top w:w="100" w:type="dxa"/>
-              <w:left w:w="100" w:type="dxa"/>
-              <w:bottom w:w="100" w:type="dxa"/>
-              <w:right w:w="100" w:type="dxa"/>
-            </w:tcMar>
-          </w:tcPr>
-          <w:p/>
-        </w:tc>
-        <w:tc>
-          <w:tcPr>
-            <w:tcW w:w="2107" w:type="dxa"/>
-            <w:tcBorders>
-              <w:top w:val="nil"/>
-              <w:left w:val="nil"/>
-              <w:bottom w:val="nil"/>
-              <w:right w:val="nil"/>
-            </w:tcBorders>
-            <w:tcMar>
-              <w:top w:w="100" w:type="dxa"/>
-              <w:left w:w="100" w:type="dxa"/>
-              <w:bottom w:w="100" w:type="dxa"/>
-              <w:right w:w="100" w:type="dxa"/>
-            </w:tcMar>
-          </w:tcPr>
-          <w:p/>
-        </w:tc>
-        <w:tc>
-          <w:tcPr>
-            <w:tcW w:w="2042" w:type="dxa"/>
-            <w:tcBorders>
-              <w:top w:val="nil"/>
-              <w:left w:val="nil"/>
-              <w:bottom w:val="nil"/>
-              <w:right w:val="nil"/>
-            </w:tcBorders>
-            <w:tcMar>
-              <w:top w:w="100" w:type="dxa"/>
-              <w:left w:w="100" w:type="dxa"/>
-              <w:bottom w:w="100" w:type="dxa"/>
-              <w:right w:w="100" w:type="dxa"/>
-            </w:tcMar>
-          </w:tcPr>
-          <w:p/>
-        </w:tc>
-        <w:tc>
-          <w:tcPr>
-            <w:tcW w:w="1948" w:type="dxa"/>
-            <w:tcBorders>
-              <w:top w:val="nil"/>
-              <w:left w:val="nil"/>
-              <w:bottom w:val="nil"/>
-              <w:right w:val="nil"/>
-            </w:tcBorders>
-            <w:tcMar>
-              <w:top w:w="100" w:type="dxa"/>
-              <w:left w:w="100" w:type="dxa"/>
-              <w:bottom w:w="100" w:type="dxa"/>
-              <w:right w:w="100" w:type="dxa"/>
-            </w:tcMar>
-          </w:tcPr>
-          <w:p/>
-        </w:tc>
-      </w:tr>
     </w:tbl>
-    <w:p/>
-    <w:p/>
     <w:p>
       <w:pPr>
         <w:pStyle w:val="Titre3"/>
@@ -6259,6 +5793,7 @@
           <w:sz w:val="26"/>
           <w:szCs w:val="26"/>
         </w:rPr>
+        <w:lastRenderedPageBreak/>
         <w:t>2.3 API et schémas de données</w:t>
       </w:r>
     </w:p>
@@ -7716,7 +7251,6 @@
                 <w:iCs/>
                 <w:color w:val="666666"/>
               </w:rPr>
-              <w:lastRenderedPageBreak/>
               <w:t>/api/</w:t>
             </w:r>
             <w:proofErr w:type="spellStart"/>
@@ -8459,6 +7993,7 @@
         <w:rPr>
           <w:noProof/>
         </w:rPr>
+        <w:lastRenderedPageBreak/>
         <w:drawing>
           <wp:inline distT="0" distB="0" distL="0" distR="0" wp14:anchorId="49B5F0D0" wp14:editId="4DC63D53">
             <wp:extent cx="5727700" cy="5727700"/>
@@ -8477,7 +8012,7 @@
                     </pic:cNvPicPr>
                   </pic:nvPicPr>
                   <pic:blipFill>
-                    <a:blip r:embed="rId15">
+                    <a:blip r:embed="rId16">
                       <a:extLst>
                         <a:ext uri="{28A0092B-C50C-407E-A947-70E740481C1C}">
                           <a14:useLocalDpi xmlns:a14="http://schemas.microsoft.com/office/drawing/2010/main" val="0"/>
@@ -8558,231 +8093,231 @@
           <w:sz w:val="26"/>
           <w:szCs w:val="26"/>
         </w:rPr>
+        <w:t>3.1 Stratégie de test</w:t>
+      </w:r>
+    </w:p>
+    <w:p>
+      <w:pPr>
+        <w:rPr>
+          <w:i/>
+          <w:iCs/>
+          <w:color w:val="666666"/>
+        </w:rPr>
+      </w:pPr>
+      <w:r>
+        <w:rPr>
+          <w:i/>
+          <w:iCs/>
+          <w:color w:val="666666"/>
+        </w:rPr>
+        <w:t>Tests unitaires :</w:t>
+      </w:r>
+    </w:p>
+    <w:p>
+      <w:pPr>
+        <w:rPr>
+          <w:i/>
+          <w:iCs/>
+          <w:color w:val="666666"/>
+        </w:rPr>
+      </w:pPr>
+      <w:r>
+        <w:rPr>
+          <w:i/>
+          <w:iCs/>
+          <w:color w:val="666666"/>
+        </w:rPr>
+        <w:t>- JUnit 5</w:t>
+      </w:r>
+    </w:p>
+    <w:p>
+      <w:pPr>
+        <w:rPr>
+          <w:i/>
+          <w:iCs/>
+          <w:color w:val="666666"/>
+        </w:rPr>
+      </w:pPr>
+      <w:r>
+        <w:rPr>
+          <w:i/>
+          <w:iCs/>
+          <w:color w:val="666666"/>
+        </w:rPr>
+        <w:t>- Tests des services métier (création utilisateur, abonnements, création post).</w:t>
+      </w:r>
+    </w:p>
+    <w:p>
+      <w:pPr>
+        <w:rPr>
+          <w:i/>
+          <w:iCs/>
+          <w:color w:val="666666"/>
+        </w:rPr>
+      </w:pPr>
+    </w:p>
+    <w:p>
+      <w:pPr>
+        <w:rPr>
+          <w:i/>
+          <w:iCs/>
+          <w:color w:val="666666"/>
+        </w:rPr>
+      </w:pPr>
+      <w:r>
+        <w:rPr>
+          <w:i/>
+          <w:iCs/>
+          <w:color w:val="666666"/>
+        </w:rPr>
+        <w:t>Tests d’intégration :</w:t>
+      </w:r>
+    </w:p>
+    <w:p>
+      <w:pPr>
+        <w:rPr>
+          <w:i/>
+          <w:iCs/>
+          <w:color w:val="666666"/>
+        </w:rPr>
+      </w:pPr>
+      <w:r>
+        <w:rPr>
+          <w:i/>
+          <w:iCs/>
+          <w:color w:val="666666"/>
+        </w:rPr>
+        <w:t>- Spring Boot Test</w:t>
+      </w:r>
+    </w:p>
+    <w:p>
+      <w:pPr>
+        <w:rPr>
+          <w:i/>
+          <w:iCs/>
+          <w:color w:val="666666"/>
+        </w:rPr>
+      </w:pPr>
+      <w:r>
+        <w:rPr>
+          <w:i/>
+          <w:iCs/>
+          <w:color w:val="666666"/>
+        </w:rPr>
+        <w:t xml:space="preserve">- </w:t>
+      </w:r>
+      <w:proofErr w:type="spellStart"/>
+      <w:r>
+        <w:rPr>
+          <w:i/>
+          <w:iCs/>
+          <w:color w:val="666666"/>
+        </w:rPr>
+        <w:t>MockMvc</w:t>
+      </w:r>
+      <w:proofErr w:type="spellEnd"/>
+      <w:r>
+        <w:rPr>
+          <w:i/>
+          <w:iCs/>
+          <w:color w:val="666666"/>
+        </w:rPr>
+        <w:t xml:space="preserve"> pour tester les </w:t>
+      </w:r>
+      <w:proofErr w:type="spellStart"/>
+      <w:r>
+        <w:rPr>
+          <w:i/>
+          <w:iCs/>
+          <w:color w:val="666666"/>
+        </w:rPr>
+        <w:t>endpoints</w:t>
+      </w:r>
+      <w:proofErr w:type="spellEnd"/>
+      <w:r>
+        <w:rPr>
+          <w:i/>
+          <w:iCs/>
+          <w:color w:val="666666"/>
+        </w:rPr>
+        <w:t xml:space="preserve"> REST</w:t>
+      </w:r>
+    </w:p>
+    <w:p>
+      <w:pPr>
+        <w:rPr>
+          <w:i/>
+          <w:iCs/>
+          <w:color w:val="666666"/>
+        </w:rPr>
+      </w:pPr>
+      <w:r>
+        <w:rPr>
+          <w:i/>
+          <w:iCs/>
+          <w:color w:val="666666"/>
+        </w:rPr>
+        <w:t>- Vérification des statuts HTTP et des réponses JSON.</w:t>
+      </w:r>
+    </w:p>
+    <w:p>
+      <w:pPr>
+        <w:rPr>
+          <w:i/>
+          <w:iCs/>
+          <w:color w:val="666666"/>
+        </w:rPr>
+      </w:pPr>
+    </w:p>
+    <w:p>
+      <w:pPr>
+        <w:rPr>
+          <w:i/>
+          <w:iCs/>
+          <w:color w:val="666666"/>
+        </w:rPr>
+      </w:pPr>
+      <w:r>
+        <w:rPr>
+          <w:i/>
+          <w:iCs/>
+          <w:color w:val="666666"/>
+        </w:rPr>
+        <w:t>Tests end-to-end :</w:t>
+      </w:r>
+    </w:p>
+    <w:p>
+      <w:pPr>
+        <w:rPr>
+          <w:i/>
+          <w:iCs/>
+          <w:color w:val="666666"/>
+        </w:rPr>
+      </w:pPr>
+      <w:r>
+        <w:rPr>
+          <w:i/>
+          <w:iCs/>
+          <w:color w:val="666666"/>
+        </w:rPr>
+        <w:t>- Cypress</w:t>
+      </w:r>
+    </w:p>
+    <w:p>
+      <w:pPr>
+        <w:rPr>
+          <w:i/>
+          <w:iCs/>
+          <w:color w:val="666666"/>
+        </w:rPr>
+      </w:pPr>
+      <w:r>
+        <w:rPr>
+          <w:i/>
+          <w:iCs/>
+          <w:color w:val="666666"/>
+        </w:rPr>
         <w:lastRenderedPageBreak/>
-        <w:t>3.1 Stratégie de test</w:t>
-      </w:r>
-    </w:p>
-    <w:p>
-      <w:pPr>
-        <w:rPr>
-          <w:i/>
-          <w:iCs/>
-          <w:color w:val="666666"/>
-        </w:rPr>
-      </w:pPr>
-      <w:r>
-        <w:rPr>
-          <w:i/>
-          <w:iCs/>
-          <w:color w:val="666666"/>
-        </w:rPr>
-        <w:t>Tests unitaires :</w:t>
-      </w:r>
-    </w:p>
-    <w:p>
-      <w:pPr>
-        <w:rPr>
-          <w:i/>
-          <w:iCs/>
-          <w:color w:val="666666"/>
-        </w:rPr>
-      </w:pPr>
-      <w:r>
-        <w:rPr>
-          <w:i/>
-          <w:iCs/>
-          <w:color w:val="666666"/>
-        </w:rPr>
-        <w:t>- JUnit 5</w:t>
-      </w:r>
-    </w:p>
-    <w:p>
-      <w:pPr>
-        <w:rPr>
-          <w:i/>
-          <w:iCs/>
-          <w:color w:val="666666"/>
-        </w:rPr>
-      </w:pPr>
-      <w:r>
-        <w:rPr>
-          <w:i/>
-          <w:iCs/>
-          <w:color w:val="666666"/>
-        </w:rPr>
-        <w:t>- Tests des services métier (création utilisateur, abonnements, création post).</w:t>
-      </w:r>
-    </w:p>
-    <w:p>
-      <w:pPr>
-        <w:rPr>
-          <w:i/>
-          <w:iCs/>
-          <w:color w:val="666666"/>
-        </w:rPr>
-      </w:pPr>
-    </w:p>
-    <w:p>
-      <w:pPr>
-        <w:rPr>
-          <w:i/>
-          <w:iCs/>
-          <w:color w:val="666666"/>
-        </w:rPr>
-      </w:pPr>
-      <w:r>
-        <w:rPr>
-          <w:i/>
-          <w:iCs/>
-          <w:color w:val="666666"/>
-        </w:rPr>
-        <w:t>Tests d’intégration :</w:t>
-      </w:r>
-    </w:p>
-    <w:p>
-      <w:pPr>
-        <w:rPr>
-          <w:i/>
-          <w:iCs/>
-          <w:color w:val="666666"/>
-        </w:rPr>
-      </w:pPr>
-      <w:r>
-        <w:rPr>
-          <w:i/>
-          <w:iCs/>
-          <w:color w:val="666666"/>
-        </w:rPr>
-        <w:t>- Spring Boot Test</w:t>
-      </w:r>
-    </w:p>
-    <w:p>
-      <w:pPr>
-        <w:rPr>
-          <w:i/>
-          <w:iCs/>
-          <w:color w:val="666666"/>
-        </w:rPr>
-      </w:pPr>
-      <w:r>
-        <w:rPr>
-          <w:i/>
-          <w:iCs/>
-          <w:color w:val="666666"/>
-        </w:rPr>
-        <w:t xml:space="preserve">- </w:t>
-      </w:r>
-      <w:proofErr w:type="spellStart"/>
-      <w:r>
-        <w:rPr>
-          <w:i/>
-          <w:iCs/>
-          <w:color w:val="666666"/>
-        </w:rPr>
-        <w:t>MockMvc</w:t>
-      </w:r>
-      <w:proofErr w:type="spellEnd"/>
-      <w:r>
-        <w:rPr>
-          <w:i/>
-          <w:iCs/>
-          <w:color w:val="666666"/>
-        </w:rPr>
-        <w:t xml:space="preserve"> pour tester les </w:t>
-      </w:r>
-      <w:proofErr w:type="spellStart"/>
-      <w:r>
-        <w:rPr>
-          <w:i/>
-          <w:iCs/>
-          <w:color w:val="666666"/>
-        </w:rPr>
-        <w:t>endpoints</w:t>
-      </w:r>
-      <w:proofErr w:type="spellEnd"/>
-      <w:r>
-        <w:rPr>
-          <w:i/>
-          <w:iCs/>
-          <w:color w:val="666666"/>
-        </w:rPr>
-        <w:t xml:space="preserve"> REST</w:t>
-      </w:r>
-    </w:p>
-    <w:p>
-      <w:pPr>
-        <w:rPr>
-          <w:i/>
-          <w:iCs/>
-          <w:color w:val="666666"/>
-        </w:rPr>
-      </w:pPr>
-      <w:r>
-        <w:rPr>
-          <w:i/>
-          <w:iCs/>
-          <w:color w:val="666666"/>
-        </w:rPr>
-        <w:t>- Vérification des statuts HTTP et des réponses JSON.</w:t>
-      </w:r>
-    </w:p>
-    <w:p>
-      <w:pPr>
-        <w:rPr>
-          <w:i/>
-          <w:iCs/>
-          <w:color w:val="666666"/>
-        </w:rPr>
-      </w:pPr>
-    </w:p>
-    <w:p>
-      <w:pPr>
-        <w:rPr>
-          <w:i/>
-          <w:iCs/>
-          <w:color w:val="666666"/>
-        </w:rPr>
-      </w:pPr>
-      <w:r>
-        <w:rPr>
-          <w:i/>
-          <w:iCs/>
-          <w:color w:val="666666"/>
-        </w:rPr>
-        <w:t>Tests end-to-end :</w:t>
-      </w:r>
-    </w:p>
-    <w:p>
-      <w:pPr>
-        <w:rPr>
-          <w:i/>
-          <w:iCs/>
-          <w:color w:val="666666"/>
-        </w:rPr>
-      </w:pPr>
-      <w:r>
-        <w:rPr>
-          <w:i/>
-          <w:iCs/>
-          <w:color w:val="666666"/>
-        </w:rPr>
-        <w:t>- Cypress</w:t>
-      </w:r>
-    </w:p>
-    <w:p>
-      <w:pPr>
-        <w:rPr>
-          <w:i/>
-          <w:iCs/>
-          <w:color w:val="666666"/>
-        </w:rPr>
-      </w:pPr>
-      <w:r>
-        <w:rPr>
-          <w:i/>
-          <w:iCs/>
-          <w:color w:val="666666"/>
-        </w:rPr>
         <w:t xml:space="preserve">- Parcours complet : inscription → connexion → abonnement → création article → commentaire → consultation </w:t>
       </w:r>
       <w:proofErr w:type="spellStart"/>
@@ -9594,7 +9129,6 @@
           <w:color w:val="666666"/>
           <w:lang w:val="fr-FR"/>
         </w:rPr>
-        <w:lastRenderedPageBreak/>
         <w:t>L’onglet Performance a permis d’analyser le comportement de l’application lors de la navigation. Les enregistrements montrent une exécution JavaScript stable, sans blocage du thread principal, et un rendu fluide des composants.</w:t>
       </w:r>
     </w:p>
@@ -9863,6 +9397,7 @@
           <w:color w:val="666666"/>
           <w:lang w:val="fr-FR"/>
         </w:rPr>
+        <w:lastRenderedPageBreak/>
         <w:t>Points forts :</w:t>
       </w:r>
     </w:p>
@@ -10235,27 +9770,7 @@
           <w:lang w:val="fr-FR"/>
         </w:rPr>
         <w:br/>
-        <w:t xml:space="preserve">R : Cliquez sur “S’inscrire”, renseignez votre </w:t>
-      </w:r>
-      <w:proofErr w:type="gramStart"/>
-      <w:r>
-        <w:rPr>
-          <w:i/>
-          <w:iCs/>
-          <w:color w:val="666666"/>
-          <w:lang w:val="fr-FR"/>
-        </w:rPr>
-        <w:t>email</w:t>
-      </w:r>
-      <w:proofErr w:type="gramEnd"/>
-      <w:r>
-        <w:rPr>
-          <w:i/>
-          <w:iCs/>
-          <w:color w:val="666666"/>
-          <w:lang w:val="fr-FR"/>
-        </w:rPr>
-        <w:t>, nom d’utilisateur et mot de passe conforme aux règles de sécurité, puis validez le formulaire.</w:t>
+        <w:t>R : Cliquez sur “S’inscrire”, renseignez votre email, nom d’utilisateur et mot de passe conforme aux règles de sécurité, puis validez le formulaire.</w:t>
       </w:r>
     </w:p>
     <w:p>
@@ -10296,27 +9811,7 @@
           <w:lang w:val="fr-FR"/>
         </w:rPr>
         <w:br/>
-        <w:t xml:space="preserve">R : Accédez à la page de connexion, saisissez votre </w:t>
-      </w:r>
-      <w:proofErr w:type="gramStart"/>
-      <w:r>
-        <w:rPr>
-          <w:i/>
-          <w:iCs/>
-          <w:color w:val="666666"/>
-          <w:lang w:val="fr-FR"/>
-        </w:rPr>
-        <w:t>email</w:t>
-      </w:r>
-      <w:proofErr w:type="gramEnd"/>
-      <w:r>
-        <w:rPr>
-          <w:i/>
-          <w:iCs/>
-          <w:color w:val="666666"/>
-          <w:lang w:val="fr-FR"/>
-        </w:rPr>
-        <w:t xml:space="preserve"> (ou nom d’utilisateur) et votre mot de passe, puis validez.</w:t>
+        <w:t>R : Accédez à la page de connexion, saisissez votre email (ou nom d’utilisateur) et votre mot de passe, puis validez.</w:t>
       </w:r>
     </w:p>
     <w:p>
@@ -10549,9 +10044,38 @@
           <w:color w:val="666666"/>
           <w:lang w:val="fr-FR"/>
         </w:rPr>
-        <w:t xml:space="preserve">Q : Que </w:t>
-      </w:r>
-      <w:proofErr w:type="gramStart"/>
+        <w:t>Q : Que faire si une erreur 401 apparaît ?</w:t>
+      </w:r>
+      <w:r>
+        <w:rPr>
+          <w:i/>
+          <w:iCs/>
+          <w:color w:val="666666"/>
+          <w:lang w:val="fr-FR"/>
+        </w:rPr>
+        <w:br/>
+        <w:t>R : Cette erreur signifie que la session a expiré ou que l’utilisateur n’est pas authentifié. Reconnectez-vous.</w:t>
+      </w:r>
+    </w:p>
+    <w:p>
+      <w:pPr>
+        <w:rPr>
+          <w:i/>
+          <w:iCs/>
+          <w:color w:val="666666"/>
+          <w:lang w:val="fr-FR"/>
+        </w:rPr>
+      </w:pPr>
+    </w:p>
+    <w:p>
+      <w:pPr>
+        <w:rPr>
+          <w:i/>
+          <w:iCs/>
+          <w:color w:val="666666"/>
+          <w:lang w:val="fr-FR"/>
+        </w:rPr>
+      </w:pPr>
       <w:r>
         <w:rPr>
           <w:b/>
@@ -10561,49 +10085,7 @@
           <w:color w:val="666666"/>
           <w:lang w:val="fr-FR"/>
         </w:rPr>
-        <w:t>faire</w:t>
-      </w:r>
-      <w:proofErr w:type="gramEnd"/>
-      <w:r>
-        <w:rPr>
-          <w:b/>
-          <w:bCs/>
-          <w:i/>
-          <w:iCs/>
-          <w:color w:val="666666"/>
-          <w:lang w:val="fr-FR"/>
-        </w:rPr>
-        <w:t xml:space="preserve"> si une erreur 401 apparaît ?</w:t>
-      </w:r>
-      <w:r>
-        <w:rPr>
-          <w:i/>
-          <w:iCs/>
-          <w:color w:val="666666"/>
-          <w:lang w:val="fr-FR"/>
-        </w:rPr>
-        <w:br/>
-        <w:t>R : Cette erreur signifie que la session a expiré ou que l’utilisateur n’est pas authentifié. Reconnectez-vous.</w:t>
-      </w:r>
-    </w:p>
-    <w:p>
-      <w:pPr>
-        <w:rPr>
-          <w:i/>
-          <w:iCs/>
-          <w:color w:val="666666"/>
-          <w:lang w:val="fr-FR"/>
-        </w:rPr>
-      </w:pPr>
-      <w:r>
-        <w:rPr>
-          <w:b/>
-          <w:bCs/>
-          <w:i/>
-          <w:iCs/>
-          <w:color w:val="666666"/>
-          <w:lang w:val="fr-FR"/>
-        </w:rPr>
+        <w:lastRenderedPageBreak/>
         <w:t>Q : Que faire si l’application ne fonctionne pas ?</w:t>
       </w:r>
       <w:r>
@@ -10618,6 +10100,464 @@
       </w:r>
     </w:p>
     <w:p/>
+    <w:p>
+      <w:pPr>
+        <w:rPr>
+          <w:i/>
+          <w:iCs/>
+          <w:color w:val="666666"/>
+          <w:lang w:val="fr-FR"/>
+        </w:rPr>
+      </w:pPr>
+      <w:r>
+        <w:rPr>
+          <w:i/>
+          <w:iCs/>
+          <w:color w:val="666666"/>
+          <w:lang w:val="fr-FR"/>
+        </w:rPr>
+        <w:t>Q : Comment les données personnelles sont-elles protégées ?</w:t>
+      </w:r>
+    </w:p>
+    <w:p>
+      <w:pPr>
+        <w:rPr>
+          <w:i/>
+          <w:iCs/>
+          <w:color w:val="666666"/>
+          <w:lang w:val="fr-FR"/>
+        </w:rPr>
+      </w:pPr>
+      <w:r>
+        <w:rPr>
+          <w:i/>
+          <w:iCs/>
+          <w:color w:val="666666"/>
+          <w:lang w:val="fr-FR"/>
+        </w:rPr>
+        <w:t xml:space="preserve">R : </w:t>
+      </w:r>
+      <w:r>
+        <w:rPr>
+          <w:i/>
+          <w:iCs/>
+          <w:color w:val="666666"/>
+          <w:lang w:val="fr-FR"/>
+        </w:rPr>
+        <w:t>Les données utilisateurs sont protégées conformément aux principes RGPD :</w:t>
+      </w:r>
+    </w:p>
+    <w:p>
+      <w:pPr>
+        <w:numPr>
+          <w:ilvl w:val="0"/>
+          <w:numId w:val="38"/>
+        </w:numPr>
+        <w:rPr>
+          <w:i/>
+          <w:iCs/>
+          <w:color w:val="666666"/>
+          <w:lang w:val="fr-FR"/>
+        </w:rPr>
+      </w:pPr>
+      <w:r>
+        <w:rPr>
+          <w:i/>
+          <w:iCs/>
+          <w:color w:val="666666"/>
+          <w:lang w:val="fr-FR"/>
+        </w:rPr>
+        <w:t>Mot</w:t>
+      </w:r>
+      <w:r>
+        <w:rPr>
+          <w:i/>
+          <w:iCs/>
+          <w:color w:val="666666"/>
+          <w:lang w:val="fr-FR"/>
+        </w:rPr>
+        <w:t xml:space="preserve"> de passe stocké sous forme </w:t>
+      </w:r>
+      <w:proofErr w:type="spellStart"/>
+      <w:r>
+        <w:rPr>
+          <w:i/>
+          <w:iCs/>
+          <w:color w:val="666666"/>
+          <w:lang w:val="fr-FR"/>
+        </w:rPr>
+        <w:t>hashée</w:t>
+      </w:r>
+      <w:proofErr w:type="spellEnd"/>
+      <w:r>
+        <w:rPr>
+          <w:i/>
+          <w:iCs/>
+          <w:color w:val="666666"/>
+          <w:lang w:val="fr-FR"/>
+        </w:rPr>
+        <w:t xml:space="preserve"> (</w:t>
+      </w:r>
+      <w:proofErr w:type="spellStart"/>
+      <w:r>
+        <w:rPr>
+          <w:i/>
+          <w:iCs/>
+          <w:color w:val="666666"/>
+          <w:lang w:val="fr-FR"/>
+        </w:rPr>
+        <w:t>BCrypt</w:t>
+      </w:r>
+      <w:proofErr w:type="spellEnd"/>
+      <w:r>
+        <w:rPr>
+          <w:i/>
+          <w:iCs/>
+          <w:color w:val="666666"/>
+          <w:lang w:val="fr-FR"/>
+        </w:rPr>
+        <w:t>)</w:t>
+      </w:r>
+    </w:p>
+    <w:p>
+      <w:pPr>
+        <w:numPr>
+          <w:ilvl w:val="0"/>
+          <w:numId w:val="38"/>
+        </w:numPr>
+        <w:rPr>
+          <w:i/>
+          <w:iCs/>
+          <w:color w:val="666666"/>
+          <w:lang w:val="fr-FR"/>
+        </w:rPr>
+      </w:pPr>
+      <w:r>
+        <w:rPr>
+          <w:i/>
+          <w:iCs/>
+          <w:color w:val="666666"/>
+          <w:lang w:val="fr-FR"/>
+        </w:rPr>
+        <w:t>Authentification</w:t>
+      </w:r>
+      <w:r>
+        <w:rPr>
+          <w:i/>
+          <w:iCs/>
+          <w:color w:val="666666"/>
+          <w:lang w:val="fr-FR"/>
+        </w:rPr>
+        <w:t xml:space="preserve"> sécurisée via JWT</w:t>
+      </w:r>
+    </w:p>
+    <w:p>
+      <w:pPr>
+        <w:numPr>
+          <w:ilvl w:val="0"/>
+          <w:numId w:val="38"/>
+        </w:numPr>
+        <w:rPr>
+          <w:i/>
+          <w:iCs/>
+          <w:color w:val="666666"/>
+          <w:lang w:val="fr-FR"/>
+        </w:rPr>
+      </w:pPr>
+      <w:r>
+        <w:rPr>
+          <w:i/>
+          <w:iCs/>
+          <w:color w:val="666666"/>
+          <w:lang w:val="fr-FR"/>
+        </w:rPr>
+        <w:t>Aucune</w:t>
+      </w:r>
+      <w:r>
+        <w:rPr>
+          <w:i/>
+          <w:iCs/>
+          <w:color w:val="666666"/>
+          <w:lang w:val="fr-FR"/>
+        </w:rPr>
+        <w:t xml:space="preserve"> donnée sensible exposée dans l’API</w:t>
+      </w:r>
+    </w:p>
+    <w:p>
+      <w:pPr>
+        <w:numPr>
+          <w:ilvl w:val="0"/>
+          <w:numId w:val="38"/>
+        </w:numPr>
+        <w:rPr>
+          <w:i/>
+          <w:iCs/>
+          <w:color w:val="666666"/>
+          <w:lang w:val="fr-FR"/>
+        </w:rPr>
+      </w:pPr>
+      <w:r>
+        <w:rPr>
+          <w:i/>
+          <w:iCs/>
+          <w:color w:val="666666"/>
+          <w:lang w:val="fr-FR"/>
+        </w:rPr>
+        <w:t>Séparation</w:t>
+      </w:r>
+      <w:r>
+        <w:rPr>
+          <w:i/>
+          <w:iCs/>
+          <w:color w:val="666666"/>
+          <w:lang w:val="fr-FR"/>
+        </w:rPr>
+        <w:t xml:space="preserve"> entités / DTO pour éviter l’exposition d’informations internes</w:t>
+      </w:r>
+    </w:p>
+    <w:p>
+      <w:pPr>
+        <w:ind w:left="720"/>
+        <w:rPr>
+          <w:i/>
+          <w:iCs/>
+          <w:color w:val="666666"/>
+          <w:lang w:val="fr-FR"/>
+        </w:rPr>
+      </w:pPr>
+    </w:p>
+    <w:p>
+      <w:pPr>
+        <w:rPr>
+          <w:i/>
+          <w:iCs/>
+          <w:color w:val="666666"/>
+          <w:lang w:val="fr-FR"/>
+        </w:rPr>
+      </w:pPr>
+      <w:r>
+        <w:rPr>
+          <w:i/>
+          <w:iCs/>
+          <w:color w:val="666666"/>
+          <w:lang w:val="fr-FR"/>
+        </w:rPr>
+        <w:t>Q : L’application</w:t>
+      </w:r>
+      <w:r>
+        <w:rPr>
+          <w:i/>
+          <w:iCs/>
+          <w:color w:val="666666"/>
+          <w:lang w:val="fr-FR"/>
+        </w:rPr>
+        <w:t xml:space="preserve"> respecte-t-elle les règles </w:t>
+      </w:r>
+      <w:r>
+        <w:rPr>
+          <w:i/>
+          <w:iCs/>
+          <w:color w:val="666666"/>
+          <w:lang w:val="fr-FR"/>
+        </w:rPr>
+        <w:t>accessible ?</w:t>
+      </w:r>
+    </w:p>
+    <w:p>
+      <w:pPr>
+        <w:rPr>
+          <w:i/>
+          <w:iCs/>
+          <w:color w:val="666666"/>
+          <w:lang w:val="fr-FR"/>
+        </w:rPr>
+      </w:pPr>
+      <w:r>
+        <w:rPr>
+          <w:i/>
+          <w:iCs/>
+          <w:color w:val="666666"/>
+          <w:lang w:val="fr-FR"/>
+        </w:rPr>
+        <w:t xml:space="preserve">R : </w:t>
+      </w:r>
+      <w:r>
+        <w:rPr>
+          <w:i/>
+          <w:iCs/>
+          <w:color w:val="666666"/>
+          <w:lang w:val="fr-FR"/>
+        </w:rPr>
+        <w:t>L’interface respecte plusieurs bonnes pratiques d’accessibilité :</w:t>
+      </w:r>
+    </w:p>
+    <w:p>
+      <w:pPr>
+        <w:numPr>
+          <w:ilvl w:val="0"/>
+          <w:numId w:val="39"/>
+        </w:numPr>
+        <w:rPr>
+          <w:i/>
+          <w:iCs/>
+          <w:color w:val="666666"/>
+          <w:lang w:val="fr-FR"/>
+        </w:rPr>
+      </w:pPr>
+      <w:r>
+        <w:rPr>
+          <w:i/>
+          <w:iCs/>
+          <w:color w:val="666666"/>
+          <w:lang w:val="fr-FR"/>
+        </w:rPr>
+        <w:t>Formulaires</w:t>
+      </w:r>
+      <w:r>
+        <w:rPr>
+          <w:i/>
+          <w:iCs/>
+          <w:color w:val="666666"/>
+          <w:lang w:val="fr-FR"/>
+        </w:rPr>
+        <w:t xml:space="preserve"> avec labels explicites</w:t>
+      </w:r>
+    </w:p>
+    <w:p>
+      <w:pPr>
+        <w:numPr>
+          <w:ilvl w:val="0"/>
+          <w:numId w:val="39"/>
+        </w:numPr>
+        <w:rPr>
+          <w:i/>
+          <w:iCs/>
+          <w:color w:val="666666"/>
+          <w:lang w:val="fr-FR"/>
+        </w:rPr>
+      </w:pPr>
+      <w:r>
+        <w:rPr>
+          <w:i/>
+          <w:iCs/>
+          <w:color w:val="666666"/>
+          <w:lang w:val="fr-FR"/>
+        </w:rPr>
+        <w:t>Messages</w:t>
+      </w:r>
+      <w:r>
+        <w:rPr>
+          <w:i/>
+          <w:iCs/>
+          <w:color w:val="666666"/>
+          <w:lang w:val="fr-FR"/>
+        </w:rPr>
+        <w:t xml:space="preserve"> d’erreur clairs</w:t>
+      </w:r>
+    </w:p>
+    <w:p>
+      <w:pPr>
+        <w:numPr>
+          <w:ilvl w:val="0"/>
+          <w:numId w:val="39"/>
+        </w:numPr>
+        <w:rPr>
+          <w:i/>
+          <w:iCs/>
+          <w:color w:val="666666"/>
+          <w:lang w:val="fr-FR"/>
+        </w:rPr>
+      </w:pPr>
+      <w:r>
+        <w:rPr>
+          <w:i/>
+          <w:iCs/>
+          <w:color w:val="666666"/>
+          <w:lang w:val="fr-FR"/>
+        </w:rPr>
+        <w:t>Contraste</w:t>
+      </w:r>
+      <w:r>
+        <w:rPr>
+          <w:i/>
+          <w:iCs/>
+          <w:color w:val="666666"/>
+          <w:lang w:val="fr-FR"/>
+        </w:rPr>
+        <w:t xml:space="preserve"> visuel suffisant</w:t>
+      </w:r>
+    </w:p>
+    <w:p>
+      <w:pPr>
+        <w:numPr>
+          <w:ilvl w:val="0"/>
+          <w:numId w:val="39"/>
+        </w:numPr>
+        <w:rPr>
+          <w:i/>
+          <w:iCs/>
+          <w:color w:val="666666"/>
+          <w:lang w:val="fr-FR"/>
+        </w:rPr>
+      </w:pPr>
+      <w:r>
+        <w:rPr>
+          <w:i/>
+          <w:iCs/>
+          <w:color w:val="666666"/>
+          <w:lang w:val="fr-FR"/>
+        </w:rPr>
+        <w:t>Navigation</w:t>
+      </w:r>
+      <w:r>
+        <w:rPr>
+          <w:i/>
+          <w:iCs/>
+          <w:color w:val="666666"/>
+          <w:lang w:val="fr-FR"/>
+        </w:rPr>
+        <w:t xml:space="preserve"> simple et cohérente</w:t>
+      </w:r>
+    </w:p>
+    <w:p>
+      <w:pPr>
+        <w:rPr>
+          <w:i/>
+          <w:iCs/>
+          <w:color w:val="666666"/>
+          <w:lang w:val="fr-FR"/>
+        </w:rPr>
+      </w:pPr>
+      <w:r>
+        <w:rPr>
+          <w:i/>
+          <w:iCs/>
+          <w:color w:val="666666"/>
+          <w:lang w:val="fr-FR"/>
+        </w:rPr>
+        <w:t>Ces éléments permettent une utilisation correcte sur desktop et mobile.</w:t>
+      </w:r>
+    </w:p>
+    <w:p>
+      <w:pPr>
+        <w:rPr>
+          <w:i/>
+          <w:iCs/>
+          <w:color w:val="666666"/>
+          <w:lang w:val="fr-FR"/>
+        </w:rPr>
+      </w:pPr>
+    </w:p>
+    <w:p>
+      <w:pPr>
+        <w:rPr>
+          <w:i/>
+          <w:iCs/>
+          <w:color w:val="666666"/>
+          <w:lang w:val="fr-FR"/>
+        </w:rPr>
+      </w:pPr>
+    </w:p>
     <w:p>
       <w:pPr>
         <w:pStyle w:val="Titre3"/>
@@ -10641,24 +10581,6 @@
           <w:szCs w:val="26"/>
         </w:rPr>
         <w:t>4.2 Supervision et tâches déléguées à l’IA</w:t>
-      </w:r>
-    </w:p>
-    <w:p>
-      <w:pPr>
-        <w:spacing w:before="240" w:after="240"/>
-      </w:pPr>
-      <w:r>
-        <w:t xml:space="preserve">Décrivez les tâches confiées à l’IA, et comment vous avez </w:t>
-      </w:r>
-      <w:r>
-        <w:rPr>
-          <w:b/>
-          <w:bCs/>
-        </w:rPr>
-        <w:t>vérifié, validé ou corrigé</w:t>
-      </w:r>
-      <w:r>
-        <w:t xml:space="preserve"> son travail.</w:t>
       </w:r>
     </w:p>
     <w:tbl>
@@ -11458,6 +11380,7 @@
                 <w:iCs/>
                 <w:color w:val="666666"/>
               </w:rPr>
+              <w:lastRenderedPageBreak/>
               <w:t>Aide à la rédaction de la documentation technique</w:t>
             </w:r>
           </w:p>
@@ -11601,7 +11524,6 @@
                 <w:iCs/>
                 <w:color w:val="666666"/>
               </w:rPr>
-              <w:lastRenderedPageBreak/>
               <w:t>Assistance au débogage (erreurs 401, 500, configuration DB)</w:t>
             </w:r>
           </w:p>
@@ -11808,83 +11730,6 @@
           </w:p>
         </w:tc>
       </w:tr>
-      <w:tr>
-        <w:trPr>
-          <w:trHeight w:val="785"/>
-        </w:trPr>
-        <w:tc>
-          <w:tcPr>
-            <w:tcW w:w="2169" w:type="dxa"/>
-            <w:tcBorders>
-              <w:top w:val="nil"/>
-              <w:left w:val="nil"/>
-              <w:bottom w:val="nil"/>
-              <w:right w:val="nil"/>
-            </w:tcBorders>
-            <w:tcMar>
-              <w:top w:w="100" w:type="dxa"/>
-              <w:left w:w="100" w:type="dxa"/>
-              <w:bottom w:w="100" w:type="dxa"/>
-              <w:right w:w="100" w:type="dxa"/>
-            </w:tcMar>
-          </w:tcPr>
-          <w:p/>
-        </w:tc>
-        <w:tc>
-          <w:tcPr>
-            <w:tcW w:w="1842" w:type="dxa"/>
-            <w:tcBorders>
-              <w:top w:val="nil"/>
-              <w:left w:val="nil"/>
-              <w:bottom w:val="nil"/>
-              <w:right w:val="nil"/>
-            </w:tcBorders>
-            <w:tcMar>
-              <w:top w:w="100" w:type="dxa"/>
-              <w:left w:w="100" w:type="dxa"/>
-              <w:bottom w:w="100" w:type="dxa"/>
-              <w:right w:w="100" w:type="dxa"/>
-            </w:tcMar>
-          </w:tcPr>
-          <w:p/>
-        </w:tc>
-        <w:tc>
-          <w:tcPr>
-            <w:tcW w:w="2224" w:type="dxa"/>
-            <w:tcBorders>
-              <w:top w:val="nil"/>
-              <w:left w:val="nil"/>
-              <w:bottom w:val="nil"/>
-              <w:right w:val="nil"/>
-            </w:tcBorders>
-            <w:tcMar>
-              <w:top w:w="100" w:type="dxa"/>
-              <w:left w:w="100" w:type="dxa"/>
-              <w:bottom w:w="100" w:type="dxa"/>
-              <w:right w:w="100" w:type="dxa"/>
-            </w:tcMar>
-          </w:tcPr>
-          <w:p/>
-        </w:tc>
-        <w:tc>
-          <w:tcPr>
-            <w:tcW w:w="2790" w:type="dxa"/>
-            <w:tcBorders>
-              <w:top w:val="nil"/>
-              <w:left w:val="nil"/>
-              <w:bottom w:val="nil"/>
-              <w:right w:val="nil"/>
-            </w:tcBorders>
-            <w:tcMar>
-              <w:top w:w="100" w:type="dxa"/>
-              <w:left w:w="100" w:type="dxa"/>
-              <w:bottom w:w="100" w:type="dxa"/>
-              <w:right w:w="100" w:type="dxa"/>
-            </w:tcMar>
-          </w:tcPr>
-          <w:p/>
-        </w:tc>
-      </w:tr>
     </w:tbl>
     <w:p>
       <w:pPr>
@@ -11925,14 +11770,6 @@
           <w:szCs w:val="34"/>
         </w:rPr>
         <w:t>5. Annexes</w:t>
-      </w:r>
-    </w:p>
-    <w:p>
-      <w:pPr>
-        <w:spacing w:before="240" w:after="240"/>
-      </w:pPr>
-      <w:r>
-        <w:t>Intégrez ici toutes les pièces justificatives :</w:t>
       </w:r>
     </w:p>
     <w:p>
@@ -11978,7 +11815,7 @@
                     <pic:cNvPicPr/>
                   </pic:nvPicPr>
                   <pic:blipFill>
-                    <a:blip r:embed="rId16"/>
+                    <a:blip r:embed="rId17"/>
                     <a:stretch>
                       <a:fillRect/>
                     </a:stretch>
@@ -12024,7 +11861,7 @@
                     <pic:cNvPicPr/>
                   </pic:nvPicPr>
                   <pic:blipFill>
-                    <a:blip r:embed="rId17"/>
+                    <a:blip r:embed="rId18"/>
                     <a:stretch>
                       <a:fillRect/>
                     </a:stretch>
@@ -12069,7 +11906,7 @@
                     <pic:cNvPicPr/>
                   </pic:nvPicPr>
                   <pic:blipFill>
-                    <a:blip r:embed="rId18"/>
+                    <a:blip r:embed="rId19"/>
                     <a:stretch>
                       <a:fillRect/>
                     </a:stretch>
@@ -12115,7 +11952,7 @@
                     <pic:cNvPicPr/>
                   </pic:nvPicPr>
                   <pic:blipFill>
-                    <a:blip r:embed="rId19"/>
+                    <a:blip r:embed="rId20"/>
                     <a:stretch>
                       <a:fillRect/>
                     </a:stretch>
@@ -12160,7 +11997,7 @@
                     <pic:cNvPicPr/>
                   </pic:nvPicPr>
                   <pic:blipFill>
-                    <a:blip r:embed="rId20"/>
+                    <a:blip r:embed="rId21"/>
                     <a:stretch>
                       <a:fillRect/>
                     </a:stretch>
@@ -12206,7 +12043,7 @@
                     <pic:cNvPicPr/>
                   </pic:nvPicPr>
                   <pic:blipFill>
-                    <a:blip r:embed="rId21"/>
+                    <a:blip r:embed="rId22"/>
                     <a:stretch>
                       <a:fillRect/>
                     </a:stretch>
@@ -12251,7 +12088,7 @@
                     <pic:cNvPicPr/>
                   </pic:nvPicPr>
                   <pic:blipFill>
-                    <a:blip r:embed="rId22"/>
+                    <a:blip r:embed="rId23"/>
                     <a:stretch>
                       <a:fillRect/>
                     </a:stretch>
@@ -12324,7 +12161,7 @@
       <w:pPr>
         <w:pStyle w:val="Paragraphedeliste"/>
       </w:pPr>
-      <w:hyperlink r:id="rId23" w:history="1">
+      <w:hyperlink r:id="rId24" w:history="1">
         <w:r>
           <w:rPr>
             <w:rStyle w:val="Lienhypertexte"/>
@@ -12758,25 +12595,7 @@
           <w:iCs/>
           <w:color w:val="666666"/>
         </w:rPr>
-        <w:t xml:space="preserve">La logique métier est </w:t>
-      </w:r>
-      <w:proofErr w:type="gramStart"/>
-      <w:r>
-        <w:rPr>
-          <w:i/>
-          <w:iCs/>
-          <w:color w:val="666666"/>
-        </w:rPr>
-        <w:t>centralisée</w:t>
-      </w:r>
-      <w:proofErr w:type="gramEnd"/>
-      <w:r>
-        <w:rPr>
-          <w:i/>
-          <w:iCs/>
-          <w:color w:val="666666"/>
-        </w:rPr>
-        <w:t xml:space="preserve"> dans des services, tandis que les composants sont orientés présentation.</w:t>
+        <w:t>La logique métier est centralisée dans des services, tandis que les composants sont orientés présentation.</w:t>
       </w:r>
     </w:p>
     <w:p>
@@ -12882,23 +12701,13 @@
           <w:color w:val="666666"/>
         </w:rPr>
       </w:pPr>
-      <w:proofErr w:type="gramStart"/>
-      <w:r>
-        <w:rPr>
-          <w:i/>
-          <w:iCs/>
-          <w:color w:val="666666"/>
-        </w:rPr>
-        <w:t>la</w:t>
-      </w:r>
-      <w:proofErr w:type="gramEnd"/>
-      <w:r>
-        <w:rPr>
-          <w:i/>
-          <w:iCs/>
-          <w:color w:val="666666"/>
-        </w:rPr>
-        <w:t xml:space="preserve"> structure visuelle des maquettes,</w:t>
+      <w:r>
+        <w:rPr>
+          <w:i/>
+          <w:iCs/>
+          <w:color w:val="666666"/>
+        </w:rPr>
+        <w:t>la structure visuelle des maquettes,</w:t>
       </w:r>
     </w:p>
     <w:p>
@@ -12914,23 +12723,13 @@
           <w:color w:val="666666"/>
         </w:rPr>
       </w:pPr>
-      <w:proofErr w:type="gramStart"/>
-      <w:r>
-        <w:rPr>
-          <w:i/>
-          <w:iCs/>
-          <w:color w:val="666666"/>
-        </w:rPr>
-        <w:t>une</w:t>
-      </w:r>
-      <w:proofErr w:type="gramEnd"/>
-      <w:r>
-        <w:rPr>
-          <w:i/>
-          <w:iCs/>
-          <w:color w:val="666666"/>
-        </w:rPr>
-        <w:t xml:space="preserve"> hiérarchie claire des contenus,</w:t>
+      <w:r>
+        <w:rPr>
+          <w:i/>
+          <w:iCs/>
+          <w:color w:val="666666"/>
+        </w:rPr>
+        <w:t>une hiérarchie claire des contenus,</w:t>
       </w:r>
     </w:p>
     <w:p>
@@ -12946,23 +12745,13 @@
           <w:color w:val="666666"/>
         </w:rPr>
       </w:pPr>
-      <w:proofErr w:type="gramStart"/>
-      <w:r>
-        <w:rPr>
-          <w:i/>
-          <w:iCs/>
-          <w:color w:val="666666"/>
-        </w:rPr>
-        <w:t>une</w:t>
-      </w:r>
-      <w:proofErr w:type="gramEnd"/>
-      <w:r>
-        <w:rPr>
-          <w:i/>
-          <w:iCs/>
-          <w:color w:val="666666"/>
-        </w:rPr>
-        <w:t xml:space="preserve"> navigation fluide,</w:t>
+      <w:r>
+        <w:rPr>
+          <w:i/>
+          <w:iCs/>
+          <w:color w:val="666666"/>
+        </w:rPr>
+        <w:t>une navigation fluide,</w:t>
       </w:r>
     </w:p>
     <w:p>
@@ -12978,23 +12767,13 @@
           <w:color w:val="666666"/>
         </w:rPr>
       </w:pPr>
-      <w:proofErr w:type="gramStart"/>
-      <w:r>
-        <w:rPr>
-          <w:i/>
-          <w:iCs/>
-          <w:color w:val="666666"/>
-        </w:rPr>
-        <w:t>un</w:t>
-      </w:r>
-      <w:proofErr w:type="gramEnd"/>
-      <w:r>
-        <w:rPr>
-          <w:i/>
-          <w:iCs/>
-          <w:color w:val="666666"/>
-        </w:rPr>
-        <w:t xml:space="preserve"> affichage responsive (desktop / mobile).</w:t>
+      <w:r>
+        <w:rPr>
+          <w:i/>
+          <w:iCs/>
+          <w:color w:val="666666"/>
+        </w:rPr>
+        <w:t>un affichage responsive (desktop / mobile).</w:t>
       </w:r>
     </w:p>
     <w:p>
@@ -13215,23 +12994,13 @@
           <w:color w:val="666666"/>
         </w:rPr>
       </w:pPr>
-      <w:proofErr w:type="gramStart"/>
-      <w:r>
-        <w:rPr>
-          <w:i/>
-          <w:iCs/>
-          <w:color w:val="666666"/>
-        </w:rPr>
-        <w:t>la</w:t>
-      </w:r>
-      <w:proofErr w:type="gramEnd"/>
-      <w:r>
-        <w:rPr>
-          <w:i/>
-          <w:iCs/>
-          <w:color w:val="666666"/>
-        </w:rPr>
-        <w:t xml:space="preserve"> conformité aux spécifications ORION,</w:t>
+      <w:r>
+        <w:rPr>
+          <w:i/>
+          <w:iCs/>
+          <w:color w:val="666666"/>
+        </w:rPr>
+        <w:t>la conformité aux spécifications ORION,</w:t>
       </w:r>
     </w:p>
     <w:p>
@@ -13247,23 +13016,13 @@
           <w:color w:val="666666"/>
         </w:rPr>
       </w:pPr>
-      <w:proofErr w:type="gramStart"/>
-      <w:r>
-        <w:rPr>
-          <w:i/>
-          <w:iCs/>
-          <w:color w:val="666666"/>
-        </w:rPr>
-        <w:t>l’alignement</w:t>
-      </w:r>
-      <w:proofErr w:type="gramEnd"/>
-      <w:r>
-        <w:rPr>
-          <w:i/>
-          <w:iCs/>
-          <w:color w:val="666666"/>
-        </w:rPr>
-        <w:t xml:space="preserve"> avec les maquettes UX,</w:t>
+      <w:r>
+        <w:rPr>
+          <w:i/>
+          <w:iCs/>
+          <w:color w:val="666666"/>
+        </w:rPr>
+        <w:t>l’alignement avec les maquettes UX,</w:t>
       </w:r>
     </w:p>
     <w:p>
@@ -13279,23 +13038,13 @@
           <w:color w:val="666666"/>
         </w:rPr>
       </w:pPr>
-      <w:proofErr w:type="gramStart"/>
-      <w:r>
-        <w:rPr>
-          <w:i/>
-          <w:iCs/>
-          <w:color w:val="666666"/>
-        </w:rPr>
-        <w:t>une</w:t>
-      </w:r>
-      <w:proofErr w:type="gramEnd"/>
-      <w:r>
-        <w:rPr>
-          <w:i/>
-          <w:iCs/>
-          <w:color w:val="666666"/>
-        </w:rPr>
-        <w:t xml:space="preserve"> architecture </w:t>
+      <w:r>
+        <w:rPr>
+          <w:i/>
+          <w:iCs/>
+          <w:color w:val="666666"/>
+        </w:rPr>
+        <w:t xml:space="preserve">une architecture </w:t>
       </w:r>
       <w:proofErr w:type="spellStart"/>
       <w:r>
@@ -13329,23 +13078,13 @@
           <w:color w:val="666666"/>
         </w:rPr>
       </w:pPr>
-      <w:proofErr w:type="gramStart"/>
-      <w:r>
-        <w:rPr>
-          <w:i/>
-          <w:iCs/>
-          <w:color w:val="666666"/>
-        </w:rPr>
-        <w:t>une</w:t>
-      </w:r>
-      <w:proofErr w:type="gramEnd"/>
-      <w:r>
-        <w:rPr>
-          <w:i/>
-          <w:iCs/>
-          <w:color w:val="666666"/>
-        </w:rPr>
-        <w:t xml:space="preserve"> cohérence stricte entre interface utilisateur et règles métier.</w:t>
+      <w:r>
+        <w:rPr>
+          <w:i/>
+          <w:iCs/>
+          <w:color w:val="666666"/>
+        </w:rPr>
+        <w:t>une cohérence stricte entre interface utilisateur et règles métier.</w:t>
       </w:r>
     </w:p>
     <w:p>
@@ -13516,23 +13255,13 @@
           <w:color w:val="666666"/>
         </w:rPr>
       </w:pPr>
-      <w:proofErr w:type="gramStart"/>
-      <w:r>
-        <w:rPr>
-          <w:i/>
-          <w:iCs/>
-          <w:color w:val="666666"/>
-        </w:rPr>
-        <w:t>id</w:t>
-      </w:r>
-      <w:proofErr w:type="gramEnd"/>
-      <w:r>
-        <w:rPr>
-          <w:i/>
-          <w:iCs/>
-          <w:color w:val="666666"/>
-        </w:rPr>
-        <w:t xml:space="preserve"> : Long</w:t>
+      <w:r>
+        <w:rPr>
+          <w:i/>
+          <w:iCs/>
+          <w:color w:val="666666"/>
+        </w:rPr>
+        <w:t>id : Long</w:t>
       </w:r>
     </w:p>
     <w:p>
@@ -13547,7 +13276,6 @@
           <w:color w:val="666666"/>
         </w:rPr>
       </w:pPr>
-      <w:proofErr w:type="gramStart"/>
       <w:r>
         <w:rPr>
           <w:i/>
@@ -13555,16 +13283,7 @@
           <w:color w:val="666666"/>
         </w:rPr>
         <w:lastRenderedPageBreak/>
-        <w:t>email</w:t>
-      </w:r>
-      <w:proofErr w:type="gramEnd"/>
-      <w:r>
-        <w:rPr>
-          <w:i/>
-          <w:iCs/>
-          <w:color w:val="666666"/>
-        </w:rPr>
-        <w:t xml:space="preserve"> : String</w:t>
+        <w:t>email : String</w:t>
       </w:r>
     </w:p>
     <w:p>
@@ -13580,7 +13299,6 @@
         </w:rPr>
       </w:pPr>
       <w:proofErr w:type="spellStart"/>
-      <w:proofErr w:type="gramStart"/>
       <w:r>
         <w:rPr>
           <w:i/>
@@ -13590,7 +13308,6 @@
         <w:t>username</w:t>
       </w:r>
       <w:proofErr w:type="spellEnd"/>
-      <w:proofErr w:type="gramEnd"/>
       <w:r>
         <w:rPr>
           <w:i/>
@@ -13613,7 +13330,6 @@
         </w:rPr>
       </w:pPr>
       <w:proofErr w:type="spellStart"/>
-      <w:proofErr w:type="gramStart"/>
       <w:r>
         <w:rPr>
           <w:i/>
@@ -13623,7 +13339,6 @@
         <w:t>passwordHash</w:t>
       </w:r>
       <w:proofErr w:type="spellEnd"/>
-      <w:proofErr w:type="gramEnd"/>
       <w:r>
         <w:rPr>
           <w:i/>
@@ -13646,7 +13361,6 @@
         </w:rPr>
       </w:pPr>
       <w:proofErr w:type="spellStart"/>
-      <w:proofErr w:type="gramStart"/>
       <w:r>
         <w:rPr>
           <w:i/>
@@ -13656,7 +13370,6 @@
         <w:t>createdAt</w:t>
       </w:r>
       <w:proofErr w:type="spellEnd"/>
-      <w:proofErr w:type="gramEnd"/>
       <w:r>
         <w:rPr>
           <w:i/>
@@ -13776,23 +13489,13 @@
           <w:color w:val="666666"/>
         </w:rPr>
       </w:pPr>
-      <w:proofErr w:type="gramStart"/>
-      <w:r>
-        <w:rPr>
-          <w:i/>
-          <w:iCs/>
-          <w:color w:val="666666"/>
-        </w:rPr>
-        <w:t>id</w:t>
-      </w:r>
-      <w:proofErr w:type="gramEnd"/>
-      <w:r>
-        <w:rPr>
-          <w:i/>
-          <w:iCs/>
-          <w:color w:val="666666"/>
-        </w:rPr>
-        <w:t xml:space="preserve"> : Long</w:t>
+      <w:r>
+        <w:rPr>
+          <w:i/>
+          <w:iCs/>
+          <w:color w:val="666666"/>
+        </w:rPr>
+        <w:t>id : Long</w:t>
       </w:r>
     </w:p>
     <w:p>
@@ -13808,7 +13511,6 @@
         </w:rPr>
       </w:pPr>
       <w:proofErr w:type="spellStart"/>
-      <w:proofErr w:type="gramStart"/>
       <w:r>
         <w:rPr>
           <w:i/>
@@ -13818,7 +13520,6 @@
         <w:t>name</w:t>
       </w:r>
       <w:proofErr w:type="spellEnd"/>
-      <w:proofErr w:type="gramEnd"/>
       <w:r>
         <w:rPr>
           <w:i/>
@@ -13840,23 +13541,13 @@
           <w:color w:val="666666"/>
         </w:rPr>
       </w:pPr>
-      <w:proofErr w:type="gramStart"/>
-      <w:r>
-        <w:rPr>
-          <w:i/>
-          <w:iCs/>
-          <w:color w:val="666666"/>
-        </w:rPr>
-        <w:t>description</w:t>
-      </w:r>
-      <w:proofErr w:type="gramEnd"/>
-      <w:r>
-        <w:rPr>
-          <w:i/>
-          <w:iCs/>
-          <w:color w:val="666666"/>
-        </w:rPr>
-        <w:t xml:space="preserve"> : String</w:t>
+      <w:r>
+        <w:rPr>
+          <w:i/>
+          <w:iCs/>
+          <w:color w:val="666666"/>
+        </w:rPr>
+        <w:t>description : String</w:t>
       </w:r>
     </w:p>
     <w:p>
@@ -13926,23 +13617,13 @@
           <w:color w:val="666666"/>
         </w:rPr>
       </w:pPr>
-      <w:proofErr w:type="gramStart"/>
-      <w:r>
-        <w:rPr>
-          <w:i/>
-          <w:iCs/>
-          <w:color w:val="666666"/>
-        </w:rPr>
-        <w:t>id</w:t>
-      </w:r>
-      <w:proofErr w:type="gramEnd"/>
-      <w:r>
-        <w:rPr>
-          <w:i/>
-          <w:iCs/>
-          <w:color w:val="666666"/>
-        </w:rPr>
-        <w:t xml:space="preserve"> : Long</w:t>
+      <w:r>
+        <w:rPr>
+          <w:i/>
+          <w:iCs/>
+          <w:color w:val="666666"/>
+        </w:rPr>
+        <w:t>id : Long</w:t>
       </w:r>
     </w:p>
     <w:p>
@@ -13958,7 +13639,6 @@
         </w:rPr>
       </w:pPr>
       <w:proofErr w:type="spellStart"/>
-      <w:proofErr w:type="gramStart"/>
       <w:r>
         <w:rPr>
           <w:i/>
@@ -13968,7 +13648,6 @@
         <w:t>userId</w:t>
       </w:r>
       <w:proofErr w:type="spellEnd"/>
-      <w:proofErr w:type="gramEnd"/>
       <w:r>
         <w:rPr>
           <w:i/>
@@ -13991,7 +13670,6 @@
         </w:rPr>
       </w:pPr>
       <w:proofErr w:type="spellStart"/>
-      <w:proofErr w:type="gramStart"/>
       <w:r>
         <w:rPr>
           <w:i/>
@@ -14001,7 +13679,6 @@
         <w:t>topicId</w:t>
       </w:r>
       <w:proofErr w:type="spellEnd"/>
-      <w:proofErr w:type="gramEnd"/>
       <w:r>
         <w:rPr>
           <w:i/>
@@ -14094,23 +13771,13 @@
           <w:color w:val="666666"/>
         </w:rPr>
       </w:pPr>
-      <w:proofErr w:type="gramStart"/>
-      <w:r>
-        <w:rPr>
-          <w:i/>
-          <w:iCs/>
-          <w:color w:val="666666"/>
-        </w:rPr>
-        <w:t>id</w:t>
-      </w:r>
-      <w:proofErr w:type="gramEnd"/>
-      <w:r>
-        <w:rPr>
-          <w:i/>
-          <w:iCs/>
-          <w:color w:val="666666"/>
-        </w:rPr>
-        <w:t xml:space="preserve"> : Long</w:t>
+      <w:r>
+        <w:rPr>
+          <w:i/>
+          <w:iCs/>
+          <w:color w:val="666666"/>
+        </w:rPr>
+        <w:t>id : Long</w:t>
       </w:r>
     </w:p>
     <w:p>
@@ -14126,7 +13793,6 @@
         </w:rPr>
       </w:pPr>
       <w:proofErr w:type="spellStart"/>
-      <w:proofErr w:type="gramStart"/>
       <w:r>
         <w:rPr>
           <w:i/>
@@ -14136,7 +13802,6 @@
         <w:t>title</w:t>
       </w:r>
       <w:proofErr w:type="spellEnd"/>
-      <w:proofErr w:type="gramEnd"/>
       <w:r>
         <w:rPr>
           <w:i/>
@@ -14158,23 +13823,13 @@
           <w:color w:val="666666"/>
         </w:rPr>
       </w:pPr>
-      <w:proofErr w:type="gramStart"/>
-      <w:r>
-        <w:rPr>
-          <w:i/>
-          <w:iCs/>
-          <w:color w:val="666666"/>
-        </w:rPr>
-        <w:t>content</w:t>
-      </w:r>
-      <w:proofErr w:type="gramEnd"/>
-      <w:r>
-        <w:rPr>
-          <w:i/>
-          <w:iCs/>
-          <w:color w:val="666666"/>
-        </w:rPr>
-        <w:t xml:space="preserve"> : String</w:t>
+      <w:r>
+        <w:rPr>
+          <w:i/>
+          <w:iCs/>
+          <w:color w:val="666666"/>
+        </w:rPr>
+        <w:t>content : String</w:t>
       </w:r>
     </w:p>
     <w:p>
@@ -14190,7 +13845,6 @@
         </w:rPr>
       </w:pPr>
       <w:proofErr w:type="spellStart"/>
-      <w:proofErr w:type="gramStart"/>
       <w:r>
         <w:rPr>
           <w:i/>
@@ -14200,7 +13854,6 @@
         <w:t>createdAt</w:t>
       </w:r>
       <w:proofErr w:type="spellEnd"/>
-      <w:proofErr w:type="gramEnd"/>
       <w:r>
         <w:rPr>
           <w:i/>
@@ -14382,23 +14035,13 @@
           <w:color w:val="666666"/>
         </w:rPr>
       </w:pPr>
-      <w:proofErr w:type="gramStart"/>
-      <w:r>
-        <w:rPr>
-          <w:i/>
-          <w:iCs/>
-          <w:color w:val="666666"/>
-        </w:rPr>
-        <w:t>id</w:t>
-      </w:r>
-      <w:proofErr w:type="gramEnd"/>
-      <w:r>
-        <w:rPr>
-          <w:i/>
-          <w:iCs/>
-          <w:color w:val="666666"/>
-        </w:rPr>
-        <w:t xml:space="preserve"> : Long</w:t>
+      <w:r>
+        <w:rPr>
+          <w:i/>
+          <w:iCs/>
+          <w:color w:val="666666"/>
+        </w:rPr>
+        <w:t>id : Long</w:t>
       </w:r>
     </w:p>
     <w:p>
@@ -14413,23 +14056,13 @@
           <w:color w:val="666666"/>
         </w:rPr>
       </w:pPr>
-      <w:proofErr w:type="gramStart"/>
-      <w:r>
-        <w:rPr>
-          <w:i/>
-          <w:iCs/>
-          <w:color w:val="666666"/>
-        </w:rPr>
-        <w:t>content</w:t>
-      </w:r>
-      <w:proofErr w:type="gramEnd"/>
-      <w:r>
-        <w:rPr>
-          <w:i/>
-          <w:iCs/>
-          <w:color w:val="666666"/>
-        </w:rPr>
-        <w:t xml:space="preserve"> : String</w:t>
+      <w:r>
+        <w:rPr>
+          <w:i/>
+          <w:iCs/>
+          <w:color w:val="666666"/>
+        </w:rPr>
+        <w:t>content : String</w:t>
       </w:r>
     </w:p>
     <w:p>
@@ -14445,7 +14078,6 @@
         </w:rPr>
       </w:pPr>
       <w:proofErr w:type="spellStart"/>
-      <w:proofErr w:type="gramStart"/>
       <w:r>
         <w:rPr>
           <w:i/>
@@ -14455,7 +14087,6 @@
         <w:t>createdAt</w:t>
       </w:r>
       <w:proofErr w:type="spellEnd"/>
-      <w:proofErr w:type="gramEnd"/>
       <w:r>
         <w:rPr>
           <w:i/>
@@ -14770,7 +14401,7 @@
                     <pic:cNvPicPr/>
                   </pic:nvPicPr>
                   <pic:blipFill>
-                    <a:blip r:embed="rId24"/>
+                    <a:blip r:embed="rId25"/>
                     <a:stretch>
                       <a:fillRect/>
                     </a:stretch>
@@ -15208,7 +14839,6 @@
         </w:rPr>
       </w:pPr>
       <w:proofErr w:type="spellStart"/>
-      <w:proofErr w:type="gramStart"/>
       <w:r>
         <w:rPr>
           <w:i/>
@@ -15224,16 +14854,7 @@
           <w:iCs/>
           <w:color w:val="666666"/>
         </w:rPr>
-        <w:t>:</w:t>
-      </w:r>
-      <w:proofErr w:type="gramEnd"/>
-      <w:r>
-        <w:rPr>
-          <w:i/>
-          <w:iCs/>
-          <w:color w:val="666666"/>
-        </w:rPr>
-        <w:t xml:space="preserve"> Bearer &lt;</w:t>
+        <w:t>: Bearer &lt;</w:t>
       </w:r>
       <w:proofErr w:type="spellStart"/>
       <w:r>
@@ -15415,7 +15036,7 @@
                     <pic:cNvPicPr/>
                   </pic:nvPicPr>
                   <pic:blipFill>
-                    <a:blip r:embed="rId25"/>
+                    <a:blip r:embed="rId26"/>
                     <a:stretch>
                       <a:fillRect/>
                     </a:stretch>
@@ -15467,7 +15088,7 @@
                     <pic:cNvPicPr/>
                   </pic:nvPicPr>
                   <pic:blipFill>
-                    <a:blip r:embed="rId26"/>
+                    <a:blip r:embed="rId27"/>
                     <a:stretch>
                       <a:fillRect/>
                     </a:stretch>
@@ -18126,6 +17747,155 @@
     </w:lvl>
   </w:abstractNum>
   <w:abstractNum w:abstractNumId="5" w15:restartNumberingAfterBreak="0">
+    <w:nsid w:val="16FF614D"/>
+    <w:multiLevelType w:val="multilevel"/>
+    <w:tmpl w:val="017435F4"/>
+    <w:lvl w:ilvl="0">
+      <w:start w:val="1"/>
+      <w:numFmt w:val="bullet"/>
+      <w:lvlText w:val=""/>
+      <w:lvlJc w:val="left"/>
+      <w:pPr>
+        <w:tabs>
+          <w:tab w:val="num" w:pos="720"/>
+        </w:tabs>
+        <w:ind w:left="720" w:hanging="360"/>
+      </w:pPr>
+      <w:rPr>
+        <w:rFonts w:ascii="Symbol" w:hAnsi="Symbol" w:hint="default"/>
+        <w:sz w:val="20"/>
+      </w:rPr>
+    </w:lvl>
+    <w:lvl w:ilvl="1" w:tentative="1">
+      <w:start w:val="1"/>
+      <w:numFmt w:val="bullet"/>
+      <w:lvlText w:val="o"/>
+      <w:lvlJc w:val="left"/>
+      <w:pPr>
+        <w:tabs>
+          <w:tab w:val="num" w:pos="1440"/>
+        </w:tabs>
+        <w:ind w:left="1440" w:hanging="360"/>
+      </w:pPr>
+      <w:rPr>
+        <w:rFonts w:ascii="Courier New" w:hAnsi="Courier New" w:hint="default"/>
+        <w:sz w:val="20"/>
+      </w:rPr>
+    </w:lvl>
+    <w:lvl w:ilvl="2" w:tentative="1">
+      <w:start w:val="1"/>
+      <w:numFmt w:val="bullet"/>
+      <w:lvlText w:val=""/>
+      <w:lvlJc w:val="left"/>
+      <w:pPr>
+        <w:tabs>
+          <w:tab w:val="num" w:pos="2160"/>
+        </w:tabs>
+        <w:ind w:left="2160" w:hanging="360"/>
+      </w:pPr>
+      <w:rPr>
+        <w:rFonts w:ascii="Wingdings" w:hAnsi="Wingdings" w:hint="default"/>
+        <w:sz w:val="20"/>
+      </w:rPr>
+    </w:lvl>
+    <w:lvl w:ilvl="3" w:tentative="1">
+      <w:start w:val="1"/>
+      <w:numFmt w:val="bullet"/>
+      <w:lvlText w:val=""/>
+      <w:lvlJc w:val="left"/>
+      <w:pPr>
+        <w:tabs>
+          <w:tab w:val="num" w:pos="2880"/>
+        </w:tabs>
+        <w:ind w:left="2880" w:hanging="360"/>
+      </w:pPr>
+      <w:rPr>
+        <w:rFonts w:ascii="Wingdings" w:hAnsi="Wingdings" w:hint="default"/>
+        <w:sz w:val="20"/>
+      </w:rPr>
+    </w:lvl>
+    <w:lvl w:ilvl="4" w:tentative="1">
+      <w:start w:val="1"/>
+      <w:numFmt w:val="bullet"/>
+      <w:lvlText w:val=""/>
+      <w:lvlJc w:val="left"/>
+      <w:pPr>
+        <w:tabs>
+          <w:tab w:val="num" w:pos="3600"/>
+        </w:tabs>
+        <w:ind w:left="3600" w:hanging="360"/>
+      </w:pPr>
+      <w:rPr>
+        <w:rFonts w:ascii="Wingdings" w:hAnsi="Wingdings" w:hint="default"/>
+        <w:sz w:val="20"/>
+      </w:rPr>
+    </w:lvl>
+    <w:lvl w:ilvl="5" w:tentative="1">
+      <w:start w:val="1"/>
+      <w:numFmt w:val="bullet"/>
+      <w:lvlText w:val=""/>
+      <w:lvlJc w:val="left"/>
+      <w:pPr>
+        <w:tabs>
+          <w:tab w:val="num" w:pos="4320"/>
+        </w:tabs>
+        <w:ind w:left="4320" w:hanging="360"/>
+      </w:pPr>
+      <w:rPr>
+        <w:rFonts w:ascii="Wingdings" w:hAnsi="Wingdings" w:hint="default"/>
+        <w:sz w:val="20"/>
+      </w:rPr>
+    </w:lvl>
+    <w:lvl w:ilvl="6" w:tentative="1">
+      <w:start w:val="1"/>
+      <w:numFmt w:val="bullet"/>
+      <w:lvlText w:val=""/>
+      <w:lvlJc w:val="left"/>
+      <w:pPr>
+        <w:tabs>
+          <w:tab w:val="num" w:pos="5040"/>
+        </w:tabs>
+        <w:ind w:left="5040" w:hanging="360"/>
+      </w:pPr>
+      <w:rPr>
+        <w:rFonts w:ascii="Wingdings" w:hAnsi="Wingdings" w:hint="default"/>
+        <w:sz w:val="20"/>
+      </w:rPr>
+    </w:lvl>
+    <w:lvl w:ilvl="7" w:tentative="1">
+      <w:start w:val="1"/>
+      <w:numFmt w:val="bullet"/>
+      <w:lvlText w:val=""/>
+      <w:lvlJc w:val="left"/>
+      <w:pPr>
+        <w:tabs>
+          <w:tab w:val="num" w:pos="5760"/>
+        </w:tabs>
+        <w:ind w:left="5760" w:hanging="360"/>
+      </w:pPr>
+      <w:rPr>
+        <w:rFonts w:ascii="Wingdings" w:hAnsi="Wingdings" w:hint="default"/>
+        <w:sz w:val="20"/>
+      </w:rPr>
+    </w:lvl>
+    <w:lvl w:ilvl="8" w:tentative="1">
+      <w:start w:val="1"/>
+      <w:numFmt w:val="bullet"/>
+      <w:lvlText w:val=""/>
+      <w:lvlJc w:val="left"/>
+      <w:pPr>
+        <w:tabs>
+          <w:tab w:val="num" w:pos="6480"/>
+        </w:tabs>
+        <w:ind w:left="6480" w:hanging="360"/>
+      </w:pPr>
+      <w:rPr>
+        <w:rFonts w:ascii="Wingdings" w:hAnsi="Wingdings" w:hint="default"/>
+        <w:sz w:val="20"/>
+      </w:rPr>
+    </w:lvl>
+  </w:abstractNum>
+  <w:abstractNum w:abstractNumId="6" w15:restartNumberingAfterBreak="0">
     <w:nsid w:val="177E7070"/>
     <w:multiLevelType w:val="multilevel"/>
     <w:tmpl w:val="A20E9B04"/>
@@ -18238,7 +18008,7 @@
       </w:rPr>
     </w:lvl>
   </w:abstractNum>
-  <w:abstractNum w:abstractNumId="6" w15:restartNumberingAfterBreak="0">
+  <w:abstractNum w:abstractNumId="7" w15:restartNumberingAfterBreak="0">
     <w:nsid w:val="18A06887"/>
     <w:multiLevelType w:val="multilevel"/>
     <w:tmpl w:val="AAF041EE"/>
@@ -18387,7 +18157,7 @@
       </w:rPr>
     </w:lvl>
   </w:abstractNum>
-  <w:abstractNum w:abstractNumId="7" w15:restartNumberingAfterBreak="0">
+  <w:abstractNum w:abstractNumId="8" w15:restartNumberingAfterBreak="0">
     <w:nsid w:val="19940969"/>
     <w:multiLevelType w:val="multilevel"/>
     <w:tmpl w:val="5C56A798"/>
@@ -18536,7 +18306,7 @@
       </w:rPr>
     </w:lvl>
   </w:abstractNum>
-  <w:abstractNum w:abstractNumId="8" w15:restartNumberingAfterBreak="0">
+  <w:abstractNum w:abstractNumId="9" w15:restartNumberingAfterBreak="0">
     <w:nsid w:val="1ABF407B"/>
     <w:multiLevelType w:val="multilevel"/>
     <w:tmpl w:val="D1CCFD6A"/>
@@ -18685,7 +18455,7 @@
       </w:rPr>
     </w:lvl>
   </w:abstractNum>
-  <w:abstractNum w:abstractNumId="9" w15:restartNumberingAfterBreak="0">
+  <w:abstractNum w:abstractNumId="10" w15:restartNumberingAfterBreak="0">
     <w:nsid w:val="1BBF2AD0"/>
     <w:multiLevelType w:val="multilevel"/>
     <w:tmpl w:val="5F04A5B4"/>
@@ -18834,7 +18604,7 @@
       </w:rPr>
     </w:lvl>
   </w:abstractNum>
-  <w:abstractNum w:abstractNumId="10" w15:restartNumberingAfterBreak="0">
+  <w:abstractNum w:abstractNumId="11" w15:restartNumberingAfterBreak="0">
     <w:nsid w:val="1C0225A9"/>
     <w:multiLevelType w:val="multilevel"/>
     <w:tmpl w:val="CE005DE2"/>
@@ -18947,7 +18717,7 @@
       </w:rPr>
     </w:lvl>
   </w:abstractNum>
-  <w:abstractNum w:abstractNumId="11" w15:restartNumberingAfterBreak="0">
+  <w:abstractNum w:abstractNumId="12" w15:restartNumberingAfterBreak="0">
     <w:nsid w:val="23F94538"/>
     <w:multiLevelType w:val="multilevel"/>
     <w:tmpl w:val="5704A9BC"/>
@@ -19096,7 +18866,7 @@
       </w:rPr>
     </w:lvl>
   </w:abstractNum>
-  <w:abstractNum w:abstractNumId="12" w15:restartNumberingAfterBreak="0">
+  <w:abstractNum w:abstractNumId="13" w15:restartNumberingAfterBreak="0">
     <w:nsid w:val="28FF6AA6"/>
     <w:multiLevelType w:val="multilevel"/>
     <w:tmpl w:val="757A3578"/>
@@ -19245,7 +19015,7 @@
       </w:rPr>
     </w:lvl>
   </w:abstractNum>
-  <w:abstractNum w:abstractNumId="13" w15:restartNumberingAfterBreak="0">
+  <w:abstractNum w:abstractNumId="14" w15:restartNumberingAfterBreak="0">
     <w:nsid w:val="2E650984"/>
     <w:multiLevelType w:val="multilevel"/>
     <w:tmpl w:val="9852F45A"/>
@@ -19394,7 +19164,156 @@
       </w:rPr>
     </w:lvl>
   </w:abstractNum>
-  <w:abstractNum w:abstractNumId="14" w15:restartNumberingAfterBreak="0">
+  <w:abstractNum w:abstractNumId="15" w15:restartNumberingAfterBreak="0">
+    <w:nsid w:val="2EAE1340"/>
+    <w:multiLevelType w:val="multilevel"/>
+    <w:tmpl w:val="82FEC7D8"/>
+    <w:lvl w:ilvl="0">
+      <w:start w:val="1"/>
+      <w:numFmt w:val="bullet"/>
+      <w:lvlText w:val=""/>
+      <w:lvlJc w:val="left"/>
+      <w:pPr>
+        <w:tabs>
+          <w:tab w:val="num" w:pos="720"/>
+        </w:tabs>
+        <w:ind w:left="720" w:hanging="360"/>
+      </w:pPr>
+      <w:rPr>
+        <w:rFonts w:ascii="Symbol" w:hAnsi="Symbol" w:hint="default"/>
+        <w:sz w:val="20"/>
+      </w:rPr>
+    </w:lvl>
+    <w:lvl w:ilvl="1" w:tentative="1">
+      <w:start w:val="1"/>
+      <w:numFmt w:val="bullet"/>
+      <w:lvlText w:val="o"/>
+      <w:lvlJc w:val="left"/>
+      <w:pPr>
+        <w:tabs>
+          <w:tab w:val="num" w:pos="1440"/>
+        </w:tabs>
+        <w:ind w:left="1440" w:hanging="360"/>
+      </w:pPr>
+      <w:rPr>
+        <w:rFonts w:ascii="Courier New" w:hAnsi="Courier New" w:hint="default"/>
+        <w:sz w:val="20"/>
+      </w:rPr>
+    </w:lvl>
+    <w:lvl w:ilvl="2" w:tentative="1">
+      <w:start w:val="1"/>
+      <w:numFmt w:val="bullet"/>
+      <w:lvlText w:val=""/>
+      <w:lvlJc w:val="left"/>
+      <w:pPr>
+        <w:tabs>
+          <w:tab w:val="num" w:pos="2160"/>
+        </w:tabs>
+        <w:ind w:left="2160" w:hanging="360"/>
+      </w:pPr>
+      <w:rPr>
+        <w:rFonts w:ascii="Wingdings" w:hAnsi="Wingdings" w:hint="default"/>
+        <w:sz w:val="20"/>
+      </w:rPr>
+    </w:lvl>
+    <w:lvl w:ilvl="3" w:tentative="1">
+      <w:start w:val="1"/>
+      <w:numFmt w:val="bullet"/>
+      <w:lvlText w:val=""/>
+      <w:lvlJc w:val="left"/>
+      <w:pPr>
+        <w:tabs>
+          <w:tab w:val="num" w:pos="2880"/>
+        </w:tabs>
+        <w:ind w:left="2880" w:hanging="360"/>
+      </w:pPr>
+      <w:rPr>
+        <w:rFonts w:ascii="Wingdings" w:hAnsi="Wingdings" w:hint="default"/>
+        <w:sz w:val="20"/>
+      </w:rPr>
+    </w:lvl>
+    <w:lvl w:ilvl="4" w:tentative="1">
+      <w:start w:val="1"/>
+      <w:numFmt w:val="bullet"/>
+      <w:lvlText w:val=""/>
+      <w:lvlJc w:val="left"/>
+      <w:pPr>
+        <w:tabs>
+          <w:tab w:val="num" w:pos="3600"/>
+        </w:tabs>
+        <w:ind w:left="3600" w:hanging="360"/>
+      </w:pPr>
+      <w:rPr>
+        <w:rFonts w:ascii="Wingdings" w:hAnsi="Wingdings" w:hint="default"/>
+        <w:sz w:val="20"/>
+      </w:rPr>
+    </w:lvl>
+    <w:lvl w:ilvl="5" w:tentative="1">
+      <w:start w:val="1"/>
+      <w:numFmt w:val="bullet"/>
+      <w:lvlText w:val=""/>
+      <w:lvlJc w:val="left"/>
+      <w:pPr>
+        <w:tabs>
+          <w:tab w:val="num" w:pos="4320"/>
+        </w:tabs>
+        <w:ind w:left="4320" w:hanging="360"/>
+      </w:pPr>
+      <w:rPr>
+        <w:rFonts w:ascii="Wingdings" w:hAnsi="Wingdings" w:hint="default"/>
+        <w:sz w:val="20"/>
+      </w:rPr>
+    </w:lvl>
+    <w:lvl w:ilvl="6" w:tentative="1">
+      <w:start w:val="1"/>
+      <w:numFmt w:val="bullet"/>
+      <w:lvlText w:val=""/>
+      <w:lvlJc w:val="left"/>
+      <w:pPr>
+        <w:tabs>
+          <w:tab w:val="num" w:pos="5040"/>
+        </w:tabs>
+        <w:ind w:left="5040" w:hanging="360"/>
+      </w:pPr>
+      <w:rPr>
+        <w:rFonts w:ascii="Wingdings" w:hAnsi="Wingdings" w:hint="default"/>
+        <w:sz w:val="20"/>
+      </w:rPr>
+    </w:lvl>
+    <w:lvl w:ilvl="7" w:tentative="1">
+      <w:start w:val="1"/>
+      <w:numFmt w:val="bullet"/>
+      <w:lvlText w:val=""/>
+      <w:lvlJc w:val="left"/>
+      <w:pPr>
+        <w:tabs>
+          <w:tab w:val="num" w:pos="5760"/>
+        </w:tabs>
+        <w:ind w:left="5760" w:hanging="360"/>
+      </w:pPr>
+      <w:rPr>
+        <w:rFonts w:ascii="Wingdings" w:hAnsi="Wingdings" w:hint="default"/>
+        <w:sz w:val="20"/>
+      </w:rPr>
+    </w:lvl>
+    <w:lvl w:ilvl="8" w:tentative="1">
+      <w:start w:val="1"/>
+      <w:numFmt w:val="bullet"/>
+      <w:lvlText w:val=""/>
+      <w:lvlJc w:val="left"/>
+      <w:pPr>
+        <w:tabs>
+          <w:tab w:val="num" w:pos="6480"/>
+        </w:tabs>
+        <w:ind w:left="6480" w:hanging="360"/>
+      </w:pPr>
+      <w:rPr>
+        <w:rFonts w:ascii="Wingdings" w:hAnsi="Wingdings" w:hint="default"/>
+        <w:sz w:val="20"/>
+      </w:rPr>
+    </w:lvl>
+  </w:abstractNum>
+  <w:abstractNum w:abstractNumId="16" w15:restartNumberingAfterBreak="0">
     <w:nsid w:val="2F3959DA"/>
     <w:multiLevelType w:val="multilevel"/>
     <w:tmpl w:val="7F763EBE"/>
@@ -19507,7 +19426,7 @@
       </w:rPr>
     </w:lvl>
   </w:abstractNum>
-  <w:abstractNum w:abstractNumId="15" w15:restartNumberingAfterBreak="0">
+  <w:abstractNum w:abstractNumId="17" w15:restartNumberingAfterBreak="0">
     <w:nsid w:val="331E5249"/>
     <w:multiLevelType w:val="multilevel"/>
     <w:tmpl w:val="1CD2FF92"/>
@@ -19656,7 +19575,7 @@
       </w:rPr>
     </w:lvl>
   </w:abstractNum>
-  <w:abstractNum w:abstractNumId="16" w15:restartNumberingAfterBreak="0">
+  <w:abstractNum w:abstractNumId="18" w15:restartNumberingAfterBreak="0">
     <w:nsid w:val="36D01313"/>
     <w:multiLevelType w:val="hybridMultilevel"/>
     <w:tmpl w:val="CE5A0B2E"/>
@@ -19769,7 +19688,7 @@
       </w:rPr>
     </w:lvl>
   </w:abstractNum>
-  <w:abstractNum w:abstractNumId="17" w15:restartNumberingAfterBreak="0">
+  <w:abstractNum w:abstractNumId="19" w15:restartNumberingAfterBreak="0">
     <w:nsid w:val="37CC4FED"/>
     <w:multiLevelType w:val="multilevel"/>
     <w:tmpl w:val="03564108"/>
@@ -19918,7 +19837,7 @@
       </w:rPr>
     </w:lvl>
   </w:abstractNum>
-  <w:abstractNum w:abstractNumId="18" w15:restartNumberingAfterBreak="0">
+  <w:abstractNum w:abstractNumId="20" w15:restartNumberingAfterBreak="0">
     <w:nsid w:val="38461259"/>
     <w:multiLevelType w:val="multilevel"/>
     <w:tmpl w:val="44C49464"/>
@@ -20067,7 +19986,7 @@
       </w:rPr>
     </w:lvl>
   </w:abstractNum>
-  <w:abstractNum w:abstractNumId="19" w15:restartNumberingAfterBreak="0">
+  <w:abstractNum w:abstractNumId="21" w15:restartNumberingAfterBreak="0">
     <w:nsid w:val="3900049D"/>
     <w:multiLevelType w:val="multilevel"/>
     <w:tmpl w:val="6040FFB0"/>
@@ -20216,7 +20135,7 @@
       </w:rPr>
     </w:lvl>
   </w:abstractNum>
-  <w:abstractNum w:abstractNumId="20" w15:restartNumberingAfterBreak="0">
+  <w:abstractNum w:abstractNumId="22" w15:restartNumberingAfterBreak="0">
     <w:nsid w:val="3B5F5BA5"/>
     <w:multiLevelType w:val="multilevel"/>
     <w:tmpl w:val="454258F4"/>
@@ -20365,7 +20284,7 @@
       </w:rPr>
     </w:lvl>
   </w:abstractNum>
-  <w:abstractNum w:abstractNumId="21" w15:restartNumberingAfterBreak="0">
+  <w:abstractNum w:abstractNumId="23" w15:restartNumberingAfterBreak="0">
     <w:nsid w:val="45C609A8"/>
     <w:multiLevelType w:val="multilevel"/>
     <w:tmpl w:val="2070C920"/>
@@ -20514,7 +20433,7 @@
       </w:rPr>
     </w:lvl>
   </w:abstractNum>
-  <w:abstractNum w:abstractNumId="22" w15:restartNumberingAfterBreak="0">
+  <w:abstractNum w:abstractNumId="24" w15:restartNumberingAfterBreak="0">
     <w:nsid w:val="46FB3BD0"/>
     <w:multiLevelType w:val="multilevel"/>
     <w:tmpl w:val="A5649DD6"/>
@@ -20627,7 +20546,7 @@
       </w:rPr>
     </w:lvl>
   </w:abstractNum>
-  <w:abstractNum w:abstractNumId="23" w15:restartNumberingAfterBreak="0">
+  <w:abstractNum w:abstractNumId="25" w15:restartNumberingAfterBreak="0">
     <w:nsid w:val="49580B9B"/>
     <w:multiLevelType w:val="multilevel"/>
     <w:tmpl w:val="F83A719A"/>
@@ -20776,7 +20695,7 @@
       </w:rPr>
     </w:lvl>
   </w:abstractNum>
-  <w:abstractNum w:abstractNumId="24" w15:restartNumberingAfterBreak="0">
+  <w:abstractNum w:abstractNumId="26" w15:restartNumberingAfterBreak="0">
     <w:nsid w:val="4A322A78"/>
     <w:multiLevelType w:val="multilevel"/>
     <w:tmpl w:val="118A5114"/>
@@ -20925,7 +20844,7 @@
       </w:rPr>
     </w:lvl>
   </w:abstractNum>
-  <w:abstractNum w:abstractNumId="25" w15:restartNumberingAfterBreak="0">
+  <w:abstractNum w:abstractNumId="27" w15:restartNumberingAfterBreak="0">
     <w:nsid w:val="4D712D9C"/>
     <w:multiLevelType w:val="multilevel"/>
     <w:tmpl w:val="01D45F4C"/>
@@ -21074,7 +20993,7 @@
       </w:rPr>
     </w:lvl>
   </w:abstractNum>
-  <w:abstractNum w:abstractNumId="26" w15:restartNumberingAfterBreak="0">
+  <w:abstractNum w:abstractNumId="28" w15:restartNumberingAfterBreak="0">
     <w:nsid w:val="4FF37310"/>
     <w:multiLevelType w:val="multilevel"/>
     <w:tmpl w:val="F208A64E"/>
@@ -21187,7 +21106,7 @@
       </w:rPr>
     </w:lvl>
   </w:abstractNum>
-  <w:abstractNum w:abstractNumId="27" w15:restartNumberingAfterBreak="0">
+  <w:abstractNum w:abstractNumId="29" w15:restartNumberingAfterBreak="0">
     <w:nsid w:val="55295D97"/>
     <w:multiLevelType w:val="multilevel"/>
     <w:tmpl w:val="80A81218"/>
@@ -21336,7 +21255,7 @@
       </w:rPr>
     </w:lvl>
   </w:abstractNum>
-  <w:abstractNum w:abstractNumId="28" w15:restartNumberingAfterBreak="0">
+  <w:abstractNum w:abstractNumId="30" w15:restartNumberingAfterBreak="0">
     <w:nsid w:val="5B366192"/>
     <w:multiLevelType w:val="multilevel"/>
     <w:tmpl w:val="CFE054B8"/>
@@ -21485,7 +21404,7 @@
       </w:rPr>
     </w:lvl>
   </w:abstractNum>
-  <w:abstractNum w:abstractNumId="29" w15:restartNumberingAfterBreak="0">
+  <w:abstractNum w:abstractNumId="31" w15:restartNumberingAfterBreak="0">
     <w:nsid w:val="5C822EDC"/>
     <w:multiLevelType w:val="multilevel"/>
     <w:tmpl w:val="C6D2F3C0"/>
@@ -21634,7 +21553,7 @@
       </w:rPr>
     </w:lvl>
   </w:abstractNum>
-  <w:abstractNum w:abstractNumId="30" w15:restartNumberingAfterBreak="0">
+  <w:abstractNum w:abstractNumId="32" w15:restartNumberingAfterBreak="0">
     <w:nsid w:val="5F005D06"/>
     <w:multiLevelType w:val="multilevel"/>
     <w:tmpl w:val="F6DE4282"/>
@@ -21783,7 +21702,7 @@
       </w:rPr>
     </w:lvl>
   </w:abstractNum>
-  <w:abstractNum w:abstractNumId="31" w15:restartNumberingAfterBreak="0">
+  <w:abstractNum w:abstractNumId="33" w15:restartNumberingAfterBreak="0">
     <w:nsid w:val="6EC24C37"/>
     <w:multiLevelType w:val="multilevel"/>
     <w:tmpl w:val="5A20006C"/>
@@ -21932,7 +21851,7 @@
       </w:rPr>
     </w:lvl>
   </w:abstractNum>
-  <w:abstractNum w:abstractNumId="32" w15:restartNumberingAfterBreak="0">
+  <w:abstractNum w:abstractNumId="34" w15:restartNumberingAfterBreak="0">
     <w:nsid w:val="6F3E62BC"/>
     <w:multiLevelType w:val="multilevel"/>
     <w:tmpl w:val="358A4AA2"/>
@@ -22081,7 +22000,7 @@
       </w:rPr>
     </w:lvl>
   </w:abstractNum>
-  <w:abstractNum w:abstractNumId="33" w15:restartNumberingAfterBreak="0">
+  <w:abstractNum w:abstractNumId="35" w15:restartNumberingAfterBreak="0">
     <w:nsid w:val="6F6A0DD9"/>
     <w:multiLevelType w:val="multilevel"/>
     <w:tmpl w:val="CB565890"/>
@@ -22230,7 +22149,7 @@
       </w:rPr>
     </w:lvl>
   </w:abstractNum>
-  <w:abstractNum w:abstractNumId="34" w15:restartNumberingAfterBreak="0">
+  <w:abstractNum w:abstractNumId="36" w15:restartNumberingAfterBreak="0">
     <w:nsid w:val="70E71137"/>
     <w:multiLevelType w:val="multilevel"/>
     <w:tmpl w:val="31B41FEE"/>
@@ -22379,7 +22298,7 @@
       </w:rPr>
     </w:lvl>
   </w:abstractNum>
-  <w:abstractNum w:abstractNumId="35" w15:restartNumberingAfterBreak="0">
+  <w:abstractNum w:abstractNumId="37" w15:restartNumberingAfterBreak="0">
     <w:nsid w:val="742B5FCA"/>
     <w:multiLevelType w:val="multilevel"/>
     <w:tmpl w:val="21B481F8"/>
@@ -22492,7 +22411,7 @@
       </w:rPr>
     </w:lvl>
   </w:abstractNum>
-  <w:abstractNum w:abstractNumId="36" w15:restartNumberingAfterBreak="0">
+  <w:abstractNum w:abstractNumId="38" w15:restartNumberingAfterBreak="0">
     <w:nsid w:val="7C6F7CC5"/>
     <w:multiLevelType w:val="multilevel"/>
     <w:tmpl w:val="CE005DE2"/>
@@ -22606,115 +22525,121 @@
     </w:lvl>
   </w:abstractNum>
   <w:num w:numId="1" w16cid:durableId="708187252">
-    <w:abstractNumId w:val="22"/>
+    <w:abstractNumId w:val="24"/>
   </w:num>
   <w:num w:numId="2" w16cid:durableId="751395005">
-    <w:abstractNumId w:val="36"/>
+    <w:abstractNumId w:val="38"/>
   </w:num>
   <w:num w:numId="3" w16cid:durableId="1595744309">
     <w:abstractNumId w:val="1"/>
   </w:num>
   <w:num w:numId="4" w16cid:durableId="338896747">
-    <w:abstractNumId w:val="26"/>
+    <w:abstractNumId w:val="28"/>
   </w:num>
   <w:num w:numId="5" w16cid:durableId="919095222">
+    <w:abstractNumId w:val="16"/>
+  </w:num>
+  <w:num w:numId="6" w16cid:durableId="642200221">
+    <w:abstractNumId w:val="37"/>
+  </w:num>
+  <w:num w:numId="7" w16cid:durableId="1797945736">
+    <w:abstractNumId w:val="6"/>
+  </w:num>
+  <w:num w:numId="8" w16cid:durableId="2008702793">
+    <w:abstractNumId w:val="18"/>
+  </w:num>
+  <w:num w:numId="9" w16cid:durableId="45224886">
+    <w:abstractNumId w:val="12"/>
+  </w:num>
+  <w:num w:numId="10" w16cid:durableId="1356417229">
+    <w:abstractNumId w:val="31"/>
+  </w:num>
+  <w:num w:numId="11" w16cid:durableId="1999385110">
+    <w:abstractNumId w:val="8"/>
+  </w:num>
+  <w:num w:numId="12" w16cid:durableId="2062515377">
+    <w:abstractNumId w:val="32"/>
+  </w:num>
+  <w:num w:numId="13" w16cid:durableId="1982074494">
+    <w:abstractNumId w:val="35"/>
+  </w:num>
+  <w:num w:numId="14" w16cid:durableId="1191576409">
+    <w:abstractNumId w:val="13"/>
+  </w:num>
+  <w:num w:numId="15" w16cid:durableId="1403484038">
+    <w:abstractNumId w:val="7"/>
+  </w:num>
+  <w:num w:numId="16" w16cid:durableId="1735203905">
     <w:abstractNumId w:val="14"/>
   </w:num>
-  <w:num w:numId="6" w16cid:durableId="642200221">
-    <w:abstractNumId w:val="35"/>
-  </w:num>
-  <w:num w:numId="7" w16cid:durableId="1797945736">
-    <w:abstractNumId w:val="5"/>
-  </w:num>
-  <w:num w:numId="8" w16cid:durableId="2008702793">
-    <w:abstractNumId w:val="16"/>
-  </w:num>
-  <w:num w:numId="9" w16cid:durableId="45224886">
-    <w:abstractNumId w:val="11"/>
-  </w:num>
-  <w:num w:numId="10" w16cid:durableId="1356417229">
-    <w:abstractNumId w:val="29"/>
-  </w:num>
-  <w:num w:numId="11" w16cid:durableId="1999385110">
-    <w:abstractNumId w:val="7"/>
-  </w:num>
-  <w:num w:numId="12" w16cid:durableId="2062515377">
-    <w:abstractNumId w:val="30"/>
-  </w:num>
-  <w:num w:numId="13" w16cid:durableId="1982074494">
-    <w:abstractNumId w:val="33"/>
-  </w:num>
-  <w:num w:numId="14" w16cid:durableId="1191576409">
-    <w:abstractNumId w:val="12"/>
-  </w:num>
-  <w:num w:numId="15" w16cid:durableId="1403484038">
-    <w:abstractNumId w:val="6"/>
-  </w:num>
-  <w:num w:numId="16" w16cid:durableId="1735203905">
-    <w:abstractNumId w:val="13"/>
-  </w:num>
   <w:num w:numId="17" w16cid:durableId="182063153">
-    <w:abstractNumId w:val="15"/>
+    <w:abstractNumId w:val="17"/>
   </w:num>
   <w:num w:numId="18" w16cid:durableId="653531394">
-    <w:abstractNumId w:val="25"/>
+    <w:abstractNumId w:val="27"/>
   </w:num>
   <w:num w:numId="19" w16cid:durableId="776289528">
-    <w:abstractNumId w:val="8"/>
+    <w:abstractNumId w:val="9"/>
   </w:num>
   <w:num w:numId="20" w16cid:durableId="503279914">
     <w:abstractNumId w:val="0"/>
   </w:num>
   <w:num w:numId="21" w16cid:durableId="377559009">
-    <w:abstractNumId w:val="18"/>
+    <w:abstractNumId w:val="20"/>
   </w:num>
   <w:num w:numId="22" w16cid:durableId="600916764">
-    <w:abstractNumId w:val="34"/>
+    <w:abstractNumId w:val="36"/>
   </w:num>
   <w:num w:numId="23" w16cid:durableId="1138645823">
-    <w:abstractNumId w:val="19"/>
+    <w:abstractNumId w:val="21"/>
   </w:num>
   <w:num w:numId="24" w16cid:durableId="803428561">
-    <w:abstractNumId w:val="27"/>
+    <w:abstractNumId w:val="29"/>
   </w:num>
   <w:num w:numId="25" w16cid:durableId="180122388">
     <w:abstractNumId w:val="2"/>
   </w:num>
   <w:num w:numId="26" w16cid:durableId="162359538">
-    <w:abstractNumId w:val="10"/>
+    <w:abstractNumId w:val="11"/>
   </w:num>
   <w:num w:numId="27" w16cid:durableId="44329650">
-    <w:abstractNumId w:val="24"/>
+    <w:abstractNumId w:val="26"/>
   </w:num>
   <w:num w:numId="28" w16cid:durableId="1479688154">
     <w:abstractNumId w:val="4"/>
   </w:num>
   <w:num w:numId="29" w16cid:durableId="1109395423">
-    <w:abstractNumId w:val="28"/>
+    <w:abstractNumId w:val="30"/>
   </w:num>
   <w:num w:numId="30" w16cid:durableId="1081483016">
-    <w:abstractNumId w:val="9"/>
+    <w:abstractNumId w:val="10"/>
   </w:num>
   <w:num w:numId="31" w16cid:durableId="985665702">
-    <w:abstractNumId w:val="31"/>
+    <w:abstractNumId w:val="33"/>
   </w:num>
   <w:num w:numId="32" w16cid:durableId="1208639771">
-    <w:abstractNumId w:val="32"/>
+    <w:abstractNumId w:val="34"/>
   </w:num>
   <w:num w:numId="33" w16cid:durableId="252977401">
     <w:abstractNumId w:val="3"/>
   </w:num>
   <w:num w:numId="34" w16cid:durableId="696740899">
-    <w:abstractNumId w:val="17"/>
+    <w:abstractNumId w:val="19"/>
   </w:num>
   <w:num w:numId="35" w16cid:durableId="13044894">
-    <w:abstractNumId w:val="20"/>
+    <w:abstractNumId w:val="22"/>
   </w:num>
   <w:num w:numId="36" w16cid:durableId="739331562">
-    <w:abstractNumId w:val="21"/>
+    <w:abstractNumId w:val="23"/>
   </w:num>
   <w:num w:numId="37" w16cid:durableId="1508405908">
-    <w:abstractNumId w:val="23"/>
+    <w:abstractNumId w:val="25"/>
+  </w:num>
+  <w:num w:numId="38" w16cid:durableId="862671566">
+    <w:abstractNumId w:val="15"/>
+  </w:num>
+  <w:num w:numId="39" w16cid:durableId="762460012">
+    <w:abstractNumId w:val="5"/>
   </w:num>
 </w:numbering>
 </file>
@@ -23233,7 +23158,6 @@
   <w:style w:type="character" w:default="1" w:styleId="Policepardfaut">
     <w:name w:val="Default Paragraph Font"/>
     <w:uiPriority w:val="1"/>
-    <w:semiHidden/>
     <w:unhideWhenUsed/>
   </w:style>
   <w:style w:type="table" w:default="1" w:styleId="TableauNormal">
@@ -23716,4 +23640,16 @@
   </a:objectDefaults>
   <a:extraClrSchemeLst/>
 </a:theme>
+</file>
+
+<file path=customXml/item1.xml><?xml version="1.0" encoding="utf-8"?>
+<b:Sources xmlns:b="http://schemas.openxmlformats.org/officeDocument/2006/bibliography" xmlns="http://schemas.openxmlformats.org/officeDocument/2006/bibliography" SelectedStyle="\APASixthEditionOfficeOnline.xsl" StyleName="APA" Version="6"/>
+</file>
+
+<file path=customXml/itemProps1.xml><?xml version="1.0" encoding="utf-8"?>
+<ds:datastoreItem xmlns:ds="http://schemas.openxmlformats.org/officeDocument/2006/customXml" ds:itemID="{C14FFD12-19E9-4B4F-AEA6-D1D8ECFA7609}">
+  <ds:schemaRefs>
+    <ds:schemaRef ds:uri="http://schemas.openxmlformats.org/officeDocument/2006/bibliography"/>
+  </ds:schemaRefs>
+</ds:datastoreItem>
 </file>
</xml_diff>

<commit_message>
refactor: improve API error handling
</commit_message>
<xml_diff>
--- a/docs/Template+–+Justification+des+choix+technique.docx
+++ b/docs/Template+–+Justification+des+choix+technique.docx
@@ -780,29 +780,7 @@
           <w:sz w:val="22"/>
           <w:szCs w:val="22"/>
         </w:rPr>
-        <w:t xml:space="preserve">Le projet MDD (Monde de </w:t>
-      </w:r>
-      <w:proofErr w:type="spellStart"/>
-      <w:r>
-        <w:rPr>
-          <w:i/>
-          <w:iCs/>
-          <w:color w:val="666666"/>
-          <w:sz w:val="22"/>
-          <w:szCs w:val="22"/>
-        </w:rPr>
-        <w:t>Dév</w:t>
-      </w:r>
-      <w:proofErr w:type="spellEnd"/>
-      <w:r>
-        <w:rPr>
-          <w:i/>
-          <w:iCs/>
-          <w:color w:val="666666"/>
-          <w:sz w:val="22"/>
-          <w:szCs w:val="22"/>
-        </w:rPr>
-        <w:t>) consiste à développer un réseau social interne destiné aux développeurs de l’entreprise ORION.</w:t>
+        <w:t>Le projet MDD (Monde de Dév) consiste à développer un réseau social interne destiné aux développeurs de l’entreprise ORION.</w:t>
       </w:r>
     </w:p>
     <w:p>
@@ -1381,25 +1359,7 @@
                 <w:iCs/>
                 <w:color w:val="666666"/>
               </w:rPr>
-              <w:t xml:space="preserve">Consultation et modification email / </w:t>
-            </w:r>
-            <w:proofErr w:type="spellStart"/>
-            <w:r>
-              <w:rPr>
-                <w:i/>
-                <w:iCs/>
-                <w:color w:val="666666"/>
-              </w:rPr>
-              <w:t>username</w:t>
-            </w:r>
-            <w:proofErr w:type="spellEnd"/>
-            <w:r>
-              <w:rPr>
-                <w:i/>
-                <w:iCs/>
-                <w:color w:val="666666"/>
-              </w:rPr>
-              <w:t xml:space="preserve"> / mot de passe</w:t>
+              <w:t>Consultation et modification email / username / mot de passe</w:t>
             </w:r>
           </w:p>
         </w:tc>
@@ -1951,27 +1911,7 @@
                       <w:color w:val="666666"/>
                       <w:lang w:val="fr-FR"/>
                     </w:rPr>
-                    <w:t xml:space="preserve">Suppression du </w:t>
-                  </w:r>
-                  <w:proofErr w:type="spellStart"/>
-                  <w:r>
-                    <w:rPr>
-                      <w:i/>
-                      <w:iCs/>
-                      <w:color w:val="666666"/>
-                      <w:lang w:val="fr-FR"/>
-                    </w:rPr>
-                    <w:t>token</w:t>
-                  </w:r>
-                  <w:proofErr w:type="spellEnd"/>
-                  <w:r>
-                    <w:rPr>
-                      <w:i/>
-                      <w:iCs/>
-                      <w:color w:val="666666"/>
-                      <w:lang w:val="fr-FR"/>
-                    </w:rPr>
-                    <w:t xml:space="preserve"> et retour page login</w:t>
+                    <w:t>Suppression du token et retour page login</w:t>
                   </w:r>
                 </w:p>
               </w:tc>
@@ -2146,7 +2086,6 @@
           <w:lang w:val="fr-FR"/>
         </w:rPr>
       </w:pPr>
-      <w:proofErr w:type="spellStart"/>
       <w:r>
         <w:rPr>
           <w:i/>
@@ -2154,37 +2093,7 @@
           <w:color w:val="666666"/>
           <w:lang w:val="fr-FR"/>
         </w:rPr>
-        <w:t>Front-end</w:t>
-      </w:r>
-      <w:proofErr w:type="spellEnd"/>
-      <w:r>
-        <w:rPr>
-          <w:i/>
-          <w:iCs/>
-          <w:color w:val="666666"/>
-          <w:lang w:val="fr-FR"/>
-        </w:rPr>
-        <w:t xml:space="preserve"> </w:t>
-      </w:r>
-      <w:proofErr w:type="spellStart"/>
-      <w:r>
-        <w:rPr>
-          <w:i/>
-          <w:iCs/>
-          <w:color w:val="666666"/>
-          <w:lang w:val="fr-FR"/>
-        </w:rPr>
-        <w:t>Angular</w:t>
-      </w:r>
-      <w:proofErr w:type="spellEnd"/>
-      <w:r>
-        <w:rPr>
-          <w:i/>
-          <w:iCs/>
-          <w:color w:val="666666"/>
-          <w:lang w:val="fr-FR"/>
-        </w:rPr>
-        <w:t xml:space="preserve"> (SPA) : application cliente responsable de l’affichage, de la navigation et des interactions utilisateur.</w:t>
+        <w:t>Front-end Angular (SPA) : application cliente responsable de l’affichage, de la navigation et des interactions utilisateur.</w:t>
       </w:r>
     </w:p>
     <w:p>
@@ -2208,27 +2117,7 @@
           <w:color w:val="666666"/>
           <w:lang w:val="fr-FR"/>
         </w:rPr>
-        <w:t xml:space="preserve">API REST Spring Boot : couche serveur exposant des </w:t>
-      </w:r>
-      <w:proofErr w:type="spellStart"/>
-      <w:r>
-        <w:rPr>
-          <w:i/>
-          <w:iCs/>
-          <w:color w:val="666666"/>
-          <w:lang w:val="fr-FR"/>
-        </w:rPr>
-        <w:t>endpoints</w:t>
-      </w:r>
-      <w:proofErr w:type="spellEnd"/>
-      <w:r>
-        <w:rPr>
-          <w:i/>
-          <w:iCs/>
-          <w:color w:val="666666"/>
-          <w:lang w:val="fr-FR"/>
-        </w:rPr>
-        <w:t xml:space="preserve"> sécurisés permettant l’accès aux données et aux fonctionnalités métier.</w:t>
+        <w:t>API REST Spring Boot : couche serveur exposant des endpoints sécurisés permettant l’accès aux données et aux fonctionnalités métier.</w:t>
       </w:r>
     </w:p>
     <w:p>
@@ -2252,27 +2141,7 @@
           <w:color w:val="666666"/>
           <w:lang w:val="fr-FR"/>
         </w:rPr>
-        <w:t xml:space="preserve">JWT : mécanisme d’authentification utilisé pour sécuriser les échanges entre le </w:t>
-      </w:r>
-      <w:proofErr w:type="spellStart"/>
-      <w:r>
-        <w:rPr>
-          <w:i/>
-          <w:iCs/>
-          <w:color w:val="666666"/>
-          <w:lang w:val="fr-FR"/>
-        </w:rPr>
-        <w:t>front-end</w:t>
-      </w:r>
-      <w:proofErr w:type="spellEnd"/>
-      <w:r>
-        <w:rPr>
-          <w:i/>
-          <w:iCs/>
-          <w:color w:val="666666"/>
-          <w:lang w:val="fr-FR"/>
-        </w:rPr>
-        <w:t xml:space="preserve"> et l’API.</w:t>
+        <w:t>JWT : mécanisme d’authentification utilisé pour sécuriser les échanges entre le front-end et l’API.</w:t>
       </w:r>
     </w:p>
     <w:p>
@@ -2351,47 +2220,7 @@
           <w:color w:val="666666"/>
           <w:lang w:val="fr-FR"/>
         </w:rPr>
-        <w:t xml:space="preserve">Organisation du </w:t>
-      </w:r>
-      <w:proofErr w:type="spellStart"/>
-      <w:r>
-        <w:rPr>
-          <w:i/>
-          <w:iCs/>
-          <w:color w:val="666666"/>
-          <w:lang w:val="fr-FR"/>
-        </w:rPr>
-        <w:t>front-end</w:t>
-      </w:r>
-      <w:proofErr w:type="spellEnd"/>
-      <w:r>
-        <w:rPr>
-          <w:i/>
-          <w:iCs/>
-          <w:color w:val="666666"/>
-          <w:lang w:val="fr-FR"/>
-        </w:rPr>
-        <w:t xml:space="preserve"> (</w:t>
-      </w:r>
-      <w:proofErr w:type="spellStart"/>
-      <w:r>
-        <w:rPr>
-          <w:i/>
-          <w:iCs/>
-          <w:color w:val="666666"/>
-          <w:lang w:val="fr-FR"/>
-        </w:rPr>
-        <w:t>Angular</w:t>
-      </w:r>
-      <w:proofErr w:type="spellEnd"/>
-      <w:r>
-        <w:rPr>
-          <w:i/>
-          <w:iCs/>
-          <w:color w:val="666666"/>
-          <w:lang w:val="fr-FR"/>
-        </w:rPr>
-        <w:t>)</w:t>
+        <w:t>Organisation du front-end (Angular)</w:t>
       </w:r>
     </w:p>
     <w:p>
@@ -2414,27 +2243,7 @@
           <w:color w:val="666666"/>
           <w:lang w:val="fr-FR"/>
         </w:rPr>
-        <w:t xml:space="preserve">Architecture basée sur des modules </w:t>
-      </w:r>
-      <w:proofErr w:type="spellStart"/>
-      <w:r>
-        <w:rPr>
-          <w:i/>
-          <w:iCs/>
-          <w:color w:val="666666"/>
-          <w:lang w:val="fr-FR"/>
-        </w:rPr>
-        <w:t>Angular</w:t>
-      </w:r>
-      <w:proofErr w:type="spellEnd"/>
-      <w:r>
-        <w:rPr>
-          <w:i/>
-          <w:iCs/>
-          <w:color w:val="666666"/>
-          <w:lang w:val="fr-FR"/>
-        </w:rPr>
-        <w:t xml:space="preserve"> afin de séparer les responsabilités :</w:t>
+        <w:t>Architecture basée sur des modules Angular afin de séparer les responsabilités :</w:t>
       </w:r>
     </w:p>
     <w:p>
@@ -2585,27 +2394,7 @@
           <w:color w:val="666666"/>
           <w:lang w:val="fr-FR"/>
         </w:rPr>
-        <w:t xml:space="preserve">Utilisation de services </w:t>
-      </w:r>
-      <w:proofErr w:type="spellStart"/>
-      <w:r>
-        <w:rPr>
-          <w:i/>
-          <w:iCs/>
-          <w:color w:val="666666"/>
-          <w:lang w:val="fr-FR"/>
-        </w:rPr>
-        <w:t>Angular</w:t>
-      </w:r>
-      <w:proofErr w:type="spellEnd"/>
-      <w:r>
-        <w:rPr>
-          <w:i/>
-          <w:iCs/>
-          <w:color w:val="666666"/>
-          <w:lang w:val="fr-FR"/>
-        </w:rPr>
-        <w:t xml:space="preserve"> pour centraliser les appels à l’API REST.</w:t>
+        <w:t>Utilisation de services Angular pour centraliser les appels à l’API REST.</w:t>
       </w:r>
     </w:p>
     <w:p>
@@ -2628,47 +2417,7 @@
           <w:color w:val="666666"/>
           <w:lang w:val="fr-FR"/>
         </w:rPr>
-        <w:t>Mise en place d’</w:t>
-      </w:r>
-      <w:proofErr w:type="spellStart"/>
-      <w:r>
-        <w:rPr>
-          <w:i/>
-          <w:iCs/>
-          <w:color w:val="666666"/>
-          <w:lang w:val="fr-FR"/>
-        </w:rPr>
-        <w:t>interceptors</w:t>
-      </w:r>
-      <w:proofErr w:type="spellEnd"/>
-      <w:r>
-        <w:rPr>
-          <w:i/>
-          <w:iCs/>
-          <w:color w:val="666666"/>
-          <w:lang w:val="fr-FR"/>
-        </w:rPr>
-        <w:t xml:space="preserve"> HTTP pour ajouter automatiquement le </w:t>
-      </w:r>
-      <w:proofErr w:type="spellStart"/>
-      <w:r>
-        <w:rPr>
-          <w:i/>
-          <w:iCs/>
-          <w:color w:val="666666"/>
-          <w:lang w:val="fr-FR"/>
-        </w:rPr>
-        <w:t>token</w:t>
-      </w:r>
-      <w:proofErr w:type="spellEnd"/>
-      <w:r>
-        <w:rPr>
-          <w:i/>
-          <w:iCs/>
-          <w:color w:val="666666"/>
-          <w:lang w:val="fr-FR"/>
-        </w:rPr>
-        <w:t xml:space="preserve"> JWT aux requêtes sécurisées.</w:t>
+        <w:t>Mise en place d’interceptors HTTP pour ajouter automatiquement le token JWT aux requêtes sécurisées.</w:t>
       </w:r>
     </w:p>
     <w:p>
@@ -2691,27 +2440,7 @@
           <w:color w:val="666666"/>
           <w:lang w:val="fr-FR"/>
         </w:rPr>
-        <w:t xml:space="preserve">Respect des conventions </w:t>
-      </w:r>
-      <w:proofErr w:type="spellStart"/>
-      <w:r>
-        <w:rPr>
-          <w:i/>
-          <w:iCs/>
-          <w:color w:val="666666"/>
-          <w:lang w:val="fr-FR"/>
-        </w:rPr>
-        <w:t>Angular</w:t>
-      </w:r>
-      <w:proofErr w:type="spellEnd"/>
-      <w:r>
-        <w:rPr>
-          <w:i/>
-          <w:iCs/>
-          <w:color w:val="666666"/>
-          <w:lang w:val="fr-FR"/>
-        </w:rPr>
-        <w:t xml:space="preserve"> :</w:t>
+        <w:t>Respect des conventions Angular :</w:t>
       </w:r>
     </w:p>
     <w:p>
@@ -2827,27 +2556,7 @@
           <w:lang w:val="fr-FR"/>
         </w:rPr>
         <w:lastRenderedPageBreak/>
-        <w:t xml:space="preserve">Organisation du </w:t>
-      </w:r>
-      <w:proofErr w:type="spellStart"/>
-      <w:r>
-        <w:rPr>
-          <w:i/>
-          <w:iCs/>
-          <w:color w:val="666666"/>
-          <w:lang w:val="fr-FR"/>
-        </w:rPr>
-        <w:t>back-end</w:t>
-      </w:r>
-      <w:proofErr w:type="spellEnd"/>
-      <w:r>
-        <w:rPr>
-          <w:i/>
-          <w:iCs/>
-          <w:color w:val="666666"/>
-          <w:lang w:val="fr-FR"/>
-        </w:rPr>
-        <w:t xml:space="preserve"> (Spring Boot)</w:t>
+        <w:t>Organisation du back-end (Spring Boot)</w:t>
       </w:r>
     </w:p>
     <w:p>
@@ -2893,27 +2602,7 @@
           <w:color w:val="666666"/>
           <w:lang w:val="fr-FR"/>
         </w:rPr>
-        <w:t xml:space="preserve">Controller : exposition des </w:t>
-      </w:r>
-      <w:proofErr w:type="spellStart"/>
-      <w:r>
-        <w:rPr>
-          <w:i/>
-          <w:iCs/>
-          <w:color w:val="666666"/>
-          <w:lang w:val="fr-FR"/>
-        </w:rPr>
-        <w:t>endpoints</w:t>
-      </w:r>
-      <w:proofErr w:type="spellEnd"/>
-      <w:r>
-        <w:rPr>
-          <w:i/>
-          <w:iCs/>
-          <w:color w:val="666666"/>
-          <w:lang w:val="fr-FR"/>
-        </w:rPr>
-        <w:t xml:space="preserve"> REST,</w:t>
+        <w:t>Controller : exposition des endpoints REST,</w:t>
       </w:r>
     </w:p>
     <w:p>
@@ -2982,27 +2671,7 @@
           <w:color w:val="666666"/>
           <w:lang w:val="fr-FR"/>
         </w:rPr>
-        <w:t xml:space="preserve">Utilisation de DTO pour séparer les modèles internes des données échangées avec le </w:t>
-      </w:r>
-      <w:proofErr w:type="spellStart"/>
-      <w:r>
-        <w:rPr>
-          <w:i/>
-          <w:iCs/>
-          <w:color w:val="666666"/>
-          <w:lang w:val="fr-FR"/>
-        </w:rPr>
-        <w:t>front-end</w:t>
-      </w:r>
-      <w:proofErr w:type="spellEnd"/>
-      <w:r>
-        <w:rPr>
-          <w:i/>
-          <w:iCs/>
-          <w:color w:val="666666"/>
-          <w:lang w:val="fr-FR"/>
-        </w:rPr>
-        <w:t>.</w:t>
+        <w:t>Utilisation de DTO pour séparer les modèles internes des données échangées avec le front-end.</w:t>
       </w:r>
     </w:p>
     <w:p>
@@ -3048,47 +2717,7 @@
           <w:color w:val="666666"/>
           <w:lang w:val="fr-FR"/>
         </w:rPr>
-        <w:t xml:space="preserve">Gestion des configurations via des fichiers </w:t>
-      </w:r>
-      <w:proofErr w:type="spellStart"/>
-      <w:r>
-        <w:rPr>
-          <w:i/>
-          <w:iCs/>
-          <w:color w:val="666666"/>
-          <w:lang w:val="fr-FR"/>
-        </w:rPr>
-        <w:t>application.yml</w:t>
-      </w:r>
-      <w:proofErr w:type="spellEnd"/>
-      <w:r>
-        <w:rPr>
-          <w:i/>
-          <w:iCs/>
-          <w:color w:val="666666"/>
-          <w:lang w:val="fr-FR"/>
-        </w:rPr>
-        <w:t xml:space="preserve"> ou </w:t>
-      </w:r>
-      <w:proofErr w:type="spellStart"/>
-      <w:r>
-        <w:rPr>
-          <w:i/>
-          <w:iCs/>
-          <w:color w:val="666666"/>
-          <w:lang w:val="fr-FR"/>
-        </w:rPr>
-        <w:t>application.properties</w:t>
-      </w:r>
-      <w:proofErr w:type="spellEnd"/>
-      <w:r>
-        <w:rPr>
-          <w:i/>
-          <w:iCs/>
-          <w:color w:val="666666"/>
-          <w:lang w:val="fr-FR"/>
-        </w:rPr>
-        <w:t>.</w:t>
+        <w:t>Gestion des configurations via des fichiers application.yml ou application.properties.</w:t>
       </w:r>
     </w:p>
     <w:p>
@@ -3130,27 +2759,7 @@
           <w:color w:val="666666"/>
           <w:lang w:val="fr-FR"/>
         </w:rPr>
-        <w:t xml:space="preserve">Nommage clair et cohérent des classes, méthodes et </w:t>
-      </w:r>
-      <w:proofErr w:type="spellStart"/>
-      <w:r>
-        <w:rPr>
-          <w:i/>
-          <w:iCs/>
-          <w:color w:val="666666"/>
-          <w:lang w:val="fr-FR"/>
-        </w:rPr>
-        <w:t>endpoints</w:t>
-      </w:r>
-      <w:proofErr w:type="spellEnd"/>
-      <w:r>
-        <w:rPr>
-          <w:i/>
-          <w:iCs/>
-          <w:color w:val="666666"/>
-          <w:lang w:val="fr-FR"/>
-        </w:rPr>
-        <w:t xml:space="preserve"> REST.</w:t>
+        <w:t>Nommage clair et cohérent des classes, méthodes et endpoints REST.</w:t>
       </w:r>
     </w:p>
     <w:p>
@@ -3173,47 +2782,7 @@
           <w:color w:val="666666"/>
           <w:lang w:val="fr-FR"/>
         </w:rPr>
-        <w:t xml:space="preserve">Un seul repository Git regroupant le </w:t>
-      </w:r>
-      <w:proofErr w:type="spellStart"/>
-      <w:r>
-        <w:rPr>
-          <w:i/>
-          <w:iCs/>
-          <w:color w:val="666666"/>
-          <w:lang w:val="fr-FR"/>
-        </w:rPr>
-        <w:t>front-end</w:t>
-      </w:r>
-      <w:proofErr w:type="spellEnd"/>
-      <w:r>
-        <w:rPr>
-          <w:i/>
-          <w:iCs/>
-          <w:color w:val="666666"/>
-          <w:lang w:val="fr-FR"/>
-        </w:rPr>
-        <w:t xml:space="preserve"> et le </w:t>
-      </w:r>
-      <w:proofErr w:type="spellStart"/>
-      <w:r>
-        <w:rPr>
-          <w:i/>
-          <w:iCs/>
-          <w:color w:val="666666"/>
-          <w:lang w:val="fr-FR"/>
-        </w:rPr>
-        <w:t>back-end</w:t>
-      </w:r>
-      <w:proofErr w:type="spellEnd"/>
-      <w:r>
-        <w:rPr>
-          <w:i/>
-          <w:iCs/>
-          <w:color w:val="666666"/>
-          <w:lang w:val="fr-FR"/>
-        </w:rPr>
-        <w:t>, conformément aux contraintes ORION.</w:t>
+        <w:t>Un seul repository Git regroupant le front-end et le back-end, conformément aux contraintes ORION.</w:t>
       </w:r>
     </w:p>
     <w:p>
@@ -3290,47 +2859,7 @@
           <w:color w:val="666666"/>
           <w:lang w:val="fr-FR"/>
         </w:rPr>
-        <w:t xml:space="preserve">Séparation </w:t>
-      </w:r>
-      <w:proofErr w:type="spellStart"/>
-      <w:r>
-        <w:rPr>
-          <w:i/>
-          <w:iCs/>
-          <w:color w:val="666666"/>
-          <w:lang w:val="fr-FR"/>
-        </w:rPr>
-        <w:t>front-end</w:t>
-      </w:r>
-      <w:proofErr w:type="spellEnd"/>
-      <w:r>
-        <w:rPr>
-          <w:i/>
-          <w:iCs/>
-          <w:color w:val="666666"/>
-          <w:lang w:val="fr-FR"/>
-        </w:rPr>
-        <w:t xml:space="preserve"> / </w:t>
-      </w:r>
-      <w:proofErr w:type="spellStart"/>
-      <w:r>
-        <w:rPr>
-          <w:i/>
-          <w:iCs/>
-          <w:color w:val="666666"/>
-          <w:lang w:val="fr-FR"/>
-        </w:rPr>
-        <w:t>back-end</w:t>
-      </w:r>
-      <w:proofErr w:type="spellEnd"/>
-      <w:r>
-        <w:rPr>
-          <w:i/>
-          <w:iCs/>
-          <w:color w:val="666666"/>
-          <w:lang w:val="fr-FR"/>
-        </w:rPr>
-        <w:t xml:space="preserve"> avec API REST dédiée.</w:t>
+        <w:t>Séparation front-end / back-end avec API REST dédiée.</w:t>
       </w:r>
     </w:p>
     <w:p>
@@ -3376,27 +2905,7 @@
           <w:color w:val="666666"/>
           <w:lang w:val="fr-FR"/>
         </w:rPr>
-        <w:t xml:space="preserve"> Respect des principes SOLID côté </w:t>
-      </w:r>
-      <w:proofErr w:type="spellStart"/>
-      <w:r>
-        <w:rPr>
-          <w:i/>
-          <w:iCs/>
-          <w:color w:val="666666"/>
-          <w:lang w:val="fr-FR"/>
-        </w:rPr>
-        <w:t>back-end</w:t>
-      </w:r>
-      <w:proofErr w:type="spellEnd"/>
-      <w:r>
-        <w:rPr>
-          <w:i/>
-          <w:iCs/>
-          <w:color w:val="666666"/>
-          <w:lang w:val="fr-FR"/>
-        </w:rPr>
-        <w:t>.</w:t>
+        <w:t xml:space="preserve"> Respect des principes SOLID côté back-end.</w:t>
       </w:r>
     </w:p>
     <w:p>
@@ -3419,27 +2928,7 @@
           <w:color w:val="666666"/>
           <w:lang w:val="fr-FR"/>
         </w:rPr>
-        <w:t xml:space="preserve">Utilisation obligatoire de Java / Spring pour le </w:t>
-      </w:r>
-      <w:proofErr w:type="spellStart"/>
-      <w:r>
-        <w:rPr>
-          <w:i/>
-          <w:iCs/>
-          <w:color w:val="666666"/>
-          <w:lang w:val="fr-FR"/>
-        </w:rPr>
-        <w:t>back-end</w:t>
-      </w:r>
-      <w:proofErr w:type="spellEnd"/>
-      <w:r>
-        <w:rPr>
-          <w:i/>
-          <w:iCs/>
-          <w:color w:val="666666"/>
-          <w:lang w:val="fr-FR"/>
-        </w:rPr>
-        <w:t>.</w:t>
+        <w:t>Utilisation obligatoire de Java / Spring pour le back-end.</w:t>
       </w:r>
     </w:p>
     <w:p>
@@ -3462,67 +2951,7 @@
           <w:color w:val="666666"/>
           <w:lang w:val="fr-FR"/>
         </w:rPr>
-        <w:t xml:space="preserve">Utilisation de </w:t>
-      </w:r>
-      <w:proofErr w:type="spellStart"/>
-      <w:r>
-        <w:rPr>
-          <w:i/>
-          <w:iCs/>
-          <w:color w:val="666666"/>
-          <w:lang w:val="fr-FR"/>
-        </w:rPr>
-        <w:t>TypeScript</w:t>
-      </w:r>
-      <w:proofErr w:type="spellEnd"/>
-      <w:r>
-        <w:rPr>
-          <w:i/>
-          <w:iCs/>
-          <w:color w:val="666666"/>
-          <w:lang w:val="fr-FR"/>
-        </w:rPr>
-        <w:t xml:space="preserve"> / </w:t>
-      </w:r>
-      <w:proofErr w:type="spellStart"/>
-      <w:r>
-        <w:rPr>
-          <w:i/>
-          <w:iCs/>
-          <w:color w:val="666666"/>
-          <w:lang w:val="fr-FR"/>
-        </w:rPr>
-        <w:t>Angular</w:t>
-      </w:r>
-      <w:proofErr w:type="spellEnd"/>
-      <w:r>
-        <w:rPr>
-          <w:i/>
-          <w:iCs/>
-          <w:color w:val="666666"/>
-          <w:lang w:val="fr-FR"/>
-        </w:rPr>
-        <w:t xml:space="preserve"> pour le </w:t>
-      </w:r>
-      <w:proofErr w:type="spellStart"/>
-      <w:r>
-        <w:rPr>
-          <w:i/>
-          <w:iCs/>
-          <w:color w:val="666666"/>
-          <w:lang w:val="fr-FR"/>
-        </w:rPr>
-        <w:t>front-end</w:t>
-      </w:r>
-      <w:proofErr w:type="spellEnd"/>
-      <w:r>
-        <w:rPr>
-          <w:i/>
-          <w:iCs/>
-          <w:color w:val="666666"/>
-          <w:lang w:val="fr-FR"/>
-        </w:rPr>
-        <w:t>.</w:t>
+        <w:t>Utilisation de TypeScript / Angular pour le front-end.</w:t>
       </w:r>
     </w:p>
     <w:p>
@@ -3802,7 +3231,6 @@
                 <w:bCs/>
               </w:rPr>
             </w:pPr>
-            <w:proofErr w:type="spellStart"/>
             <w:r>
               <w:rPr>
                 <w:i/>
@@ -3811,7 +3239,6 @@
               </w:rPr>
               <w:t>Angular</w:t>
             </w:r>
-            <w:proofErr w:type="spellEnd"/>
           </w:p>
         </w:tc>
         <w:tc>
@@ -3844,18 +3271,8 @@
                 <w:iCs/>
                 <w:color w:val="666666"/>
               </w:rPr>
-              <w:t xml:space="preserve">Framework </w:t>
+              <w:t>Framework front-end</w:t>
             </w:r>
-            <w:proofErr w:type="spellStart"/>
-            <w:r>
-              <w:rPr>
-                <w:i/>
-                <w:iCs/>
-                <w:color w:val="666666"/>
-              </w:rPr>
-              <w:t>front-end</w:t>
-            </w:r>
-            <w:proofErr w:type="spellEnd"/>
           </w:p>
         </w:tc>
         <w:tc>
@@ -4008,7 +3425,6 @@
                 <w:color w:val="666666"/>
               </w:rPr>
             </w:pPr>
-            <w:proofErr w:type="spellStart"/>
             <w:r>
               <w:rPr>
                 <w:i/>
@@ -4017,7 +3433,6 @@
               </w:rPr>
               <w:t>TypeScript</w:t>
             </w:r>
-            <w:proofErr w:type="spellEnd"/>
           </w:p>
         </w:tc>
         <w:tc>
@@ -4051,18 +3466,8 @@
                 <w:iCs/>
                 <w:color w:val="666666"/>
               </w:rPr>
-              <w:t xml:space="preserve">Langage </w:t>
+              <w:t>Langage front-end</w:t>
             </w:r>
-            <w:proofErr w:type="spellStart"/>
-            <w:r>
-              <w:rPr>
-                <w:i/>
-                <w:iCs/>
-                <w:color w:val="666666"/>
-              </w:rPr>
-              <w:t>front-end</w:t>
-            </w:r>
-            <w:proofErr w:type="spellEnd"/>
           </w:p>
         </w:tc>
         <w:tc>
@@ -4218,7 +3623,6 @@
                 <w:color w:val="666666"/>
               </w:rPr>
             </w:pPr>
-            <w:proofErr w:type="spellStart"/>
             <w:r>
               <w:rPr>
                 <w:i/>
@@ -4226,16 +3630,7 @@
                 <w:color w:val="666666"/>
               </w:rPr>
               <w:lastRenderedPageBreak/>
-              <w:t>Angular</w:t>
-            </w:r>
-            <w:proofErr w:type="spellEnd"/>
-            <w:r>
-              <w:rPr>
-                <w:i/>
-                <w:iCs/>
-                <w:color w:val="666666"/>
-              </w:rPr>
-              <w:t xml:space="preserve"> CLI</w:t>
+              <w:t>Angular CLI</w:t>
             </w:r>
           </w:p>
         </w:tc>
@@ -4427,25 +3822,7 @@
                 <w:iCs/>
                 <w:color w:val="666666"/>
               </w:rPr>
-              <w:t xml:space="preserve">Faciliter la création, la configuration et le </w:t>
-            </w:r>
-            <w:proofErr w:type="spellStart"/>
-            <w:r>
-              <w:rPr>
-                <w:i/>
-                <w:iCs/>
-                <w:color w:val="666666"/>
-              </w:rPr>
-              <w:t>build</w:t>
-            </w:r>
-            <w:proofErr w:type="spellEnd"/>
-            <w:r>
-              <w:rPr>
-                <w:i/>
-                <w:iCs/>
-                <w:color w:val="666666"/>
-              </w:rPr>
-              <w:t xml:space="preserve"> de l’application</w:t>
+              <w:t>Faciliter la création, la configuration et le build de l’application</w:t>
             </w:r>
           </w:p>
         </w:tc>
@@ -4479,25 +3856,7 @@
                 <w:iCs/>
                 <w:color w:val="666666"/>
               </w:rPr>
-              <w:t xml:space="preserve">Outil standard </w:t>
-            </w:r>
-            <w:proofErr w:type="spellStart"/>
-            <w:r>
-              <w:rPr>
-                <w:i/>
-                <w:iCs/>
-                <w:color w:val="666666"/>
-              </w:rPr>
-              <w:t>Angular</w:t>
-            </w:r>
-            <w:proofErr w:type="spellEnd"/>
-            <w:r>
-              <w:rPr>
-                <w:i/>
-                <w:iCs/>
-                <w:color w:val="666666"/>
-              </w:rPr>
-              <w:t xml:space="preserve"> permettant un gain de temps et une configuration cohérente</w:t>
+              <w:t>Outil standard Angular permettant un gain de temps et une configuration cohérente</w:t>
             </w:r>
           </w:p>
           <w:p>
@@ -4579,18 +3938,8 @@
                 <w:iCs/>
                 <w:color w:val="666666"/>
               </w:rPr>
-              <w:t xml:space="preserve">Framework </w:t>
+              <w:t>Framework back-end</w:t>
             </w:r>
-            <w:proofErr w:type="spellStart"/>
-            <w:r>
-              <w:rPr>
-                <w:i/>
-                <w:iCs/>
-                <w:color w:val="666666"/>
-              </w:rPr>
-              <w:t>back-end</w:t>
-            </w:r>
-            <w:proofErr w:type="spellEnd"/>
           </w:p>
         </w:tc>
         <w:tc>
@@ -4660,18 +4009,8 @@
                 <w:iCs/>
                 <w:color w:val="666666"/>
               </w:rPr>
-              <w:t xml:space="preserve">Exposer une API REST et structurer le </w:t>
+              <w:t>Exposer une API REST et structurer le back-end</w:t>
             </w:r>
-            <w:proofErr w:type="spellStart"/>
-            <w:r>
-              <w:rPr>
-                <w:i/>
-                <w:iCs/>
-                <w:color w:val="666666"/>
-              </w:rPr>
-              <w:t>back-end</w:t>
-            </w:r>
-            <w:proofErr w:type="spellEnd"/>
           </w:p>
         </w:tc>
         <w:tc>
@@ -4777,18 +4116,8 @@
                 <w:iCs/>
                 <w:color w:val="666666"/>
               </w:rPr>
-              <w:t xml:space="preserve">Sécurité </w:t>
+              <w:t>Sécurité back-end</w:t>
             </w:r>
-            <w:proofErr w:type="spellStart"/>
-            <w:r>
-              <w:rPr>
-                <w:i/>
-                <w:iCs/>
-                <w:color w:val="666666"/>
-              </w:rPr>
-              <w:t>back-end</w:t>
-            </w:r>
-            <w:proofErr w:type="spellEnd"/>
           </w:p>
         </w:tc>
         <w:tc>
@@ -5034,25 +4363,7 @@
                 <w:iCs/>
                 <w:color w:val="666666"/>
               </w:rPr>
-              <w:t xml:space="preserve">Sécuriser les échanges entre le </w:t>
-            </w:r>
-            <w:proofErr w:type="spellStart"/>
-            <w:r>
-              <w:rPr>
-                <w:i/>
-                <w:iCs/>
-                <w:color w:val="666666"/>
-              </w:rPr>
-              <w:t>front-end</w:t>
-            </w:r>
-            <w:proofErr w:type="spellEnd"/>
-            <w:r>
-              <w:rPr>
-                <w:i/>
-                <w:iCs/>
-                <w:color w:val="666666"/>
-              </w:rPr>
-              <w:t xml:space="preserve"> et l’API</w:t>
+              <w:t>Sécuriser les échanges entre le front-end et l’API</w:t>
             </w:r>
           </w:p>
         </w:tc>
@@ -5086,25 +4397,7 @@
                 <w:iCs/>
                 <w:color w:val="666666"/>
               </w:rPr>
-              <w:t xml:space="preserve">Solution standard pour les API REST </w:t>
-            </w:r>
-            <w:proofErr w:type="spellStart"/>
-            <w:r>
-              <w:rPr>
-                <w:i/>
-                <w:iCs/>
-                <w:color w:val="666666"/>
-              </w:rPr>
-              <w:t>stateless</w:t>
-            </w:r>
-            <w:proofErr w:type="spellEnd"/>
-            <w:r>
-              <w:rPr>
-                <w:i/>
-                <w:iCs/>
-                <w:color w:val="666666"/>
-              </w:rPr>
-              <w:t>, adaptée aux SPA</w:t>
+              <w:t>Solution standard pour les API REST stateless, adaptée aux SPA</w:t>
             </w:r>
           </w:p>
         </w:tc>
@@ -5290,25 +4583,7 @@
                 <w:iCs/>
                 <w:color w:val="666666"/>
               </w:rPr>
-              <w:t xml:space="preserve">Réduction du code </w:t>
-            </w:r>
-            <w:proofErr w:type="spellStart"/>
-            <w:r>
-              <w:rPr>
-                <w:i/>
-                <w:iCs/>
-                <w:color w:val="666666"/>
-              </w:rPr>
-              <w:t>boilerplate</w:t>
-            </w:r>
-            <w:proofErr w:type="spellEnd"/>
-            <w:r>
-              <w:rPr>
-                <w:i/>
-                <w:iCs/>
-                <w:color w:val="666666"/>
-              </w:rPr>
-              <w:t xml:space="preserve"> et intégration native avec Spring Boot</w:t>
+              <w:t>Réduction du code boilerplate et intégration native avec Spring Boot</w:t>
             </w:r>
           </w:p>
         </w:tc>
@@ -5381,25 +4656,7 @@
                 <w:iCs/>
                 <w:color w:val="666666"/>
               </w:rPr>
-              <w:t xml:space="preserve">Base de </w:t>
-            </w:r>
-            <w:proofErr w:type="spellStart"/>
-            <w:r>
-              <w:rPr>
-                <w:i/>
-                <w:iCs/>
-                <w:color w:val="666666"/>
-              </w:rPr>
-              <w:t>donnéesBase</w:t>
-            </w:r>
-            <w:proofErr w:type="spellEnd"/>
-            <w:r>
-              <w:rPr>
-                <w:i/>
-                <w:iCs/>
-                <w:color w:val="666666"/>
-              </w:rPr>
-              <w:t xml:space="preserve"> de données</w:t>
+              <w:t>Base de donnéesBase de données</w:t>
             </w:r>
           </w:p>
         </w:tc>
@@ -5966,39 +5223,8 @@
                 <w:iCs/>
                 <w:color w:val="666666"/>
               </w:rPr>
-              <w:t>/api/</w:t>
+              <w:t>/api/auth/register</w:t>
             </w:r>
-            <w:proofErr w:type="spellStart"/>
-            <w:r>
-              <w:rPr>
-                <w:rFonts w:ascii="Roboto Mono" w:eastAsia="Roboto Mono" w:hAnsi="Roboto Mono" w:cs="Roboto Mono"/>
-                <w:i/>
-                <w:iCs/>
-                <w:color w:val="666666"/>
-              </w:rPr>
-              <w:t>auth</w:t>
-            </w:r>
-            <w:proofErr w:type="spellEnd"/>
-            <w:r>
-              <w:rPr>
-                <w:rFonts w:ascii="Roboto Mono" w:eastAsia="Roboto Mono" w:hAnsi="Roboto Mono" w:cs="Roboto Mono"/>
-                <w:i/>
-                <w:iCs/>
-                <w:color w:val="666666"/>
-              </w:rPr>
-              <w:t>/</w:t>
-            </w:r>
-            <w:proofErr w:type="spellStart"/>
-            <w:r>
-              <w:rPr>
-                <w:rFonts w:ascii="Roboto Mono" w:eastAsia="Roboto Mono" w:hAnsi="Roboto Mono" w:cs="Roboto Mono"/>
-                <w:i/>
-                <w:iCs/>
-                <w:color w:val="666666"/>
-              </w:rPr>
-              <w:t>register</w:t>
-            </w:r>
-            <w:proofErr w:type="spellEnd"/>
           </w:p>
         </w:tc>
         <w:tc>
@@ -6139,27 +5365,7 @@
                 <w:iCs/>
                 <w:color w:val="666666"/>
               </w:rPr>
-              <w:t>/api/</w:t>
-            </w:r>
-            <w:proofErr w:type="spellStart"/>
-            <w:r>
-              <w:rPr>
-                <w:rFonts w:ascii="Roboto Mono" w:eastAsia="Roboto Mono" w:hAnsi="Roboto Mono" w:cs="Roboto Mono"/>
-                <w:i/>
-                <w:iCs/>
-                <w:color w:val="666666"/>
-              </w:rPr>
-              <w:t>auth</w:t>
-            </w:r>
-            <w:proofErr w:type="spellEnd"/>
-            <w:r>
-              <w:rPr>
-                <w:rFonts w:ascii="Roboto Mono" w:eastAsia="Roboto Mono" w:hAnsi="Roboto Mono" w:cs="Roboto Mono"/>
-                <w:i/>
-                <w:iCs/>
-                <w:color w:val="666666"/>
-              </w:rPr>
-              <w:t>/login</w:t>
+              <w:t>/api/auth/login</w:t>
             </w:r>
           </w:p>
         </w:tc>
@@ -6367,25 +5573,7 @@
                 <w:iCs/>
                 <w:color w:val="666666"/>
               </w:rPr>
-              <w:t xml:space="preserve">JSON – </w:t>
-            </w:r>
-            <w:proofErr w:type="spellStart"/>
-            <w:r>
-              <w:rPr>
-                <w:i/>
-                <w:iCs/>
-                <w:color w:val="666666"/>
-              </w:rPr>
-              <w:t>token</w:t>
-            </w:r>
-            <w:proofErr w:type="spellEnd"/>
-            <w:r>
-              <w:rPr>
-                <w:i/>
-                <w:iCs/>
-                <w:color w:val="666666"/>
-              </w:rPr>
-              <w:t xml:space="preserve"> JWT</w:t>
+              <w:t>JSON – token JWT</w:t>
             </w:r>
           </w:p>
         </w:tc>
@@ -6425,27 +5613,7 @@
                 <w:iCs/>
                 <w:color w:val="666666"/>
               </w:rPr>
-              <w:t>/api/</w:t>
-            </w:r>
-            <w:proofErr w:type="spellStart"/>
-            <w:r>
-              <w:rPr>
-                <w:rFonts w:ascii="Roboto Mono" w:eastAsia="Roboto Mono" w:hAnsi="Roboto Mono" w:cs="Roboto Mono"/>
-                <w:i/>
-                <w:iCs/>
-                <w:color w:val="666666"/>
-              </w:rPr>
-              <w:t>users</w:t>
-            </w:r>
-            <w:proofErr w:type="spellEnd"/>
-            <w:r>
-              <w:rPr>
-                <w:rFonts w:ascii="Roboto Mono" w:eastAsia="Roboto Mono" w:hAnsi="Roboto Mono" w:cs="Roboto Mono"/>
-                <w:i/>
-                <w:iCs/>
-                <w:color w:val="666666"/>
-              </w:rPr>
-              <w:t>/me</w:t>
+              <w:t>/api/users/me</w:t>
             </w:r>
           </w:p>
         </w:tc>
@@ -6731,47 +5899,7 @@
                 <w:iCs/>
                 <w:color w:val="666666"/>
               </w:rPr>
-              <w:t>/api/</w:t>
-            </w:r>
-            <w:proofErr w:type="spellStart"/>
-            <w:r>
-              <w:rPr>
-                <w:rFonts w:ascii="Roboto Mono" w:eastAsia="Roboto Mono" w:hAnsi="Roboto Mono" w:cs="Roboto Mono"/>
-                <w:i/>
-                <w:iCs/>
-                <w:color w:val="666666"/>
-              </w:rPr>
-              <w:t>subscriptions</w:t>
-            </w:r>
-            <w:proofErr w:type="spellEnd"/>
-            <w:r>
-              <w:rPr>
-                <w:rFonts w:ascii="Roboto Mono" w:eastAsia="Roboto Mono" w:hAnsi="Roboto Mono" w:cs="Roboto Mono"/>
-                <w:i/>
-                <w:iCs/>
-                <w:color w:val="666666"/>
-              </w:rPr>
-              <w:t>/{</w:t>
-            </w:r>
-            <w:proofErr w:type="spellStart"/>
-            <w:r>
-              <w:rPr>
-                <w:rFonts w:ascii="Roboto Mono" w:eastAsia="Roboto Mono" w:hAnsi="Roboto Mono" w:cs="Roboto Mono"/>
-                <w:i/>
-                <w:iCs/>
-                <w:color w:val="666666"/>
-              </w:rPr>
-              <w:t>topicId</w:t>
-            </w:r>
-            <w:proofErr w:type="spellEnd"/>
-            <w:r>
-              <w:rPr>
-                <w:rFonts w:ascii="Roboto Mono" w:eastAsia="Roboto Mono" w:hAnsi="Roboto Mono" w:cs="Roboto Mono"/>
-                <w:i/>
-                <w:iCs/>
-                <w:color w:val="666666"/>
-              </w:rPr>
-              <w:t>}</w:t>
+              <w:t>/api/subscriptions/{topicId}</w:t>
             </w:r>
           </w:p>
         </w:tc>
@@ -6914,47 +6042,7 @@
                 <w:iCs/>
                 <w:color w:val="666666"/>
               </w:rPr>
-              <w:t>/api/</w:t>
-            </w:r>
-            <w:proofErr w:type="spellStart"/>
-            <w:r>
-              <w:rPr>
-                <w:rFonts w:ascii="Roboto Mono" w:eastAsia="Roboto Mono" w:hAnsi="Roboto Mono" w:cs="Roboto Mono"/>
-                <w:i/>
-                <w:iCs/>
-                <w:color w:val="666666"/>
-              </w:rPr>
-              <w:t>subscriptions</w:t>
-            </w:r>
-            <w:proofErr w:type="spellEnd"/>
-            <w:r>
-              <w:rPr>
-                <w:rFonts w:ascii="Roboto Mono" w:eastAsia="Roboto Mono" w:hAnsi="Roboto Mono" w:cs="Roboto Mono"/>
-                <w:i/>
-                <w:iCs/>
-                <w:color w:val="666666"/>
-              </w:rPr>
-              <w:t>/{</w:t>
-            </w:r>
-            <w:proofErr w:type="spellStart"/>
-            <w:r>
-              <w:rPr>
-                <w:rFonts w:ascii="Roboto Mono" w:eastAsia="Roboto Mono" w:hAnsi="Roboto Mono" w:cs="Roboto Mono"/>
-                <w:i/>
-                <w:iCs/>
-                <w:color w:val="666666"/>
-              </w:rPr>
-              <w:t>topicId</w:t>
-            </w:r>
-            <w:proofErr w:type="spellEnd"/>
-            <w:r>
-              <w:rPr>
-                <w:rFonts w:ascii="Roboto Mono" w:eastAsia="Roboto Mono" w:hAnsi="Roboto Mono" w:cs="Roboto Mono"/>
-                <w:i/>
-                <w:iCs/>
-                <w:color w:val="666666"/>
-              </w:rPr>
-              <w:t>}</w:t>
+              <w:t>/api/subscriptions/{topicId}</w:t>
             </w:r>
           </w:p>
         </w:tc>
@@ -7097,19 +6185,8 @@
                 <w:iCs/>
                 <w:color w:val="666666"/>
               </w:rPr>
-              <w:t>/api/</w:t>
+              <w:t>/api/feed</w:t>
             </w:r>
-            <w:proofErr w:type="spellStart"/>
-            <w:r>
-              <w:rPr>
-                <w:rFonts w:ascii="Roboto Mono" w:eastAsia="Roboto Mono" w:hAnsi="Roboto Mono" w:cs="Roboto Mono"/>
-                <w:i/>
-                <w:iCs/>
-                <w:color w:val="666666"/>
-              </w:rPr>
-              <w:t>feed</w:t>
-            </w:r>
-            <w:proofErr w:type="spellEnd"/>
           </w:p>
         </w:tc>
         <w:tc>
@@ -7251,19 +6328,8 @@
                 <w:iCs/>
                 <w:color w:val="666666"/>
               </w:rPr>
-              <w:t>/api/</w:t>
+              <w:t>/api/posts</w:t>
             </w:r>
-            <w:proofErr w:type="spellStart"/>
-            <w:r>
-              <w:rPr>
-                <w:rFonts w:ascii="Roboto Mono" w:eastAsia="Roboto Mono" w:hAnsi="Roboto Mono" w:cs="Roboto Mono"/>
-                <w:i/>
-                <w:iCs/>
-                <w:color w:val="666666"/>
-              </w:rPr>
-              <w:t>posts</w:t>
-            </w:r>
-            <w:proofErr w:type="spellEnd"/>
           </w:p>
         </w:tc>
         <w:tc>
@@ -7405,27 +6471,7 @@
                 <w:iCs/>
                 <w:color w:val="666666"/>
               </w:rPr>
-              <w:t>/api/</w:t>
-            </w:r>
-            <w:proofErr w:type="spellStart"/>
-            <w:r>
-              <w:rPr>
-                <w:rFonts w:ascii="Roboto Mono" w:eastAsia="Roboto Mono" w:hAnsi="Roboto Mono" w:cs="Roboto Mono"/>
-                <w:i/>
-                <w:iCs/>
-                <w:color w:val="666666"/>
-              </w:rPr>
-              <w:t>posts</w:t>
-            </w:r>
-            <w:proofErr w:type="spellEnd"/>
-            <w:r>
-              <w:rPr>
-                <w:rFonts w:ascii="Roboto Mono" w:eastAsia="Roboto Mono" w:hAnsi="Roboto Mono" w:cs="Roboto Mono"/>
-                <w:i/>
-                <w:iCs/>
-                <w:color w:val="666666"/>
-              </w:rPr>
-              <w:t>/{id}</w:t>
+              <w:t>/api/posts/{id}</w:t>
             </w:r>
           </w:p>
         </w:tc>
@@ -7568,39 +6614,8 @@
                 <w:iCs/>
                 <w:color w:val="666666"/>
               </w:rPr>
-              <w:t>/api/</w:t>
+              <w:t>/api/posts/{id}/comments</w:t>
             </w:r>
-            <w:proofErr w:type="spellStart"/>
-            <w:r>
-              <w:rPr>
-                <w:rFonts w:ascii="Roboto Mono" w:eastAsia="Roboto Mono" w:hAnsi="Roboto Mono" w:cs="Roboto Mono"/>
-                <w:i/>
-                <w:iCs/>
-                <w:color w:val="666666"/>
-              </w:rPr>
-              <w:t>posts</w:t>
-            </w:r>
-            <w:proofErr w:type="spellEnd"/>
-            <w:r>
-              <w:rPr>
-                <w:rFonts w:ascii="Roboto Mono" w:eastAsia="Roboto Mono" w:hAnsi="Roboto Mono" w:cs="Roboto Mono"/>
-                <w:i/>
-                <w:iCs/>
-                <w:color w:val="666666"/>
-              </w:rPr>
-              <w:t>/{id}/</w:t>
-            </w:r>
-            <w:proofErr w:type="spellStart"/>
-            <w:r>
-              <w:rPr>
-                <w:rFonts w:ascii="Roboto Mono" w:eastAsia="Roboto Mono" w:hAnsi="Roboto Mono" w:cs="Roboto Mono"/>
-                <w:i/>
-                <w:iCs/>
-                <w:color w:val="666666"/>
-              </w:rPr>
-              <w:t>comments</w:t>
-            </w:r>
-            <w:proofErr w:type="spellEnd"/>
           </w:p>
         </w:tc>
         <w:tc>
@@ -7742,27 +6757,7 @@
                 <w:iCs/>
                 <w:color w:val="666666"/>
               </w:rPr>
-              <w:t>/api/</w:t>
-            </w:r>
-            <w:proofErr w:type="spellStart"/>
-            <w:r>
-              <w:rPr>
-                <w:rFonts w:ascii="Roboto Mono" w:eastAsia="Roboto Mono" w:hAnsi="Roboto Mono" w:cs="Roboto Mono"/>
-                <w:i/>
-                <w:iCs/>
-                <w:color w:val="666666"/>
-              </w:rPr>
-              <w:t>users</w:t>
-            </w:r>
-            <w:proofErr w:type="spellEnd"/>
-            <w:r>
-              <w:rPr>
-                <w:rFonts w:ascii="Roboto Mono" w:eastAsia="Roboto Mono" w:hAnsi="Roboto Mono" w:cs="Roboto Mono"/>
-                <w:i/>
-                <w:iCs/>
-                <w:color w:val="666666"/>
-              </w:rPr>
-              <w:t>/me</w:t>
+              <w:t>/api/users/me</w:t>
             </w:r>
           </w:p>
         </w:tc>
@@ -8204,43 +7199,7 @@
           <w:iCs/>
           <w:color w:val="666666"/>
         </w:rPr>
-        <w:t xml:space="preserve">- </w:t>
-      </w:r>
-      <w:proofErr w:type="spellStart"/>
-      <w:r>
-        <w:rPr>
-          <w:i/>
-          <w:iCs/>
-          <w:color w:val="666666"/>
-        </w:rPr>
-        <w:t>MockMvc</w:t>
-      </w:r>
-      <w:proofErr w:type="spellEnd"/>
-      <w:r>
-        <w:rPr>
-          <w:i/>
-          <w:iCs/>
-          <w:color w:val="666666"/>
-        </w:rPr>
-        <w:t xml:space="preserve"> pour tester les </w:t>
-      </w:r>
-      <w:proofErr w:type="spellStart"/>
-      <w:r>
-        <w:rPr>
-          <w:i/>
-          <w:iCs/>
-          <w:color w:val="666666"/>
-        </w:rPr>
-        <w:t>endpoints</w:t>
-      </w:r>
-      <w:proofErr w:type="spellEnd"/>
-      <w:r>
-        <w:rPr>
-          <w:i/>
-          <w:iCs/>
-          <w:color w:val="666666"/>
-        </w:rPr>
-        <w:t xml:space="preserve"> REST</w:t>
+        <w:t>- MockMvc pour tester les endpoints REST</w:t>
       </w:r>
     </w:p>
     <w:p>
@@ -8318,25 +7277,7 @@
           <w:color w:val="666666"/>
         </w:rPr>
         <w:lastRenderedPageBreak/>
-        <w:t xml:space="preserve">- Parcours complet : inscription → connexion → abonnement → création article → commentaire → consultation </w:t>
-      </w:r>
-      <w:proofErr w:type="spellStart"/>
-      <w:r>
-        <w:rPr>
-          <w:i/>
-          <w:iCs/>
-          <w:color w:val="666666"/>
-        </w:rPr>
-        <w:t>feed</w:t>
-      </w:r>
-      <w:proofErr w:type="spellEnd"/>
-      <w:r>
-        <w:rPr>
-          <w:i/>
-          <w:iCs/>
-          <w:color w:val="666666"/>
-        </w:rPr>
-        <w:t>.</w:t>
+        <w:t>- Parcours complet : inscription → connexion → abonnement → création article → commentaire → consultation feed.</w:t>
       </w:r>
     </w:p>
     <w:p>
@@ -8460,17 +7401,8 @@
                 <w:b/>
                 <w:bCs/>
               </w:rPr>
-              <w:t xml:space="preserve">Outil / </w:t>
+              <w:t>Outil / framework</w:t>
             </w:r>
-            <w:proofErr w:type="spellStart"/>
-            <w:r>
-              <w:rPr>
-                <w:b/>
-                <w:bCs/>
-              </w:rPr>
-              <w:t>framework</w:t>
-            </w:r>
-            <w:proofErr w:type="spellEnd"/>
           </w:p>
         </w:tc>
         <w:tc>
@@ -8631,25 +7563,7 @@
                 <w:iCs/>
                 <w:color w:val="666666"/>
               </w:rPr>
-              <w:t xml:space="preserve">Services du </w:t>
-            </w:r>
-            <w:proofErr w:type="spellStart"/>
-            <w:r>
-              <w:rPr>
-                <w:i/>
-                <w:iCs/>
-                <w:color w:val="666666"/>
-              </w:rPr>
-              <w:t>back-end</w:t>
-            </w:r>
-            <w:proofErr w:type="spellEnd"/>
-            <w:r>
-              <w:rPr>
-                <w:i/>
-                <w:iCs/>
-                <w:color w:val="666666"/>
-              </w:rPr>
-              <w:t xml:space="preserve"> (logique métier)</w:t>
+              <w:t>Services du back-end (logique métier)</w:t>
             </w:r>
           </w:p>
         </w:tc>
@@ -8756,18 +7670,8 @@
                 <w:iCs/>
                 <w:color w:val="666666"/>
               </w:rPr>
-              <w:t xml:space="preserve">Spring Boot Test / </w:t>
+              <w:t>Spring Boot Test / MockMvc</w:t>
             </w:r>
-            <w:proofErr w:type="spellStart"/>
-            <w:r>
-              <w:rPr>
-                <w:i/>
-                <w:iCs/>
-                <w:color w:val="666666"/>
-              </w:rPr>
-              <w:t>MockMvc</w:t>
-            </w:r>
-            <w:proofErr w:type="spellEnd"/>
           </w:p>
         </w:tc>
         <w:tc>
@@ -8828,23 +7732,13 @@
                 <w:color w:val="666666"/>
               </w:rPr>
             </w:pPr>
-            <w:proofErr w:type="spellStart"/>
             <w:r>
               <w:rPr>
                 <w:i/>
                 <w:iCs/>
                 <w:color w:val="666666"/>
               </w:rPr>
-              <w:t>Endpoints</w:t>
-            </w:r>
-            <w:proofErr w:type="spellEnd"/>
-            <w:r>
-              <w:rPr>
-                <w:i/>
-                <w:iCs/>
-                <w:color w:val="666666"/>
-              </w:rPr>
-              <w:t xml:space="preserve"> fonctionnels, échanges API corrects</w:t>
+              <w:t>Endpoints fonctionnels, échanges API corrects</w:t>
             </w:r>
           </w:p>
         </w:tc>
@@ -9032,19 +7926,18 @@
           <w:color w:val="666666"/>
           <w:lang w:val="fr-FR"/>
         </w:rPr>
-        <w:t xml:space="preserve">L’analyse de performance a été réalisée en environnement local à l’aide des outils Chrome </w:t>
-      </w:r>
-      <w:proofErr w:type="spellStart"/>
-      <w:r>
+        <w:t>L’analyse de performance a été réalisée en environnement local à l’aide des outils Chrome DevTools, notamment les onglets Network et Performance.</w:t>
+      </w:r>
+    </w:p>
+    <w:p>
+      <w:pPr>
         <w:rPr>
           <w:i/>
           <w:iCs/>
           <w:color w:val="666666"/>
           <w:lang w:val="fr-FR"/>
         </w:rPr>
-        <w:t>DevTools</w:t>
-      </w:r>
-      <w:proofErr w:type="spellEnd"/>
+      </w:pPr>
       <w:r>
         <w:rPr>
           <w:i/>
@@ -9052,46 +7945,7 @@
           <w:color w:val="666666"/>
           <w:lang w:val="fr-FR"/>
         </w:rPr>
-        <w:t>, notamment les onglets Network et Performance.</w:t>
-      </w:r>
-    </w:p>
-    <w:p>
-      <w:pPr>
-        <w:rPr>
-          <w:i/>
-          <w:iCs/>
-          <w:color w:val="666666"/>
-          <w:lang w:val="fr-FR"/>
-        </w:rPr>
-      </w:pPr>
-      <w:r>
-        <w:rPr>
-          <w:i/>
-          <w:iCs/>
-          <w:color w:val="666666"/>
-          <w:lang w:val="fr-FR"/>
-        </w:rPr>
-        <w:t xml:space="preserve">L’onglet Network a permis de mesurer les temps de réponse des </w:t>
-      </w:r>
-      <w:proofErr w:type="spellStart"/>
-      <w:r>
-        <w:rPr>
-          <w:i/>
-          <w:iCs/>
-          <w:color w:val="666666"/>
-          <w:lang w:val="fr-FR"/>
-        </w:rPr>
-        <w:t>endpoints</w:t>
-      </w:r>
-      <w:proofErr w:type="spellEnd"/>
-      <w:r>
-        <w:rPr>
-          <w:i/>
-          <w:iCs/>
-          <w:color w:val="666666"/>
-          <w:lang w:val="fr-FR"/>
-        </w:rPr>
-        <w:t xml:space="preserve"> REST, la taille des fichiers JavaScript générés et le nombre de requêtes effectuées lors du chargement des pages.</w:t>
+        <w:t>L’onglet Network a permis de mesurer les temps de réponse des endpoints REST, la taille des fichiers JavaScript générés et le nombre de requêtes effectuées lors du chargement des pages.</w:t>
       </w:r>
     </w:p>
     <w:p>
@@ -9164,7 +8018,6 @@
           <w:lang w:val="fr-FR"/>
         </w:rPr>
       </w:pPr>
-      <w:proofErr w:type="spellStart"/>
       <w:r>
         <w:rPr>
           <w:i/>
@@ -9172,57 +8025,7 @@
           <w:color w:val="666666"/>
           <w:lang w:val="fr-FR"/>
         </w:rPr>
-        <w:t>Build</w:t>
-      </w:r>
-      <w:proofErr w:type="spellEnd"/>
-      <w:r>
-        <w:rPr>
-          <w:i/>
-          <w:iCs/>
-          <w:color w:val="666666"/>
-          <w:lang w:val="fr-FR"/>
-        </w:rPr>
-        <w:t xml:space="preserve"> </w:t>
-      </w:r>
-      <w:proofErr w:type="spellStart"/>
-      <w:r>
-        <w:rPr>
-          <w:i/>
-          <w:iCs/>
-          <w:color w:val="666666"/>
-          <w:lang w:val="fr-FR"/>
-        </w:rPr>
-        <w:t>Angular</w:t>
-      </w:r>
-      <w:proofErr w:type="spellEnd"/>
-      <w:r>
-        <w:rPr>
-          <w:i/>
-          <w:iCs/>
-          <w:color w:val="666666"/>
-          <w:lang w:val="fr-FR"/>
-        </w:rPr>
-        <w:t xml:space="preserve"> en mode production (minification, AOT, </w:t>
-      </w:r>
-      <w:proofErr w:type="spellStart"/>
-      <w:r>
-        <w:rPr>
-          <w:i/>
-          <w:iCs/>
-          <w:color w:val="666666"/>
-          <w:lang w:val="fr-FR"/>
-        </w:rPr>
-        <w:t>tree-shaking</w:t>
-      </w:r>
-      <w:proofErr w:type="spellEnd"/>
-      <w:r>
-        <w:rPr>
-          <w:i/>
-          <w:iCs/>
-          <w:color w:val="666666"/>
-          <w:lang w:val="fr-FR"/>
-        </w:rPr>
-        <w:t>).</w:t>
+        <w:t>Build Angular en mode production (minification, AOT, tree-shaking).</w:t>
       </w:r>
     </w:p>
     <w:p>
@@ -9245,47 +8048,7 @@
           <w:color w:val="666666"/>
           <w:lang w:val="fr-FR"/>
         </w:rPr>
-        <w:t xml:space="preserve">Mise en place du </w:t>
-      </w:r>
-      <w:proofErr w:type="spellStart"/>
-      <w:r>
-        <w:rPr>
-          <w:i/>
-          <w:iCs/>
-          <w:color w:val="666666"/>
-          <w:lang w:val="fr-FR"/>
-        </w:rPr>
-        <w:t>lazy</w:t>
-      </w:r>
-      <w:proofErr w:type="spellEnd"/>
-      <w:r>
-        <w:rPr>
-          <w:i/>
-          <w:iCs/>
-          <w:color w:val="666666"/>
-          <w:lang w:val="fr-FR"/>
-        </w:rPr>
-        <w:t xml:space="preserve"> </w:t>
-      </w:r>
-      <w:proofErr w:type="spellStart"/>
-      <w:r>
-        <w:rPr>
-          <w:i/>
-          <w:iCs/>
-          <w:color w:val="666666"/>
-          <w:lang w:val="fr-FR"/>
-        </w:rPr>
-        <w:t>loading</w:t>
-      </w:r>
-      <w:proofErr w:type="spellEnd"/>
-      <w:r>
-        <w:rPr>
-          <w:i/>
-          <w:iCs/>
-          <w:color w:val="666666"/>
-          <w:lang w:val="fr-FR"/>
-        </w:rPr>
-        <w:t xml:space="preserve"> des modules.</w:t>
+        <w:t>Mise en place du lazy loading des modules.</w:t>
       </w:r>
     </w:p>
     <w:p>
@@ -9455,19 +8218,18 @@
           <w:color w:val="666666"/>
           <w:lang w:val="fr-FR"/>
         </w:rPr>
-        <w:t xml:space="preserve">- </w:t>
-      </w:r>
-      <w:proofErr w:type="spellStart"/>
-      <w:r>
+        <w:t>- Front-end structuré en modules.</w:t>
+      </w:r>
+    </w:p>
+    <w:p>
+      <w:pPr>
         <w:rPr>
           <w:i/>
           <w:iCs/>
           <w:color w:val="666666"/>
           <w:lang w:val="fr-FR"/>
         </w:rPr>
-        <w:t>Front-end</w:t>
-      </w:r>
-      <w:proofErr w:type="spellEnd"/>
+      </w:pPr>
       <w:r>
         <w:rPr>
           <w:i/>
@@ -9475,7 +8237,7 @@
           <w:color w:val="666666"/>
           <w:lang w:val="fr-FR"/>
         </w:rPr>
-        <w:t xml:space="preserve"> structuré en modules.</w:t>
+        <w:t>- Séparation claire des DTO et entités.</w:t>
       </w:r>
     </w:p>
     <w:p>
@@ -9487,25 +8249,25 @@
           <w:lang w:val="fr-FR"/>
         </w:rPr>
       </w:pPr>
-      <w:r>
+    </w:p>
+    <w:p>
+      <w:pPr>
         <w:rPr>
           <w:i/>
           <w:iCs/>
           <w:color w:val="666666"/>
           <w:lang w:val="fr-FR"/>
         </w:rPr>
-        <w:t>- Séparation claire des DTO et entités.</w:t>
-      </w:r>
-    </w:p>
-    <w:p>
-      <w:pPr>
+      </w:pPr>
+      <w:r>
         <w:rPr>
           <w:i/>
           <w:iCs/>
           <w:color w:val="666666"/>
           <w:lang w:val="fr-FR"/>
         </w:rPr>
-      </w:pPr>
+        <w:t>Axes d’amélioration :</w:t>
+      </w:r>
     </w:p>
     <w:p>
       <w:pPr>
@@ -9523,7 +8285,7 @@
           <w:color w:val="666666"/>
           <w:lang w:val="fr-FR"/>
         </w:rPr>
-        <w:t>Axes d’amélioration :</w:t>
+        <w:t>- Ajout d’une interface admin</w:t>
       </w:r>
     </w:p>
     <w:p>
@@ -9542,7 +8304,7 @@
           <w:color w:val="666666"/>
           <w:lang w:val="fr-FR"/>
         </w:rPr>
-        <w:t>- Mise en place d’un système de gestion centralisée des erreurs.</w:t>
+        <w:t>- Des notifications</w:t>
       </w:r>
     </w:p>
     <w:p>
@@ -9561,19 +8323,18 @@
           <w:color w:val="666666"/>
           <w:lang w:val="fr-FR"/>
         </w:rPr>
-        <w:t xml:space="preserve">- Ajout d’une couverture de test plus élevée côté </w:t>
-      </w:r>
-      <w:proofErr w:type="spellStart"/>
-      <w:r>
+        <w:t>- Ajout d’une couverture de test plus élevée côté front-end.</w:t>
+      </w:r>
+    </w:p>
+    <w:p>
+      <w:pPr>
         <w:rPr>
           <w:i/>
           <w:iCs/>
           <w:color w:val="666666"/>
           <w:lang w:val="fr-FR"/>
         </w:rPr>
-        <w:t>front-end</w:t>
-      </w:r>
-      <w:proofErr w:type="spellEnd"/>
+      </w:pPr>
       <w:r>
         <w:rPr>
           <w:i/>
@@ -9581,7 +8342,7 @@
           <w:color w:val="666666"/>
           <w:lang w:val="fr-FR"/>
         </w:rPr>
-        <w:t>.</w:t>
+        <w:t>- Mise en place d’un pipeline CI/CD.</w:t>
       </w:r>
     </w:p>
     <w:p>
@@ -9593,25 +8354,25 @@
           <w:lang w:val="fr-FR"/>
         </w:rPr>
       </w:pPr>
-      <w:r>
+    </w:p>
+    <w:p>
+      <w:pPr>
         <w:rPr>
           <w:i/>
           <w:iCs/>
           <w:color w:val="666666"/>
           <w:lang w:val="fr-FR"/>
         </w:rPr>
-        <w:t>- Mise en place d’un pipeline CI/CD.</w:t>
-      </w:r>
-    </w:p>
-    <w:p>
-      <w:pPr>
+      </w:pPr>
+      <w:r>
         <w:rPr>
           <w:i/>
           <w:iCs/>
           <w:color w:val="666666"/>
           <w:lang w:val="fr-FR"/>
         </w:rPr>
-      </w:pPr>
+        <w:t>Dette technique identifiée :</w:t>
+      </w:r>
     </w:p>
     <w:p>
       <w:pPr>
@@ -9629,46 +8390,7 @@
           <w:color w:val="666666"/>
           <w:lang w:val="fr-FR"/>
         </w:rPr>
-        <w:t>Dette technique identifiée :</w:t>
-      </w:r>
-    </w:p>
-    <w:p>
-      <w:pPr>
-        <w:rPr>
-          <w:i/>
-          <w:iCs/>
-          <w:color w:val="666666"/>
-          <w:lang w:val="fr-FR"/>
-        </w:rPr>
-      </w:pPr>
-      <w:r>
-        <w:rPr>
-          <w:i/>
-          <w:iCs/>
-          <w:color w:val="666666"/>
-          <w:lang w:val="fr-FR"/>
-        </w:rPr>
-        <w:t xml:space="preserve">- Absence de pagination avancée sur le </w:t>
-      </w:r>
-      <w:proofErr w:type="spellStart"/>
-      <w:r>
-        <w:rPr>
-          <w:i/>
-          <w:iCs/>
-          <w:color w:val="666666"/>
-          <w:lang w:val="fr-FR"/>
-        </w:rPr>
-        <w:t>feed</w:t>
-      </w:r>
-      <w:proofErr w:type="spellEnd"/>
-      <w:r>
-        <w:rPr>
-          <w:i/>
-          <w:iCs/>
-          <w:color w:val="666666"/>
-          <w:lang w:val="fr-FR"/>
-        </w:rPr>
-        <w:t>.</w:t>
+        <w:t>- Absence de pagination avancée sur le feed.</w:t>
       </w:r>
     </w:p>
     <w:p>
@@ -9993,27 +8715,7 @@
           <w:lang w:val="fr-FR"/>
         </w:rPr>
         <w:br/>
-        <w:t xml:space="preserve">R : Le </w:t>
-      </w:r>
-      <w:proofErr w:type="spellStart"/>
-      <w:r>
-        <w:rPr>
-          <w:i/>
-          <w:iCs/>
-          <w:color w:val="666666"/>
-          <w:lang w:val="fr-FR"/>
-        </w:rPr>
-        <w:t>token</w:t>
-      </w:r>
-      <w:proofErr w:type="spellEnd"/>
-      <w:r>
-        <w:rPr>
-          <w:i/>
-          <w:iCs/>
-          <w:color w:val="666666"/>
-          <w:lang w:val="fr-FR"/>
-        </w:rPr>
-        <w:t xml:space="preserve"> JWT a probablement expiré. Il suffit de vous reconnecter.</w:t>
+        <w:t>R : Le token JWT a probablement expiré. Il suffit de vous reconnecter.</w:t>
       </w:r>
     </w:p>
     <w:p>
@@ -10167,56 +8869,7 @@
           <w:color w:val="666666"/>
           <w:lang w:val="fr-FR"/>
         </w:rPr>
-        <w:t>Mot</w:t>
-      </w:r>
-      <w:r>
-        <w:rPr>
-          <w:i/>
-          <w:iCs/>
-          <w:color w:val="666666"/>
-          <w:lang w:val="fr-FR"/>
-        </w:rPr>
-        <w:t xml:space="preserve"> de passe stocké sous forme </w:t>
-      </w:r>
-      <w:proofErr w:type="spellStart"/>
-      <w:r>
-        <w:rPr>
-          <w:i/>
-          <w:iCs/>
-          <w:color w:val="666666"/>
-          <w:lang w:val="fr-FR"/>
-        </w:rPr>
-        <w:t>hashée</w:t>
-      </w:r>
-      <w:proofErr w:type="spellEnd"/>
-      <w:r>
-        <w:rPr>
-          <w:i/>
-          <w:iCs/>
-          <w:color w:val="666666"/>
-          <w:lang w:val="fr-FR"/>
-        </w:rPr>
-        <w:t xml:space="preserve"> (</w:t>
-      </w:r>
-      <w:proofErr w:type="spellStart"/>
-      <w:r>
-        <w:rPr>
-          <w:i/>
-          <w:iCs/>
-          <w:color w:val="666666"/>
-          <w:lang w:val="fr-FR"/>
-        </w:rPr>
-        <w:t>BCrypt</w:t>
-      </w:r>
-      <w:proofErr w:type="spellEnd"/>
-      <w:r>
-        <w:rPr>
-          <w:i/>
-          <w:iCs/>
-          <w:color w:val="666666"/>
-          <w:lang w:val="fr-FR"/>
-        </w:rPr>
-        <w:t>)</w:t>
+        <w:t>Mot de passe stocké sous forme hashée (BCrypt)</w:t>
       </w:r>
     </w:p>
     <w:p>
@@ -10239,16 +8892,7 @@
           <w:color w:val="666666"/>
           <w:lang w:val="fr-FR"/>
         </w:rPr>
-        <w:t>Authentification</w:t>
-      </w:r>
-      <w:r>
-        <w:rPr>
-          <w:i/>
-          <w:iCs/>
-          <w:color w:val="666666"/>
-          <w:lang w:val="fr-FR"/>
-        </w:rPr>
-        <w:t xml:space="preserve"> sécurisée via JWT</w:t>
+        <w:t>Authentification sécurisée via JWT</w:t>
       </w:r>
     </w:p>
     <w:p>
@@ -10271,16 +8915,7 @@
           <w:color w:val="666666"/>
           <w:lang w:val="fr-FR"/>
         </w:rPr>
-        <w:t>Aucune</w:t>
-      </w:r>
-      <w:r>
-        <w:rPr>
-          <w:i/>
-          <w:iCs/>
-          <w:color w:val="666666"/>
-          <w:lang w:val="fr-FR"/>
-        </w:rPr>
-        <w:t xml:space="preserve"> donnée sensible exposée dans l’API</w:t>
+        <w:t>Aucune donnée sensible exposée dans l’API</w:t>
       </w:r>
     </w:p>
     <w:p>
@@ -10303,16 +8938,7 @@
           <w:color w:val="666666"/>
           <w:lang w:val="fr-FR"/>
         </w:rPr>
-        <w:t>Séparation</w:t>
-      </w:r>
-      <w:r>
-        <w:rPr>
-          <w:i/>
-          <w:iCs/>
-          <w:color w:val="666666"/>
-          <w:lang w:val="fr-FR"/>
-        </w:rPr>
-        <w:t xml:space="preserve"> entités / DTO pour éviter l’exposition d’informations internes</w:t>
+        <w:t>Séparation entités / DTO pour éviter l’exposition d’informations internes</w:t>
       </w:r>
     </w:p>
     <w:p>
@@ -10411,16 +9037,7 @@
           <w:color w:val="666666"/>
           <w:lang w:val="fr-FR"/>
         </w:rPr>
-        <w:t>Formulaires</w:t>
-      </w:r>
-      <w:r>
-        <w:rPr>
-          <w:i/>
-          <w:iCs/>
-          <w:color w:val="666666"/>
-          <w:lang w:val="fr-FR"/>
-        </w:rPr>
-        <w:t xml:space="preserve"> avec labels explicites</w:t>
+        <w:t>Formulaires avec labels explicites</w:t>
       </w:r>
     </w:p>
     <w:p>
@@ -10443,16 +9060,7 @@
           <w:color w:val="666666"/>
           <w:lang w:val="fr-FR"/>
         </w:rPr>
-        <w:t>Messages</w:t>
-      </w:r>
-      <w:r>
-        <w:rPr>
-          <w:i/>
-          <w:iCs/>
-          <w:color w:val="666666"/>
-          <w:lang w:val="fr-FR"/>
-        </w:rPr>
-        <w:t xml:space="preserve"> d’erreur clairs</w:t>
+        <w:t>Messages d’erreur clairs</w:t>
       </w:r>
     </w:p>
     <w:p>
@@ -10475,16 +9083,7 @@
           <w:color w:val="666666"/>
           <w:lang w:val="fr-FR"/>
         </w:rPr>
-        <w:t>Contraste</w:t>
-      </w:r>
-      <w:r>
-        <w:rPr>
-          <w:i/>
-          <w:iCs/>
-          <w:color w:val="666666"/>
-          <w:lang w:val="fr-FR"/>
-        </w:rPr>
-        <w:t xml:space="preserve"> visuel suffisant</w:t>
+        <w:t>Contraste visuel suffisant</w:t>
       </w:r>
     </w:p>
     <w:p>
@@ -10507,16 +9106,7 @@
           <w:color w:val="666666"/>
           <w:lang w:val="fr-FR"/>
         </w:rPr>
-        <w:t>Navigation</w:t>
-      </w:r>
-      <w:r>
-        <w:rPr>
-          <w:i/>
-          <w:iCs/>
-          <w:color w:val="666666"/>
-          <w:lang w:val="fr-FR"/>
-        </w:rPr>
-        <w:t xml:space="preserve"> simple et cohérente</w:t>
+        <w:t>Navigation simple et cohérente</w:t>
       </w:r>
     </w:p>
     <w:p>
@@ -10788,7 +9378,6 @@
                 <w:color w:val="666666"/>
               </w:rPr>
             </w:pPr>
-            <w:proofErr w:type="spellStart"/>
             <w:r>
               <w:rPr>
                 <w:i/>
@@ -10797,7 +9386,6 @@
               </w:rPr>
               <w:t>ChatGPT</w:t>
             </w:r>
-            <w:proofErr w:type="spellEnd"/>
           </w:p>
         </w:tc>
         <w:tc>
@@ -10864,18 +9452,8 @@
                 <w:iCs/>
                 <w:color w:val="666666"/>
               </w:rPr>
-              <w:t xml:space="preserve">Relecture complète du code, adaptation aux contraintes ORION, tests manuels des </w:t>
+              <w:t>Relecture complète du code, adaptation aux contraintes ORION, tests manuels des endpoints</w:t>
             </w:r>
-            <w:proofErr w:type="spellStart"/>
-            <w:r>
-              <w:rPr>
-                <w:i/>
-                <w:iCs/>
-                <w:color w:val="666666"/>
-              </w:rPr>
-              <w:t>endpoints</w:t>
-            </w:r>
-            <w:proofErr w:type="spellEnd"/>
           </w:p>
         </w:tc>
       </w:tr>
@@ -10941,7 +9519,6 @@
                 <w:color w:val="666666"/>
               </w:rPr>
             </w:pPr>
-            <w:proofErr w:type="spellStart"/>
             <w:r>
               <w:rPr>
                 <w:i/>
@@ -10950,7 +9527,6 @@
               </w:rPr>
               <w:t>ChatGPT</w:t>
             </w:r>
-            <w:proofErr w:type="spellEnd"/>
           </w:p>
         </w:tc>
         <w:tc>
@@ -11084,7 +9660,6 @@
                 <w:color w:val="666666"/>
               </w:rPr>
             </w:pPr>
-            <w:proofErr w:type="spellStart"/>
             <w:r>
               <w:rPr>
                 <w:i/>
@@ -11093,7 +9668,6 @@
               </w:rPr>
               <w:t>ChatGPT</w:t>
             </w:r>
-            <w:proofErr w:type="spellEnd"/>
           </w:p>
         </w:tc>
         <w:tc>
@@ -11126,170 +9700,7 @@
                 <w:iCs/>
                 <w:color w:val="666666"/>
               </w:rPr>
-              <w:t xml:space="preserve">Comprendre et structurer la sécurisation </w:t>
-            </w:r>
-            <w:proofErr w:type="spellStart"/>
-            <w:r>
-              <w:rPr>
-                <w:i/>
-                <w:iCs/>
-                <w:color w:val="666666"/>
-              </w:rPr>
-              <w:t>stateless</w:t>
-            </w:r>
-            <w:proofErr w:type="spellEnd"/>
-          </w:p>
-        </w:tc>
-        <w:tc>
-          <w:tcPr>
-            <w:tcW w:w="2790" w:type="dxa"/>
-            <w:tcBorders>
-              <w:top w:val="nil"/>
-              <w:left w:val="nil"/>
-              <w:bottom w:val="nil"/>
-              <w:right w:val="nil"/>
-            </w:tcBorders>
-            <w:tcMar>
-              <w:top w:w="100" w:type="dxa"/>
-              <w:left w:w="100" w:type="dxa"/>
-              <w:bottom w:w="100" w:type="dxa"/>
-              <w:right w:w="100" w:type="dxa"/>
-            </w:tcMar>
-          </w:tcPr>
-          <w:p>
-            <w:pPr>
-              <w:rPr>
-                <w:i/>
-                <w:iCs/>
-                <w:color w:val="666666"/>
-              </w:rPr>
-            </w:pPr>
-            <w:r>
-              <w:rPr>
-                <w:i/>
-                <w:iCs/>
-                <w:color w:val="666666"/>
-              </w:rPr>
-              <w:t xml:space="preserve">Tests manuels des routes protégées (401 / 403), validation du fonctionnement du </w:t>
-            </w:r>
-            <w:proofErr w:type="spellStart"/>
-            <w:r>
-              <w:rPr>
-                <w:i/>
-                <w:iCs/>
-                <w:color w:val="666666"/>
-              </w:rPr>
-              <w:t>token</w:t>
-            </w:r>
-            <w:proofErr w:type="spellEnd"/>
-          </w:p>
-        </w:tc>
-      </w:tr>
-      <w:tr>
-        <w:trPr>
-          <w:trHeight w:val="785"/>
-        </w:trPr>
-        <w:tc>
-          <w:tcPr>
-            <w:tcW w:w="2169" w:type="dxa"/>
-            <w:tcBorders>
-              <w:top w:val="nil"/>
-              <w:left w:val="nil"/>
-              <w:bottom w:val="nil"/>
-              <w:right w:val="nil"/>
-            </w:tcBorders>
-            <w:tcMar>
-              <w:top w:w="100" w:type="dxa"/>
-              <w:left w:w="100" w:type="dxa"/>
-              <w:bottom w:w="100" w:type="dxa"/>
-              <w:right w:w="100" w:type="dxa"/>
-            </w:tcMar>
-          </w:tcPr>
-          <w:p>
-            <w:pPr>
-              <w:rPr>
-                <w:i/>
-                <w:iCs/>
-                <w:color w:val="666666"/>
-              </w:rPr>
-            </w:pPr>
-            <w:r>
-              <w:rPr>
-                <w:i/>
-                <w:iCs/>
-                <w:color w:val="666666"/>
-              </w:rPr>
-              <w:t>Optimisation et refactorisation de code</w:t>
-            </w:r>
-          </w:p>
-        </w:tc>
-        <w:tc>
-          <w:tcPr>
-            <w:tcW w:w="1842" w:type="dxa"/>
-            <w:tcBorders>
-              <w:top w:val="nil"/>
-              <w:left w:val="nil"/>
-              <w:bottom w:val="nil"/>
-              <w:right w:val="nil"/>
-            </w:tcBorders>
-            <w:tcMar>
-              <w:top w:w="100" w:type="dxa"/>
-              <w:left w:w="100" w:type="dxa"/>
-              <w:bottom w:w="100" w:type="dxa"/>
-              <w:right w:w="100" w:type="dxa"/>
-            </w:tcMar>
-          </w:tcPr>
-          <w:p>
-            <w:pPr>
-              <w:rPr>
-                <w:i/>
-                <w:iCs/>
-                <w:color w:val="666666"/>
-              </w:rPr>
-            </w:pPr>
-            <w:proofErr w:type="spellStart"/>
-            <w:r>
-              <w:rPr>
-                <w:i/>
-                <w:iCs/>
-                <w:color w:val="666666"/>
-              </w:rPr>
-              <w:t>ChatGPT</w:t>
-            </w:r>
-            <w:proofErr w:type="spellEnd"/>
-          </w:p>
-        </w:tc>
-        <w:tc>
-          <w:tcPr>
-            <w:tcW w:w="2224" w:type="dxa"/>
-            <w:tcBorders>
-              <w:top w:val="nil"/>
-              <w:left w:val="nil"/>
-              <w:bottom w:val="nil"/>
-              <w:right w:val="nil"/>
-            </w:tcBorders>
-            <w:tcMar>
-              <w:top w:w="100" w:type="dxa"/>
-              <w:left w:w="100" w:type="dxa"/>
-              <w:bottom w:w="100" w:type="dxa"/>
-              <w:right w:w="100" w:type="dxa"/>
-            </w:tcMar>
-          </w:tcPr>
-          <w:p>
-            <w:pPr>
-              <w:rPr>
-                <w:i/>
-                <w:iCs/>
-                <w:color w:val="666666"/>
-              </w:rPr>
-            </w:pPr>
-            <w:r>
-              <w:rPr>
-                <w:i/>
-                <w:iCs/>
-                <w:color w:val="666666"/>
-              </w:rPr>
-              <w:t>Améliorer la lisibilité et respecter les principes SOLID</w:t>
+              <w:t>Comprendre et structurer la sécurisation stateless</w:t>
             </w:r>
           </w:p>
         </w:tc>
@@ -11323,25 +9734,7 @@
                 <w:iCs/>
                 <w:color w:val="666666"/>
               </w:rPr>
-              <w:t xml:space="preserve">Analyse des logs dans la console </w:t>
-            </w:r>
-            <w:proofErr w:type="spellStart"/>
-            <w:r>
-              <w:rPr>
-                <w:i/>
-                <w:iCs/>
-                <w:color w:val="666666"/>
-              </w:rPr>
-              <w:t>IntelliJ</w:t>
-            </w:r>
-            <w:proofErr w:type="spellEnd"/>
-            <w:r>
-              <w:rPr>
-                <w:i/>
-                <w:iCs/>
-                <w:color w:val="666666"/>
-              </w:rPr>
-              <w:t>, tests Postman, validation après correction</w:t>
+              <w:t>Tests manuels des routes protégées (401 / 403), validation du fonctionnement du token</w:t>
             </w:r>
           </w:p>
         </w:tc>
@@ -11380,6 +9773,147 @@
                 <w:iCs/>
                 <w:color w:val="666666"/>
               </w:rPr>
+              <w:t>Optimisation et refactorisation de code</w:t>
+            </w:r>
+          </w:p>
+        </w:tc>
+        <w:tc>
+          <w:tcPr>
+            <w:tcW w:w="1842" w:type="dxa"/>
+            <w:tcBorders>
+              <w:top w:val="nil"/>
+              <w:left w:val="nil"/>
+              <w:bottom w:val="nil"/>
+              <w:right w:val="nil"/>
+            </w:tcBorders>
+            <w:tcMar>
+              <w:top w:w="100" w:type="dxa"/>
+              <w:left w:w="100" w:type="dxa"/>
+              <w:bottom w:w="100" w:type="dxa"/>
+              <w:right w:w="100" w:type="dxa"/>
+            </w:tcMar>
+          </w:tcPr>
+          <w:p>
+            <w:pPr>
+              <w:rPr>
+                <w:i/>
+                <w:iCs/>
+                <w:color w:val="666666"/>
+              </w:rPr>
+            </w:pPr>
+            <w:r>
+              <w:rPr>
+                <w:i/>
+                <w:iCs/>
+                <w:color w:val="666666"/>
+              </w:rPr>
+              <w:t>ChatGPT</w:t>
+            </w:r>
+          </w:p>
+        </w:tc>
+        <w:tc>
+          <w:tcPr>
+            <w:tcW w:w="2224" w:type="dxa"/>
+            <w:tcBorders>
+              <w:top w:val="nil"/>
+              <w:left w:val="nil"/>
+              <w:bottom w:val="nil"/>
+              <w:right w:val="nil"/>
+            </w:tcBorders>
+            <w:tcMar>
+              <w:top w:w="100" w:type="dxa"/>
+              <w:left w:w="100" w:type="dxa"/>
+              <w:bottom w:w="100" w:type="dxa"/>
+              <w:right w:w="100" w:type="dxa"/>
+            </w:tcMar>
+          </w:tcPr>
+          <w:p>
+            <w:pPr>
+              <w:rPr>
+                <w:i/>
+                <w:iCs/>
+                <w:color w:val="666666"/>
+              </w:rPr>
+            </w:pPr>
+            <w:r>
+              <w:rPr>
+                <w:i/>
+                <w:iCs/>
+                <w:color w:val="666666"/>
+              </w:rPr>
+              <w:t>Améliorer la lisibilité et respecter les principes SOLID</w:t>
+            </w:r>
+          </w:p>
+        </w:tc>
+        <w:tc>
+          <w:tcPr>
+            <w:tcW w:w="2790" w:type="dxa"/>
+            <w:tcBorders>
+              <w:top w:val="nil"/>
+              <w:left w:val="nil"/>
+              <w:bottom w:val="nil"/>
+              <w:right w:val="nil"/>
+            </w:tcBorders>
+            <w:tcMar>
+              <w:top w:w="100" w:type="dxa"/>
+              <w:left w:w="100" w:type="dxa"/>
+              <w:bottom w:w="100" w:type="dxa"/>
+              <w:right w:w="100" w:type="dxa"/>
+            </w:tcMar>
+          </w:tcPr>
+          <w:p>
+            <w:pPr>
+              <w:rPr>
+                <w:i/>
+                <w:iCs/>
+                <w:color w:val="666666"/>
+              </w:rPr>
+            </w:pPr>
+            <w:r>
+              <w:rPr>
+                <w:i/>
+                <w:iCs/>
+                <w:color w:val="666666"/>
+              </w:rPr>
+              <w:t>Analyse des logs dans la console IntelliJ, tests Postman, validation après correction</w:t>
+            </w:r>
+          </w:p>
+        </w:tc>
+      </w:tr>
+      <w:tr>
+        <w:trPr>
+          <w:trHeight w:val="785"/>
+        </w:trPr>
+        <w:tc>
+          <w:tcPr>
+            <w:tcW w:w="2169" w:type="dxa"/>
+            <w:tcBorders>
+              <w:top w:val="nil"/>
+              <w:left w:val="nil"/>
+              <w:bottom w:val="nil"/>
+              <w:right w:val="nil"/>
+            </w:tcBorders>
+            <w:tcMar>
+              <w:top w:w="100" w:type="dxa"/>
+              <w:left w:w="100" w:type="dxa"/>
+              <w:bottom w:w="100" w:type="dxa"/>
+              <w:right w:w="100" w:type="dxa"/>
+            </w:tcMar>
+          </w:tcPr>
+          <w:p>
+            <w:pPr>
+              <w:rPr>
+                <w:i/>
+                <w:iCs/>
+                <w:color w:val="666666"/>
+              </w:rPr>
+            </w:pPr>
+            <w:r>
+              <w:rPr>
+                <w:i/>
+                <w:iCs/>
+                <w:color w:val="666666"/>
+              </w:rPr>
               <w:lastRenderedPageBreak/>
               <w:t>Aide à la rédaction de la documentation technique</w:t>
             </w:r>
@@ -11409,7 +9943,6 @@
                 <w:color w:val="666666"/>
               </w:rPr>
             </w:pPr>
-            <w:proofErr w:type="spellStart"/>
             <w:r>
               <w:rPr>
                 <w:i/>
@@ -11418,7 +9951,6 @@
               </w:rPr>
               <w:t>ChatGPT</w:t>
             </w:r>
-            <w:proofErr w:type="spellEnd"/>
           </w:p>
         </w:tc>
         <w:tc>
@@ -11552,7 +10084,6 @@
                 <w:color w:val="666666"/>
               </w:rPr>
             </w:pPr>
-            <w:proofErr w:type="spellStart"/>
             <w:r>
               <w:rPr>
                 <w:i/>
@@ -11561,7 +10092,6 @@
               </w:rPr>
               <w:t>ChatGPT</w:t>
             </w:r>
-            <w:proofErr w:type="spellEnd"/>
           </w:p>
         </w:tc>
         <w:tc>
@@ -12142,17 +10672,8 @@
           <w:b/>
           <w:bCs/>
         </w:rPr>
-        <w:t xml:space="preserve">Analyse des besoins </w:t>
-      </w:r>
-      <w:proofErr w:type="spellStart"/>
-      <w:r>
-        <w:rPr>
-          <w:b/>
-          <w:bCs/>
-        </w:rPr>
-        <w:t>front-end</w:t>
-      </w:r>
-      <w:proofErr w:type="spellEnd"/>
+        <w:t>Analyse des besoins front-end</w:t>
+      </w:r>
       <w:r>
         <w:t xml:space="preserve"> (liens avec les spécifications ou maquettes).</w:t>
       </w:r>
@@ -12185,25 +10706,7 @@
           <w:iCs/>
           <w:color w:val="666666"/>
         </w:rPr>
-        <w:t xml:space="preserve">L’analyse des besoins </w:t>
-      </w:r>
-      <w:proofErr w:type="spellStart"/>
-      <w:r>
-        <w:rPr>
-          <w:i/>
-          <w:iCs/>
-          <w:color w:val="666666"/>
-        </w:rPr>
-        <w:t>front-end</w:t>
-      </w:r>
-      <w:proofErr w:type="spellEnd"/>
-      <w:r>
-        <w:rPr>
-          <w:i/>
-          <w:iCs/>
-          <w:color w:val="666666"/>
-        </w:rPr>
-        <w:t xml:space="preserve"> a été réalisée à partir des spécifications fonctionnelles ORION et des maquettes UX fournies.</w:t>
+        <w:t>L’analyse des besoins front-end a été réalisée à partir des spécifications fonctionnelles ORION et des maquettes UX fournies.</w:t>
       </w:r>
       <w:r>
         <w:rPr>
@@ -12212,25 +10715,7 @@
           <w:color w:val="666666"/>
         </w:rPr>
         <w:br/>
-        <w:t xml:space="preserve">L’objectif était de traduire les fonctionnalités du MVP en écrans, composants </w:t>
-      </w:r>
-      <w:proofErr w:type="spellStart"/>
-      <w:r>
-        <w:rPr>
-          <w:i/>
-          <w:iCs/>
-          <w:color w:val="666666"/>
-        </w:rPr>
-        <w:t>Angular</w:t>
-      </w:r>
-      <w:proofErr w:type="spellEnd"/>
-      <w:r>
-        <w:rPr>
-          <w:i/>
-          <w:iCs/>
-          <w:color w:val="666666"/>
-        </w:rPr>
-        <w:t xml:space="preserve"> et interactions API cohérentes.</w:t>
+        <w:t>L’objectif était de traduire les fonctionnalités du MVP en écrans, composants Angular et interactions API cohérentes.</w:t>
       </w:r>
     </w:p>
     <w:p>
@@ -12435,18 +10920,8 @@
           <w:iCs/>
           <w:color w:val="666666"/>
         </w:rPr>
-        <w:t xml:space="preserve">Structuration </w:t>
-      </w:r>
-      <w:proofErr w:type="spellStart"/>
-      <w:r>
-        <w:rPr>
-          <w:i/>
-          <w:iCs/>
-          <w:color w:val="666666"/>
-        </w:rPr>
-        <w:t>Angular</w:t>
-      </w:r>
-      <w:proofErr w:type="spellEnd"/>
+        <w:t>Structuration Angular</w:t>
+      </w:r>
     </w:p>
     <w:p>
       <w:pPr>
@@ -12463,25 +10938,7 @@
           <w:iCs/>
           <w:color w:val="666666"/>
         </w:rPr>
-        <w:t xml:space="preserve">Les fonctionnalités ont été organisées en modules </w:t>
-      </w:r>
-      <w:proofErr w:type="spellStart"/>
-      <w:r>
-        <w:rPr>
-          <w:i/>
-          <w:iCs/>
-          <w:color w:val="666666"/>
-        </w:rPr>
-        <w:t>Angular</w:t>
-      </w:r>
-      <w:proofErr w:type="spellEnd"/>
-      <w:r>
-        <w:rPr>
-          <w:i/>
-          <w:iCs/>
-          <w:color w:val="666666"/>
-        </w:rPr>
-        <w:t xml:space="preserve"> distincts :</w:t>
+        <w:t>Les fonctionnalités ont été organisées en modules Angular distincts :</w:t>
       </w:r>
     </w:p>
     <w:p>
@@ -12497,7 +10954,6 @@
           <w:color w:val="666666"/>
         </w:rPr>
       </w:pPr>
-      <w:proofErr w:type="spellStart"/>
       <w:r>
         <w:rPr>
           <w:i/>
@@ -12506,7 +10962,6 @@
         </w:rPr>
         <w:t>AuthModule</w:t>
       </w:r>
-      <w:proofErr w:type="spellEnd"/>
     </w:p>
     <w:p>
       <w:pPr>
@@ -12521,7 +10976,6 @@
           <w:color w:val="666666"/>
         </w:rPr>
       </w:pPr>
-      <w:proofErr w:type="spellStart"/>
       <w:r>
         <w:rPr>
           <w:i/>
@@ -12530,7 +10984,6 @@
         </w:rPr>
         <w:t>PostModule</w:t>
       </w:r>
-      <w:proofErr w:type="spellEnd"/>
     </w:p>
     <w:p>
       <w:pPr>
@@ -12545,7 +10998,6 @@
           <w:color w:val="666666"/>
         </w:rPr>
       </w:pPr>
-      <w:proofErr w:type="spellStart"/>
       <w:r>
         <w:rPr>
           <w:i/>
@@ -12554,7 +11006,6 @@
         </w:rPr>
         <w:t>TopicModule</w:t>
       </w:r>
-      <w:proofErr w:type="spellEnd"/>
     </w:p>
     <w:p>
       <w:pPr>
@@ -12569,7 +11020,6 @@
           <w:color w:val="666666"/>
         </w:rPr>
       </w:pPr>
-      <w:proofErr w:type="spellStart"/>
       <w:r>
         <w:rPr>
           <w:i/>
@@ -12578,7 +11028,6 @@
         </w:rPr>
         <w:t>UserModule</w:t>
       </w:r>
-      <w:proofErr w:type="spellEnd"/>
     </w:p>
     <w:p>
       <w:pPr>
@@ -12613,43 +11062,7 @@
           <w:iCs/>
           <w:color w:val="666666"/>
         </w:rPr>
-        <w:t xml:space="preserve">Un </w:t>
-      </w:r>
-      <w:proofErr w:type="spellStart"/>
-      <w:r>
-        <w:rPr>
-          <w:i/>
-          <w:iCs/>
-          <w:color w:val="666666"/>
-        </w:rPr>
-        <w:t>interceptor</w:t>
-      </w:r>
-      <w:proofErr w:type="spellEnd"/>
-      <w:r>
-        <w:rPr>
-          <w:i/>
-          <w:iCs/>
-          <w:color w:val="666666"/>
-        </w:rPr>
-        <w:t xml:space="preserve"> HTTP ajoute automatiquement le </w:t>
-      </w:r>
-      <w:proofErr w:type="spellStart"/>
-      <w:r>
-        <w:rPr>
-          <w:i/>
-          <w:iCs/>
-          <w:color w:val="666666"/>
-        </w:rPr>
-        <w:t>token</w:t>
-      </w:r>
-      <w:proofErr w:type="spellEnd"/>
-      <w:r>
-        <w:rPr>
-          <w:i/>
-          <w:iCs/>
-          <w:color w:val="666666"/>
-        </w:rPr>
-        <w:t xml:space="preserve"> JWT aux requêtes sécurisées.</w:t>
+        <w:t>Un interceptor HTTP ajoute automatiquement le token JWT aux requêtes sécurisées.</w:t>
       </w:r>
     </w:p>
     <w:p>
@@ -12791,25 +11204,7 @@
           <w:iCs/>
           <w:color w:val="666666"/>
         </w:rPr>
-        <w:t xml:space="preserve">Les formulaires utilisent les </w:t>
-      </w:r>
-      <w:proofErr w:type="spellStart"/>
-      <w:r>
-        <w:rPr>
-          <w:i/>
-          <w:iCs/>
-          <w:color w:val="666666"/>
-        </w:rPr>
-        <w:t>Reactive</w:t>
-      </w:r>
-      <w:proofErr w:type="spellEnd"/>
-      <w:r>
-        <w:rPr>
-          <w:i/>
-          <w:iCs/>
-          <w:color w:val="666666"/>
-        </w:rPr>
-        <w:t xml:space="preserve"> Forms afin d’appliquer les règles de validation définies dans les spécifications (mot de passe sécurisé, champs obligatoires, commentaire non vide, etc.).</w:t>
+        <w:t>Les formulaires utilisent les Reactive Forms afin d’appliquer les règles de validation définies dans les spécifications (mot de passe sécurisé, champs obligatoires, commentaire non vide, etc.).</w:t>
       </w:r>
     </w:p>
     <w:p>
@@ -12845,43 +11240,7 @@
           <w:iCs/>
           <w:color w:val="666666"/>
         </w:rPr>
-        <w:t xml:space="preserve">Chaque action utilisateur correspond à un </w:t>
-      </w:r>
-      <w:proofErr w:type="spellStart"/>
-      <w:r>
-        <w:rPr>
-          <w:i/>
-          <w:iCs/>
-          <w:color w:val="666666"/>
-        </w:rPr>
-        <w:t>endpoint</w:t>
-      </w:r>
-      <w:proofErr w:type="spellEnd"/>
-      <w:r>
-        <w:rPr>
-          <w:i/>
-          <w:iCs/>
-          <w:color w:val="666666"/>
-        </w:rPr>
-        <w:t xml:space="preserve"> identifié (authentification, </w:t>
-      </w:r>
-      <w:proofErr w:type="spellStart"/>
-      <w:r>
-        <w:rPr>
-          <w:i/>
-          <w:iCs/>
-          <w:color w:val="666666"/>
-        </w:rPr>
-        <w:t>feed</w:t>
-      </w:r>
-      <w:proofErr w:type="spellEnd"/>
-      <w:r>
-        <w:rPr>
-          <w:i/>
-          <w:iCs/>
-          <w:color w:val="666666"/>
-        </w:rPr>
-        <w:t>, création de post, abonnement, modification profil).</w:t>
+        <w:t>Chaque action utilisateur correspond à un endpoint identifié (authentification, feed, création de post, abonnement, modification profil).</w:t>
       </w:r>
       <w:r>
         <w:rPr>
@@ -12960,25 +11319,7 @@
           <w:iCs/>
           <w:color w:val="666666"/>
         </w:rPr>
-        <w:t xml:space="preserve">L’analyse des besoins </w:t>
-      </w:r>
-      <w:proofErr w:type="spellStart"/>
-      <w:r>
-        <w:rPr>
-          <w:i/>
-          <w:iCs/>
-          <w:color w:val="666666"/>
-        </w:rPr>
-        <w:t>front-end</w:t>
-      </w:r>
-      <w:proofErr w:type="spellEnd"/>
-      <w:r>
-        <w:rPr>
-          <w:i/>
-          <w:iCs/>
-          <w:color w:val="666666"/>
-        </w:rPr>
-        <w:t xml:space="preserve"> a permis d’assurer :</w:t>
+        <w:t>L’analyse des besoins front-end a permis d’assurer :</w:t>
       </w:r>
     </w:p>
     <w:p>
@@ -13044,25 +11385,7 @@
           <w:iCs/>
           <w:color w:val="666666"/>
         </w:rPr>
-        <w:t xml:space="preserve">une architecture </w:t>
-      </w:r>
-      <w:proofErr w:type="spellStart"/>
-      <w:r>
-        <w:rPr>
-          <w:i/>
-          <w:iCs/>
-          <w:color w:val="666666"/>
-        </w:rPr>
-        <w:t>Angular</w:t>
-      </w:r>
-      <w:proofErr w:type="spellEnd"/>
-      <w:r>
-        <w:rPr>
-          <w:i/>
-          <w:iCs/>
-          <w:color w:val="666666"/>
-        </w:rPr>
-        <w:t xml:space="preserve"> modulaire et maintenable,</w:t>
+        <w:t>une architecture Angular modulaire et maintenable,</w:t>
       </w:r>
     </w:p>
     <w:p>
@@ -13102,25 +11425,7 @@
           <w:iCs/>
           <w:color w:val="666666"/>
         </w:rPr>
-        <w:t xml:space="preserve">Le </w:t>
-      </w:r>
-      <w:proofErr w:type="spellStart"/>
-      <w:r>
-        <w:rPr>
-          <w:i/>
-          <w:iCs/>
-          <w:color w:val="666666"/>
-        </w:rPr>
-        <w:t>front-end</w:t>
-      </w:r>
-      <w:proofErr w:type="spellEnd"/>
-      <w:r>
-        <w:rPr>
-          <w:i/>
-          <w:iCs/>
-          <w:color w:val="666666"/>
-        </w:rPr>
-        <w:t xml:space="preserve"> répond ainsi pleinement aux exigences du MVP.</w:t>
+        <w:t>Le front-end répond ainsi pleinement aux exigences du MVP.</w:t>
       </w:r>
     </w:p>
     <w:p>
@@ -13160,25 +11465,7 @@
           <w:iCs/>
           <w:color w:val="666666"/>
         </w:rPr>
-        <w:t xml:space="preserve">L’application MDD repose sur un modèle de données relationnel structuré autour de cinq entités principales : User, Topic, </w:t>
-      </w:r>
-      <w:proofErr w:type="spellStart"/>
-      <w:r>
-        <w:rPr>
-          <w:i/>
-          <w:iCs/>
-          <w:color w:val="666666"/>
-        </w:rPr>
-        <w:t>Subscription</w:t>
-      </w:r>
-      <w:proofErr w:type="spellEnd"/>
-      <w:r>
-        <w:rPr>
-          <w:i/>
-          <w:iCs/>
-          <w:color w:val="666666"/>
-        </w:rPr>
-        <w:t>, Post et Comment.</w:t>
+        <w:t>L’application MDD repose sur un modèle de données relationnel structuré autour de cinq entités principales : User, Topic, Subscription, Post et Comment.</w:t>
       </w:r>
       <w:r>
         <w:rPr>
@@ -13298,23 +11585,13 @@
           <w:color w:val="666666"/>
         </w:rPr>
       </w:pPr>
-      <w:proofErr w:type="spellStart"/>
-      <w:r>
-        <w:rPr>
-          <w:i/>
-          <w:iCs/>
-          <w:color w:val="666666"/>
-        </w:rPr>
-        <w:t>username</w:t>
-      </w:r>
-      <w:proofErr w:type="spellEnd"/>
-      <w:r>
-        <w:rPr>
-          <w:i/>
-          <w:iCs/>
-          <w:color w:val="666666"/>
-        </w:rPr>
-        <w:t xml:space="preserve"> : String</w:t>
+      <w:r>
+        <w:rPr>
+          <w:i/>
+          <w:iCs/>
+          <w:color w:val="666666"/>
+        </w:rPr>
+        <w:t>username : String</w:t>
       </w:r>
     </w:p>
     <w:p>
@@ -13329,23 +11606,13 @@
           <w:color w:val="666666"/>
         </w:rPr>
       </w:pPr>
-      <w:proofErr w:type="spellStart"/>
-      <w:r>
-        <w:rPr>
-          <w:i/>
-          <w:iCs/>
-          <w:color w:val="666666"/>
-        </w:rPr>
-        <w:t>passwordHash</w:t>
-      </w:r>
-      <w:proofErr w:type="spellEnd"/>
-      <w:r>
-        <w:rPr>
-          <w:i/>
-          <w:iCs/>
-          <w:color w:val="666666"/>
-        </w:rPr>
-        <w:t xml:space="preserve"> : String</w:t>
+      <w:r>
+        <w:rPr>
+          <w:i/>
+          <w:iCs/>
+          <w:color w:val="666666"/>
+        </w:rPr>
+        <w:t>passwordHash : String</w:t>
       </w:r>
     </w:p>
     <w:p>
@@ -13360,23 +11627,13 @@
           <w:color w:val="666666"/>
         </w:rPr>
       </w:pPr>
-      <w:proofErr w:type="spellStart"/>
-      <w:r>
-        <w:rPr>
-          <w:i/>
-          <w:iCs/>
-          <w:color w:val="666666"/>
-        </w:rPr>
-        <w:t>createdAt</w:t>
-      </w:r>
-      <w:proofErr w:type="spellEnd"/>
-      <w:r>
-        <w:rPr>
-          <w:i/>
-          <w:iCs/>
-          <w:color w:val="666666"/>
-        </w:rPr>
-        <w:t xml:space="preserve"> : Date</w:t>
+      <w:r>
+        <w:rPr>
+          <w:i/>
+          <w:iCs/>
+          <w:color w:val="666666"/>
+        </w:rPr>
+        <w:t>createdAt : Date</w:t>
       </w:r>
     </w:p>
     <w:p>
@@ -13402,43 +11659,7 @@
           <w:color w:val="666666"/>
         </w:rPr>
         <w:br/>
-        <w:t xml:space="preserve">Le mot de passe est stocké sous forme </w:t>
-      </w:r>
-      <w:proofErr w:type="spellStart"/>
-      <w:r>
-        <w:rPr>
-          <w:i/>
-          <w:iCs/>
-          <w:color w:val="666666"/>
-        </w:rPr>
-        <w:t>hashée</w:t>
-      </w:r>
-      <w:proofErr w:type="spellEnd"/>
-      <w:r>
-        <w:rPr>
-          <w:i/>
-          <w:iCs/>
-          <w:color w:val="666666"/>
-        </w:rPr>
-        <w:t xml:space="preserve"> (</w:t>
-      </w:r>
-      <w:proofErr w:type="spellStart"/>
-      <w:r>
-        <w:rPr>
-          <w:i/>
-          <w:iCs/>
-          <w:color w:val="666666"/>
-        </w:rPr>
-        <w:t>BCrypt</w:t>
-      </w:r>
-      <w:proofErr w:type="spellEnd"/>
-      <w:r>
-        <w:rPr>
-          <w:i/>
-          <w:iCs/>
-          <w:color w:val="666666"/>
-        </w:rPr>
-        <w:t>) afin de garantir la sécurité.</w:t>
+        <w:t>Le mot de passe est stocké sous forme hashée (BCrypt) afin de garantir la sécurité.</w:t>
       </w:r>
     </w:p>
     <w:p>
@@ -13510,23 +11731,13 @@
           <w:color w:val="666666"/>
         </w:rPr>
       </w:pPr>
-      <w:proofErr w:type="spellStart"/>
-      <w:r>
-        <w:rPr>
-          <w:i/>
-          <w:iCs/>
-          <w:color w:val="666666"/>
-        </w:rPr>
-        <w:t>name</w:t>
-      </w:r>
-      <w:proofErr w:type="spellEnd"/>
-      <w:r>
-        <w:rPr>
-          <w:i/>
-          <w:iCs/>
-          <w:color w:val="666666"/>
-        </w:rPr>
-        <w:t xml:space="preserve"> : String</w:t>
+      <w:r>
+        <w:rPr>
+          <w:i/>
+          <w:iCs/>
+          <w:color w:val="666666"/>
+        </w:rPr>
+        <w:t>name : String</w:t>
       </w:r>
     </w:p>
     <w:p>
@@ -13594,7 +11805,6 @@
           <w:color w:val="666666"/>
         </w:rPr>
       </w:pPr>
-      <w:proofErr w:type="spellStart"/>
       <w:r>
         <w:rPr>
           <w:i/>
@@ -13603,7 +11813,6 @@
         </w:rPr>
         <w:t>Subscription</w:t>
       </w:r>
-      <w:proofErr w:type="spellEnd"/>
     </w:p>
     <w:p>
       <w:pPr>
@@ -13638,23 +11847,13 @@
           <w:color w:val="666666"/>
         </w:rPr>
       </w:pPr>
-      <w:proofErr w:type="spellStart"/>
-      <w:r>
-        <w:rPr>
-          <w:i/>
-          <w:iCs/>
-          <w:color w:val="666666"/>
-        </w:rPr>
-        <w:t>userId</w:t>
-      </w:r>
-      <w:proofErr w:type="spellEnd"/>
-      <w:r>
-        <w:rPr>
-          <w:i/>
-          <w:iCs/>
-          <w:color w:val="666666"/>
-        </w:rPr>
-        <w:t xml:space="preserve"> : Long</w:t>
+      <w:r>
+        <w:rPr>
+          <w:i/>
+          <w:iCs/>
+          <w:color w:val="666666"/>
+        </w:rPr>
+        <w:t>userId : Long</w:t>
       </w:r>
     </w:p>
     <w:p>
@@ -13669,23 +11868,13 @@
           <w:color w:val="666666"/>
         </w:rPr>
       </w:pPr>
-      <w:proofErr w:type="spellStart"/>
-      <w:r>
-        <w:rPr>
-          <w:i/>
-          <w:iCs/>
-          <w:color w:val="666666"/>
-        </w:rPr>
-        <w:t>topicId</w:t>
-      </w:r>
-      <w:proofErr w:type="spellEnd"/>
-      <w:r>
-        <w:rPr>
-          <w:i/>
-          <w:iCs/>
-          <w:color w:val="666666"/>
-        </w:rPr>
-        <w:t xml:space="preserve"> : Long</w:t>
+      <w:r>
+        <w:rPr>
+          <w:i/>
+          <w:iCs/>
+          <w:color w:val="666666"/>
+        </w:rPr>
+        <w:t>topicId : Long</w:t>
       </w:r>
     </w:p>
     <w:p>
@@ -13792,23 +11981,13 @@
           <w:color w:val="666666"/>
         </w:rPr>
       </w:pPr>
-      <w:proofErr w:type="spellStart"/>
-      <w:r>
-        <w:rPr>
-          <w:i/>
-          <w:iCs/>
-          <w:color w:val="666666"/>
-        </w:rPr>
-        <w:t>title</w:t>
-      </w:r>
-      <w:proofErr w:type="spellEnd"/>
-      <w:r>
-        <w:rPr>
-          <w:i/>
-          <w:iCs/>
-          <w:color w:val="666666"/>
-        </w:rPr>
-        <w:t xml:space="preserve"> : String</w:t>
+      <w:r>
+        <w:rPr>
+          <w:i/>
+          <w:iCs/>
+          <w:color w:val="666666"/>
+        </w:rPr>
+        <w:t>title : String</w:t>
       </w:r>
     </w:p>
     <w:p>
@@ -13844,23 +12023,13 @@
           <w:color w:val="666666"/>
         </w:rPr>
       </w:pPr>
-      <w:proofErr w:type="spellStart"/>
-      <w:r>
-        <w:rPr>
-          <w:i/>
-          <w:iCs/>
-          <w:color w:val="666666"/>
-        </w:rPr>
-        <w:t>createdAt</w:t>
-      </w:r>
-      <w:proofErr w:type="spellEnd"/>
-      <w:r>
-        <w:rPr>
-          <w:i/>
-          <w:iCs/>
-          <w:color w:val="666666"/>
-        </w:rPr>
-        <w:t xml:space="preserve"> : Date</w:t>
+      <w:r>
+        <w:rPr>
+          <w:i/>
+          <w:iCs/>
+          <w:color w:val="666666"/>
+        </w:rPr>
+        <w:t>createdAt : Date</w:t>
       </w:r>
     </w:p>
     <w:p>
@@ -13924,25 +12093,7 @@
           <w:iCs/>
           <w:color w:val="666666"/>
         </w:rPr>
-        <w:t xml:space="preserve">Un utilisateur peut écrire plusieurs </w:t>
-      </w:r>
-      <w:proofErr w:type="spellStart"/>
-      <w:r>
-        <w:rPr>
-          <w:i/>
-          <w:iCs/>
-          <w:color w:val="666666"/>
-        </w:rPr>
-        <w:t>posts</w:t>
-      </w:r>
-      <w:proofErr w:type="spellEnd"/>
-      <w:r>
-        <w:rPr>
-          <w:i/>
-          <w:iCs/>
-          <w:color w:val="666666"/>
-        </w:rPr>
-        <w:t>.</w:t>
+        <w:t>Un utilisateur peut écrire plusieurs posts.</w:t>
       </w:r>
     </w:p>
     <w:p>
@@ -14077,23 +12228,13 @@
           <w:color w:val="666666"/>
         </w:rPr>
       </w:pPr>
-      <w:proofErr w:type="spellStart"/>
-      <w:r>
-        <w:rPr>
-          <w:i/>
-          <w:iCs/>
-          <w:color w:val="666666"/>
-        </w:rPr>
-        <w:t>createdAt</w:t>
-      </w:r>
-      <w:proofErr w:type="spellEnd"/>
-      <w:r>
-        <w:rPr>
-          <w:i/>
-          <w:iCs/>
-          <w:color w:val="666666"/>
-        </w:rPr>
-        <w:t xml:space="preserve"> : Date</w:t>
+      <w:r>
+        <w:rPr>
+          <w:i/>
+          <w:iCs/>
+          <w:color w:val="666666"/>
+        </w:rPr>
+        <w:t>createdAt : Date</w:t>
       </w:r>
     </w:p>
     <w:p>
@@ -14227,18 +12368,8 @@
           <w:iCs/>
           <w:color w:val="666666"/>
         </w:rPr>
-        <w:t xml:space="preserve">User (N) — (N) Topic via </w:t>
-      </w:r>
-      <w:proofErr w:type="spellStart"/>
-      <w:r>
-        <w:rPr>
-          <w:i/>
-          <w:iCs/>
-          <w:color w:val="666666"/>
-        </w:rPr>
-        <w:t>Subscription</w:t>
-      </w:r>
-      <w:proofErr w:type="spellEnd"/>
+        <w:t>User (N) — (N) Topic via Subscription</w:t>
+      </w:r>
     </w:p>
     <w:p>
       <w:pPr>
@@ -14436,25 +12567,7 @@
           <w:iCs/>
           <w:color w:val="666666"/>
         </w:rPr>
-        <w:t xml:space="preserve">Les entités exposées au front sont contrôlées via des DTO afin d’éviter l’exposition directe des entités internes (notamment le </w:t>
-      </w:r>
-      <w:proofErr w:type="spellStart"/>
-      <w:r>
-        <w:rPr>
-          <w:i/>
-          <w:iCs/>
-          <w:color w:val="666666"/>
-        </w:rPr>
-        <w:t>passwordHash</w:t>
-      </w:r>
-      <w:proofErr w:type="spellEnd"/>
-      <w:r>
-        <w:rPr>
-          <w:i/>
-          <w:iCs/>
-          <w:color w:val="666666"/>
-        </w:rPr>
-        <w:t>).</w:t>
+        <w:t>Les entités exposées au front sont contrôlées via des DTO afin d’éviter l’exposition directe des entités internes (notamment le passwordHash).</w:t>
       </w:r>
     </w:p>
     <w:p>
@@ -14774,25 +12887,7 @@
           <w:iCs/>
           <w:color w:val="666666"/>
         </w:rPr>
-        <w:t>Authentification via JWT (</w:t>
-      </w:r>
-      <w:proofErr w:type="spellStart"/>
-      <w:r>
-        <w:rPr>
-          <w:i/>
-          <w:iCs/>
-          <w:color w:val="666666"/>
-        </w:rPr>
-        <w:t>stateless</w:t>
-      </w:r>
-      <w:proofErr w:type="spellEnd"/>
-      <w:r>
-        <w:rPr>
-          <w:i/>
-          <w:iCs/>
-          <w:color w:val="666666"/>
-        </w:rPr>
-        <w:t>).</w:t>
+        <w:t>Authentification via JWT (stateless).</w:t>
       </w:r>
     </w:p>
     <w:p>
@@ -14807,23 +12902,13 @@
           <w:color w:val="666666"/>
         </w:rPr>
       </w:pPr>
-      <w:proofErr w:type="spellStart"/>
-      <w:r>
-        <w:rPr>
-          <w:i/>
-          <w:iCs/>
-          <w:color w:val="666666"/>
-        </w:rPr>
-        <w:t>Token</w:t>
-      </w:r>
-      <w:proofErr w:type="spellEnd"/>
-      <w:r>
-        <w:rPr>
-          <w:i/>
-          <w:iCs/>
-          <w:color w:val="666666"/>
-        </w:rPr>
-        <w:t xml:space="preserve"> transmis dans l’en-tête HTTP :</w:t>
+      <w:r>
+        <w:rPr>
+          <w:i/>
+          <w:iCs/>
+          <w:color w:val="666666"/>
+        </w:rPr>
+        <w:t>Token transmis dans l’en-tête HTTP :</w:t>
       </w:r>
     </w:p>
     <w:p>
@@ -14838,41 +12923,13 @@
           <w:color w:val="666666"/>
         </w:rPr>
       </w:pPr>
-      <w:proofErr w:type="spellStart"/>
-      <w:r>
-        <w:rPr>
-          <w:i/>
-          <w:iCs/>
-          <w:color w:val="666666"/>
-        </w:rPr>
-        <w:t>Authorization</w:t>
-      </w:r>
-      <w:proofErr w:type="spellEnd"/>
-      <w:r>
-        <w:rPr>
-          <w:i/>
-          <w:iCs/>
-          <w:color w:val="666666"/>
-        </w:rPr>
-        <w:t>: Bearer &lt;</w:t>
-      </w:r>
-      <w:proofErr w:type="spellStart"/>
-      <w:r>
-        <w:rPr>
-          <w:i/>
-          <w:iCs/>
-          <w:color w:val="666666"/>
-        </w:rPr>
-        <w:t>token</w:t>
-      </w:r>
-      <w:proofErr w:type="spellEnd"/>
-      <w:r>
-        <w:rPr>
-          <w:i/>
-          <w:iCs/>
-          <w:color w:val="666666"/>
-        </w:rPr>
-        <w:t>&gt;</w:t>
+      <w:r>
+        <w:rPr>
+          <w:i/>
+          <w:iCs/>
+          <w:color w:val="666666"/>
+        </w:rPr>
+        <w:t>Authorization: Bearer &lt;token&gt;</w:t>
       </w:r>
     </w:p>
     <w:p>
@@ -14914,25 +12971,7 @@
           <w:iCs/>
           <w:color w:val="666666"/>
         </w:rPr>
-        <w:t xml:space="preserve">Mot de passe </w:t>
-      </w:r>
-      <w:proofErr w:type="spellStart"/>
-      <w:r>
-        <w:rPr>
-          <w:i/>
-          <w:iCs/>
-          <w:color w:val="666666"/>
-        </w:rPr>
-        <w:t>hashé</w:t>
-      </w:r>
-      <w:proofErr w:type="spellEnd"/>
-      <w:r>
-        <w:rPr>
-          <w:i/>
-          <w:iCs/>
-          <w:color w:val="666666"/>
-        </w:rPr>
-        <w:t>.</w:t>
+        <w:t>Mot de passe hashé.</w:t>
       </w:r>
     </w:p>
     <w:p>
@@ -15149,43 +13188,7 @@
           <w:iCs/>
           <w:color w:val="666666"/>
         </w:rPr>
-        <w:t xml:space="preserve"> Couverture </w:t>
-      </w:r>
-      <w:proofErr w:type="spellStart"/>
-      <w:r>
-        <w:rPr>
-          <w:i/>
-          <w:iCs/>
-          <w:color w:val="666666"/>
-        </w:rPr>
-        <w:t>Front-end</w:t>
-      </w:r>
-      <w:proofErr w:type="spellEnd"/>
-      <w:r>
-        <w:rPr>
-          <w:i/>
-          <w:iCs/>
-          <w:color w:val="666666"/>
-        </w:rPr>
-        <w:t xml:space="preserve"> (</w:t>
-      </w:r>
-      <w:proofErr w:type="spellStart"/>
-      <w:r>
-        <w:rPr>
-          <w:i/>
-          <w:iCs/>
-          <w:color w:val="666666"/>
-        </w:rPr>
-        <w:t>Angular</w:t>
-      </w:r>
-      <w:proofErr w:type="spellEnd"/>
-      <w:r>
-        <w:rPr>
-          <w:i/>
-          <w:iCs/>
-          <w:color w:val="666666"/>
-        </w:rPr>
-        <w:t>)</w:t>
+        <w:t xml:space="preserve"> Couverture Front-end (Angular)</w:t>
       </w:r>
     </w:p>
     <w:p>
@@ -15217,23 +13220,13 @@
           <w:color w:val="666666"/>
         </w:rPr>
       </w:pPr>
-      <w:proofErr w:type="spellStart"/>
-      <w:r>
-        <w:rPr>
-          <w:i/>
-          <w:iCs/>
-          <w:color w:val="666666"/>
-        </w:rPr>
-        <w:t>Statements</w:t>
-      </w:r>
-      <w:proofErr w:type="spellEnd"/>
-      <w:r>
-        <w:rPr>
-          <w:i/>
-          <w:iCs/>
-          <w:color w:val="666666"/>
-        </w:rPr>
-        <w:t xml:space="preserve"> : 76,95 %</w:t>
+      <w:r>
+        <w:rPr>
+          <w:i/>
+          <w:iCs/>
+          <w:color w:val="666666"/>
+        </w:rPr>
+        <w:t>Statements : 76,95 %</w:t>
       </w:r>
     </w:p>
     <w:p>
@@ -15269,23 +13262,13 @@
           <w:color w:val="666666"/>
         </w:rPr>
       </w:pPr>
-      <w:proofErr w:type="spellStart"/>
-      <w:r>
-        <w:rPr>
-          <w:i/>
-          <w:iCs/>
-          <w:color w:val="666666"/>
-        </w:rPr>
-        <w:t>Functions</w:t>
-      </w:r>
-      <w:proofErr w:type="spellEnd"/>
-      <w:r>
-        <w:rPr>
-          <w:i/>
-          <w:iCs/>
-          <w:color w:val="666666"/>
-        </w:rPr>
-        <w:t xml:space="preserve"> : 68,61 %</w:t>
+      <w:r>
+        <w:rPr>
+          <w:i/>
+          <w:iCs/>
+          <w:color w:val="666666"/>
+        </w:rPr>
+        <w:t>Functions : 68,61 %</w:t>
       </w:r>
     </w:p>
     <w:p>
@@ -15365,25 +13348,7 @@
           <w:iCs/>
           <w:color w:val="666666"/>
         </w:rPr>
-        <w:t xml:space="preserve">Les services et </w:t>
-      </w:r>
-      <w:proofErr w:type="spellStart"/>
-      <w:r>
-        <w:rPr>
-          <w:i/>
-          <w:iCs/>
-          <w:color w:val="666666"/>
-        </w:rPr>
-        <w:t>interceptors</w:t>
-      </w:r>
-      <w:proofErr w:type="spellEnd"/>
-      <w:r>
-        <w:rPr>
-          <w:i/>
-          <w:iCs/>
-          <w:color w:val="666666"/>
-        </w:rPr>
-        <w:t xml:space="preserve"> sont couverts à 100 %, ce qui sécurise la logique métier et les échanges API.</w:t>
+        <w:t>Les services et interceptors sont couverts à 100 %, ce qui sécurise la logique métier et les échanges API.</w:t>
       </w:r>
     </w:p>
     <w:p>
@@ -15404,25 +13369,7 @@
           <w:iCs/>
           <w:color w:val="666666"/>
         </w:rPr>
-        <w:t>Les pages principales (</w:t>
-      </w:r>
-      <w:proofErr w:type="spellStart"/>
-      <w:r>
-        <w:rPr>
-          <w:i/>
-          <w:iCs/>
-          <w:color w:val="666666"/>
-        </w:rPr>
-        <w:t>feed</w:t>
-      </w:r>
-      <w:proofErr w:type="spellEnd"/>
-      <w:r>
-        <w:rPr>
-          <w:i/>
-          <w:iCs/>
-          <w:color w:val="666666"/>
-        </w:rPr>
-        <w:t>, home, login) présentent une bonne couverture.</w:t>
+        <w:t>Les pages principales (feed, home, login) présentent une bonne couverture.</w:t>
       </w:r>
     </w:p>
     <w:p>
@@ -15481,43 +13428,7 @@
           <w:iCs/>
           <w:color w:val="666666"/>
         </w:rPr>
-        <w:t>Certaines pages UI (</w:t>
-      </w:r>
-      <w:proofErr w:type="spellStart"/>
-      <w:r>
-        <w:rPr>
-          <w:i/>
-          <w:iCs/>
-          <w:color w:val="666666"/>
-        </w:rPr>
-        <w:t>register</w:t>
-      </w:r>
-      <w:proofErr w:type="spellEnd"/>
-      <w:r>
-        <w:rPr>
-          <w:i/>
-          <w:iCs/>
-          <w:color w:val="666666"/>
-        </w:rPr>
-        <w:t xml:space="preserve">, topics, </w:t>
-      </w:r>
-      <w:proofErr w:type="spellStart"/>
-      <w:r>
-        <w:rPr>
-          <w:i/>
-          <w:iCs/>
-          <w:color w:val="666666"/>
-        </w:rPr>
-        <w:t>create</w:t>
-      </w:r>
-      <w:proofErr w:type="spellEnd"/>
-      <w:r>
-        <w:rPr>
-          <w:i/>
-          <w:iCs/>
-          <w:color w:val="666666"/>
-        </w:rPr>
-        <w:t>-post) ont une couverture plus faible.</w:t>
+        <w:t>Certaines pages UI (register, topics, create-post) ont une couverture plus faible.</w:t>
       </w:r>
     </w:p>
     <w:p>
@@ -15559,25 +13470,7 @@
           <w:iCs/>
           <w:color w:val="666666"/>
         </w:rPr>
-        <w:t xml:space="preserve">Les </w:t>
-      </w:r>
-      <w:proofErr w:type="spellStart"/>
-      <w:r>
-        <w:rPr>
-          <w:i/>
-          <w:iCs/>
-          <w:color w:val="666666"/>
-        </w:rPr>
-        <w:t>guards</w:t>
-      </w:r>
-      <w:proofErr w:type="spellEnd"/>
-      <w:r>
-        <w:rPr>
-          <w:i/>
-          <w:iCs/>
-          <w:color w:val="666666"/>
-        </w:rPr>
-        <w:t xml:space="preserve"> mériteraient un renforcement des tests, notamment sur les scénarios d’accès non autorisé.</w:t>
+        <w:t>Les guards mériteraient un renforcement des tests, notamment sur les scénarios d’accès non autorisé.</w:t>
       </w:r>
     </w:p>
     <w:p>
@@ -15611,25 +13504,7 @@
           <w:iCs/>
           <w:color w:val="666666"/>
         </w:rPr>
-        <w:t xml:space="preserve">La couverture </w:t>
-      </w:r>
-      <w:proofErr w:type="spellStart"/>
-      <w:r>
-        <w:rPr>
-          <w:i/>
-          <w:iCs/>
-          <w:color w:val="666666"/>
-        </w:rPr>
-        <w:t>front-end</w:t>
-      </w:r>
-      <w:proofErr w:type="spellEnd"/>
-      <w:r>
-        <w:rPr>
-          <w:i/>
-          <w:iCs/>
-          <w:color w:val="666666"/>
-        </w:rPr>
-        <w:t xml:space="preserve"> est satisfaisante pour un projet MVP.</w:t>
+        <w:t>La couverture front-end est satisfaisante pour un projet MVP.</w:t>
       </w:r>
       <w:r>
         <w:rPr>
@@ -15684,43 +13559,7 @@
           <w:iCs/>
           <w:color w:val="666666"/>
         </w:rPr>
-        <w:t xml:space="preserve">Couverture </w:t>
-      </w:r>
-      <w:proofErr w:type="spellStart"/>
-      <w:r>
-        <w:rPr>
-          <w:i/>
-          <w:iCs/>
-          <w:color w:val="666666"/>
-        </w:rPr>
-        <w:t>Back-end</w:t>
-      </w:r>
-      <w:proofErr w:type="spellEnd"/>
-      <w:r>
-        <w:rPr>
-          <w:i/>
-          <w:iCs/>
-          <w:color w:val="666666"/>
-        </w:rPr>
-        <w:t xml:space="preserve"> (Spring Boot / </w:t>
-      </w:r>
-      <w:proofErr w:type="spellStart"/>
-      <w:r>
-        <w:rPr>
-          <w:i/>
-          <w:iCs/>
-          <w:color w:val="666666"/>
-        </w:rPr>
-        <w:t>JaCoCo</w:t>
-      </w:r>
-      <w:proofErr w:type="spellEnd"/>
-      <w:r>
-        <w:rPr>
-          <w:i/>
-          <w:iCs/>
-          <w:color w:val="666666"/>
-        </w:rPr>
-        <w:t>)</w:t>
+        <w:t>Couverture Back-end (Spring Boot / JaCoCo)</w:t>
       </w:r>
     </w:p>
     <w:p>
@@ -16024,25 +13863,7 @@
           <w:iCs/>
           <w:color w:val="666666"/>
         </w:rPr>
-        <w:t xml:space="preserve">Le </w:t>
-      </w:r>
-      <w:proofErr w:type="spellStart"/>
-      <w:r>
-        <w:rPr>
-          <w:i/>
-          <w:iCs/>
-          <w:color w:val="666666"/>
-        </w:rPr>
-        <w:t>back-end</w:t>
-      </w:r>
-      <w:proofErr w:type="spellEnd"/>
-      <w:r>
-        <w:rPr>
-          <w:i/>
-          <w:iCs/>
-          <w:color w:val="666666"/>
-        </w:rPr>
-        <w:t xml:space="preserve"> présente une couverture solide et rassurante, notamment sur la logique métier et la sécurité.</w:t>
+        <w:t>Le back-end présente une couverture solide et rassurante, notamment sur la logique métier et la sécurité.</w:t>
       </w:r>
       <w:r>
         <w:rPr>
@@ -16117,25 +13938,7 @@
           <w:iCs/>
           <w:color w:val="666666"/>
         </w:rPr>
-        <w:t xml:space="preserve">Le </w:t>
-      </w:r>
-      <w:proofErr w:type="spellStart"/>
-      <w:r>
-        <w:rPr>
-          <w:i/>
-          <w:iCs/>
-          <w:color w:val="666666"/>
-        </w:rPr>
-        <w:t>back-end</w:t>
-      </w:r>
-      <w:proofErr w:type="spellEnd"/>
-      <w:r>
-        <w:rPr>
-          <w:i/>
-          <w:iCs/>
-          <w:color w:val="666666"/>
-        </w:rPr>
-        <w:t xml:space="preserve"> est très bien couvert.</w:t>
+        <w:t>Le back-end est très bien couvert.</w:t>
       </w:r>
     </w:p>
     <w:p>
@@ -16156,25 +13959,7 @@
           <w:iCs/>
           <w:color w:val="666666"/>
         </w:rPr>
-        <w:t xml:space="preserve">Le </w:t>
-      </w:r>
-      <w:proofErr w:type="spellStart"/>
-      <w:r>
-        <w:rPr>
-          <w:i/>
-          <w:iCs/>
-          <w:color w:val="666666"/>
-        </w:rPr>
-        <w:t>front-end</w:t>
-      </w:r>
-      <w:proofErr w:type="spellEnd"/>
-      <w:r>
-        <w:rPr>
-          <w:i/>
-          <w:iCs/>
-          <w:color w:val="666666"/>
-        </w:rPr>
-        <w:t xml:space="preserve"> atteint un niveau cohérent pour un MVP.</w:t>
+        <w:t>Le front-end atteint un niveau cohérent pour un MVP.</w:t>
       </w:r>
     </w:p>
     <w:p>
@@ -16314,43 +14099,7 @@
           <w:iCs/>
           <w:color w:val="666666"/>
         </w:rPr>
-        <w:t xml:space="preserve">Le projet MDD repose sur une architecture </w:t>
-      </w:r>
-      <w:proofErr w:type="spellStart"/>
-      <w:r>
-        <w:rPr>
-          <w:i/>
-          <w:iCs/>
-          <w:color w:val="666666"/>
-        </w:rPr>
-        <w:t>front-end</w:t>
-      </w:r>
-      <w:proofErr w:type="spellEnd"/>
-      <w:r>
-        <w:rPr>
-          <w:i/>
-          <w:iCs/>
-          <w:color w:val="666666"/>
-        </w:rPr>
-        <w:t xml:space="preserve"> / </w:t>
-      </w:r>
-      <w:proofErr w:type="spellStart"/>
-      <w:r>
-        <w:rPr>
-          <w:i/>
-          <w:iCs/>
-          <w:color w:val="666666"/>
-        </w:rPr>
-        <w:t>back-end</w:t>
-      </w:r>
-      <w:proofErr w:type="spellEnd"/>
-      <w:r>
-        <w:rPr>
-          <w:i/>
-          <w:iCs/>
-          <w:color w:val="666666"/>
-        </w:rPr>
-        <w:t xml:space="preserve"> découplée respectant les contraintes ORION.</w:t>
+        <w:t>Le projet MDD repose sur une architecture front-end / back-end découplée respectant les contraintes ORION.</w:t>
       </w:r>
       <w:r>
         <w:rPr>
@@ -16359,25 +14108,7 @@
           <w:color w:val="666666"/>
         </w:rPr>
         <w:br/>
-        <w:t xml:space="preserve">Le </w:t>
-      </w:r>
-      <w:proofErr w:type="spellStart"/>
-      <w:r>
-        <w:rPr>
-          <w:i/>
-          <w:iCs/>
-          <w:color w:val="666666"/>
-        </w:rPr>
-        <w:t>back-end</w:t>
-      </w:r>
-      <w:proofErr w:type="spellEnd"/>
-      <w:r>
-        <w:rPr>
-          <w:i/>
-          <w:iCs/>
-          <w:color w:val="666666"/>
-        </w:rPr>
-        <w:t xml:space="preserve"> est structuré en couches (Controller, Service, Repository) conformément aux principes SOLID.</w:t>
+        <w:t>Le back-end est structuré en couches (Controller, Service, Repository) conformément aux principes SOLID.</w:t>
       </w:r>
       <w:r>
         <w:rPr>
@@ -16386,43 +14117,7 @@
           <w:color w:val="666666"/>
         </w:rPr>
         <w:br/>
-        <w:t xml:space="preserve">Le </w:t>
-      </w:r>
-      <w:proofErr w:type="spellStart"/>
-      <w:r>
-        <w:rPr>
-          <w:i/>
-          <w:iCs/>
-          <w:color w:val="666666"/>
-        </w:rPr>
-        <w:t>front-end</w:t>
-      </w:r>
-      <w:proofErr w:type="spellEnd"/>
-      <w:r>
-        <w:rPr>
-          <w:i/>
-          <w:iCs/>
-          <w:color w:val="666666"/>
-        </w:rPr>
-        <w:t xml:space="preserve"> </w:t>
-      </w:r>
-      <w:proofErr w:type="spellStart"/>
-      <w:r>
-        <w:rPr>
-          <w:i/>
-          <w:iCs/>
-          <w:color w:val="666666"/>
-        </w:rPr>
-        <w:t>Angular</w:t>
-      </w:r>
-      <w:proofErr w:type="spellEnd"/>
-      <w:r>
-        <w:rPr>
-          <w:i/>
-          <w:iCs/>
-          <w:color w:val="666666"/>
-        </w:rPr>
-        <w:t xml:space="preserve"> est organisé en modules fonctionnels avec séparation des responsabilités.</w:t>
+        <w:t>Le front-end Angular est organisé en modules fonctionnels avec séparation des responsabilités.</w:t>
       </w:r>
     </w:p>
     <w:p>
@@ -16655,25 +14350,7 @@
           <w:iCs/>
           <w:color w:val="666666"/>
         </w:rPr>
-        <w:t xml:space="preserve">Mise en place possible d’une pagination avancée du </w:t>
-      </w:r>
-      <w:proofErr w:type="spellStart"/>
-      <w:r>
-        <w:rPr>
-          <w:i/>
-          <w:iCs/>
-          <w:color w:val="666666"/>
-        </w:rPr>
-        <w:t>feed</w:t>
-      </w:r>
-      <w:proofErr w:type="spellEnd"/>
-      <w:r>
-        <w:rPr>
-          <w:i/>
-          <w:iCs/>
-          <w:color w:val="666666"/>
-        </w:rPr>
-        <w:t>.</w:t>
+        <w:t>Mise en place possible d’une pagination avancée du feed.</w:t>
       </w:r>
     </w:p>
     <w:p>
@@ -16789,25 +14466,6 @@
           <w:iCs/>
           <w:color w:val="666666"/>
         </w:rPr>
-        <w:t>Gestion des erreurs HTTP pouvant être encore standardisée.</w:t>
-      </w:r>
-    </w:p>
-    <w:p>
-      <w:pPr>
-        <w:spacing w:after="240"/>
-        <w:ind w:left="720"/>
-        <w:rPr>
-          <w:i/>
-          <w:iCs/>
-          <w:color w:val="666666"/>
-        </w:rPr>
-      </w:pPr>
-      <w:r>
-        <w:rPr>
-          <w:i/>
-          <w:iCs/>
-          <w:color w:val="666666"/>
-        </w:rPr>
         <w:t>Absence de mise en cache pour optimiser certaines requêtes.</w:t>
       </w:r>
     </w:p>
@@ -16924,25 +14582,7 @@
           <w:iCs/>
           <w:color w:val="666666"/>
         </w:rPr>
-        <w:t xml:space="preserve">Pagination et filtrage avancé du </w:t>
-      </w:r>
-      <w:proofErr w:type="spellStart"/>
-      <w:r>
-        <w:rPr>
-          <w:i/>
-          <w:iCs/>
-          <w:color w:val="666666"/>
-        </w:rPr>
-        <w:t>feed</w:t>
-      </w:r>
-      <w:proofErr w:type="spellEnd"/>
-      <w:r>
-        <w:rPr>
-          <w:i/>
-          <w:iCs/>
-          <w:color w:val="666666"/>
-        </w:rPr>
-        <w:t>.</w:t>
+        <w:t>Pagination et filtrage avancé du feed.</w:t>
       </w:r>
     </w:p>
     <w:p>
@@ -17004,7 +14644,6 @@
           <w:iCs/>
           <w:color w:val="666666"/>
         </w:rPr>
-        <w:lastRenderedPageBreak/>
         <w:t>Le projet répond aux exigences du MVP définies par ORION.</w:t>
       </w:r>
       <w:r>
@@ -23158,6 +20797,7 @@
   <w:style w:type="character" w:default="1" w:styleId="Policepardfaut">
     <w:name w:val="Default Paragraph Font"/>
     <w:uiPriority w:val="1"/>
+    <w:semiHidden/>
     <w:unhideWhenUsed/>
   </w:style>
   <w:style w:type="table" w:default="1" w:styleId="TableauNormal">

</xml_diff>